<commit_message>
Added Initial Risk Register and Initial Engineering Decision Log
Added Initial Risk Register and Initial Engineering Decision Log to the Milestone 1 Project.
</commit_message>
<xml_diff>
--- a/SEN381_Project_Milestone1.docx
+++ b/SEN381_Project_Milestone1.docx
@@ -1,6 +1,6 @@
 
 <file path=word/document.xml><?xml version="1.0" encoding="utf-8"?>
-<w:document xmlns:wpc="http://schemas.microsoft.com/office/word/2010/wordprocessingCanvas" xmlns:cx="http://schemas.microsoft.com/office/drawing/2014/chartex" xmlns:cx1="http://schemas.microsoft.com/office/drawing/2015/9/8/chartex" xmlns:cx2="http://schemas.microsoft.com/office/drawing/2015/10/21/chartex" xmlns:cx3="http://schemas.microsoft.com/office/drawing/2016/5/9/chartex" xmlns:cx4="http://schemas.microsoft.com/office/drawing/2016/5/10/chartex" xmlns:cx5="http://schemas.microsoft.com/office/drawing/2016/5/11/chartex" xmlns:cx6="http://schemas.microsoft.com/office/drawing/2016/5/12/chartex" xmlns:cx7="http://schemas.microsoft.com/office/drawing/2016/5/13/chartex" xmlns:cx8="http://schemas.microsoft.com/office/drawing/2016/5/14/chartex" xmlns:mc="http://schemas.openxmlformats.org/markup-compatibility/2006" xmlns:aink="http://schemas.microsoft.com/office/drawing/2016/ink" xmlns:am3d="http://schemas.microsoft.com/office/drawing/2017/model3d" xmlns:o="urn:schemas-microsoft-com:office:office" xmlns:oel="http://schemas.microsoft.com/office/2019/extlst" xmlns:r="http://schemas.openxmlformats.org/officeDocument/2006/relationships" xmlns:m="http://schemas.openxmlformats.org/officeDocument/2006/math" xmlns:v="urn:schemas-microsoft-com:vml" xmlns:wp14="http://schemas.microsoft.com/office/word/2010/wordprocessingDrawing" xmlns:wp="http://schemas.openxmlformats.org/drawingml/2006/wordprocessingDrawing" xmlns:w10="urn:schemas-microsoft-com:office:word" xmlns:w="http://schemas.openxmlformats.org/wordprocessingml/2006/main" xmlns:w14="http://schemas.microsoft.com/office/word/2010/wordml" xmlns:w15="http://schemas.microsoft.com/office/word/2012/wordml" xmlns:w16cex="http://schemas.microsoft.com/office/word/2018/wordml/cex" xmlns:w16cid="http://schemas.microsoft.com/office/word/2016/wordml/cid" xmlns:w16="http://schemas.microsoft.com/office/word/2018/wordml" xmlns:w16sdtdh="http://schemas.microsoft.com/office/word/2020/wordml/sdtdatahash" xmlns:w16se="http://schemas.microsoft.com/office/word/2015/wordml/symex" xmlns:wpg="http://schemas.microsoft.com/office/word/2010/wordprocessingGroup" xmlns:wpi="http://schemas.microsoft.com/office/word/2010/wordprocessingInk" xmlns:wne="http://schemas.microsoft.com/office/word/2006/wordml" xmlns:wps="http://schemas.microsoft.com/office/word/2010/wordprocessingShape" mc:Ignorable="w14 w15 w16se w16cid w16 w16cex w16sdtdh wp14">
+<w:document xmlns:wpc="http://schemas.microsoft.com/office/word/2010/wordprocessingCanvas" xmlns:cx="http://schemas.microsoft.com/office/drawing/2014/chartex" xmlns:cx1="http://schemas.microsoft.com/office/drawing/2015/9/8/chartex" xmlns:cx2="http://schemas.microsoft.com/office/drawing/2015/10/21/chartex" xmlns:cx3="http://schemas.microsoft.com/office/drawing/2016/5/9/chartex" xmlns:cx4="http://schemas.microsoft.com/office/drawing/2016/5/10/chartex" xmlns:cx5="http://schemas.microsoft.com/office/drawing/2016/5/11/chartex" xmlns:cx6="http://schemas.microsoft.com/office/drawing/2016/5/12/chartex" xmlns:cx7="http://schemas.microsoft.com/office/drawing/2016/5/13/chartex" xmlns:cx8="http://schemas.microsoft.com/office/drawing/2016/5/14/chartex" xmlns:mc="http://schemas.openxmlformats.org/markup-compatibility/2006" xmlns:aink="http://schemas.microsoft.com/office/drawing/2016/ink" xmlns:am3d="http://schemas.microsoft.com/office/drawing/2017/model3d" xmlns:o="urn:schemas-microsoft-com:office:office" xmlns:oel="http://schemas.microsoft.com/office/2019/extlst" xmlns:r="http://schemas.openxmlformats.org/officeDocument/2006/relationships" xmlns:m="http://schemas.openxmlformats.org/officeDocument/2006/math" xmlns:v="urn:schemas-microsoft-com:vml" xmlns:wp14="http://schemas.microsoft.com/office/word/2010/wordprocessingDrawing" xmlns:wp="http://schemas.openxmlformats.org/drawingml/2006/wordprocessingDrawing" xmlns:w10="urn:schemas-microsoft-com:office:word" xmlns:w="http://schemas.openxmlformats.org/wordprocessingml/2006/main" xmlns:w14="http://schemas.microsoft.com/office/word/2010/wordml" xmlns:w15="http://schemas.microsoft.com/office/word/2012/wordml" xmlns:w16cex="http://schemas.microsoft.com/office/word/2018/wordml/cex" xmlns:w16cid="http://schemas.microsoft.com/office/word/2016/wordml/cid" xmlns:w16="http://schemas.microsoft.com/office/word/2018/wordml" xmlns:w16du="http://schemas.microsoft.com/office/word/2023/wordml/word16du" xmlns:w16sdtdh="http://schemas.microsoft.com/office/word/2020/wordml/sdtdatahash" xmlns:w16sdtfl="http://schemas.microsoft.com/office/word/2024/wordml/sdtformatlock" xmlns:w16se="http://schemas.microsoft.com/office/word/2015/wordml/symex" xmlns:wpg="http://schemas.microsoft.com/office/word/2010/wordprocessingGroup" xmlns:wpi="http://schemas.microsoft.com/office/word/2010/wordprocessingInk" xmlns:wne="http://schemas.microsoft.com/office/word/2006/wordml" xmlns:wps="http://schemas.microsoft.com/office/word/2010/wordprocessingShape" mc:Ignorable="w14 w15 w16se w16cid w16 w16cex w16sdtdh w16sdtfl w16du wp14">
   <w:body>
     <w:p>
       <w:pPr>
@@ -21,6 +21,7 @@
         <w:spacing w:before="200" w:after="200"/>
         <w:jc w:val="center"/>
       </w:pPr>
+      <w:proofErr w:type="spellStart"/>
       <w:r>
         <w:rPr>
           <w:b/>
@@ -31,6 +32,7 @@
         </w:rPr>
         <w:t>CivicConnect</w:t>
       </w:r>
+      <w:proofErr w:type="spellEnd"/>
     </w:p>
     <w:p>
       <w:pPr>
@@ -44,16 +46,7 @@
           <w:sz w:val="30"/>
           <w:szCs w:val="30"/>
         </w:rPr>
-        <w:t>Project Engineering Document (PED) v</w:t>
-      </w:r>
-      <w:r>
-        <w:rPr>
-          <w:b/>
-          <w:bCs/>
-          <w:sz w:val="30"/>
-          <w:szCs w:val="30"/>
-        </w:rPr>
-        <w:t>0.1</w:t>
+        <w:t>Project Engineering Document (PED) v0.1</w:t>
       </w:r>
     </w:p>
     <w:tbl>
@@ -177,8 +170,13 @@
               <w:br/>
             </w:r>
             <w:r>
-              <w:t>Michiel Coenraad TerBlanche</w:t>
-            </w:r>
+              <w:t xml:space="preserve">Michiel Coenraad </w:t>
+            </w:r>
+            <w:proofErr w:type="spellStart"/>
+            <w:r>
+              <w:t>TerBlanche</w:t>
+            </w:r>
+            <w:proofErr w:type="spellEnd"/>
           </w:p>
         </w:tc>
       </w:tr>
@@ -281,7 +279,7 @@
                 <w:sz w:val="20"/>
                 <w:szCs w:val="20"/>
               </w:rPr>
-              <w:t>V0.1</w:t>
+              <w:t>V0.3</w:t>
             </w:r>
           </w:p>
         </w:tc>
@@ -326,7 +324,11 @@
             </w:tcMar>
             <w:vAlign w:val="center"/>
           </w:tcPr>
-          <w:p/>
+          <w:p>
+            <w:r>
+              <w:t>09/09/2026</w:t>
+            </w:r>
+          </w:p>
         </w:tc>
       </w:tr>
       <w:tr>
@@ -369,7 +371,16 @@
             </w:tcMar>
             <w:vAlign w:val="center"/>
           </w:tcPr>
-          <w:p/>
+          <w:p>
+            <w:r>
+              <w:t xml:space="preserve">Tendai </w:t>
+            </w:r>
+            <w:proofErr w:type="spellStart"/>
+            <w:r>
+              <w:t>Mkwaira</w:t>
+            </w:r>
+            <w:proofErr w:type="spellEnd"/>
+          </w:p>
         </w:tc>
       </w:tr>
     </w:tbl>
@@ -602,8 +613,13 @@
           </w:tcPr>
           <w:p>
             <w:r>
-              <w:t>Michiel Coenraad TerBlanche</w:t>
-            </w:r>
+              <w:t xml:space="preserve">Michiel Coenraad </w:t>
+            </w:r>
+            <w:proofErr w:type="spellStart"/>
+            <w:r>
+              <w:t>TerBlanche</w:t>
+            </w:r>
+            <w:proofErr w:type="spellEnd"/>
           </w:p>
         </w:tc>
         <w:tc>
@@ -631,13 +647,7 @@
               <w:t>Business Need</w:t>
             </w:r>
             <w:r>
-              <w:t xml:space="preserve">s, </w:t>
-            </w:r>
-            <w:r>
-              <w:t>Stakeholder Analysis</w:t>
-            </w:r>
-            <w:r>
-              <w:t>, Scope and Requirements</w:t>
+              <w:t>s, Stakeholder Analysis, Scope and Requirements</w:t>
             </w:r>
           </w:p>
         </w:tc>
@@ -670,7 +680,11 @@
             </w:tcMar>
             <w:vAlign w:val="center"/>
           </w:tcPr>
-          <w:p/>
+          <w:p>
+            <w:r>
+              <w:t>V 0.3</w:t>
+            </w:r>
+          </w:p>
         </w:tc>
         <w:tc>
           <w:tcPr>
@@ -683,7 +697,11 @@
             </w:tcMar>
             <w:vAlign w:val="center"/>
           </w:tcPr>
-          <w:p/>
+          <w:p>
+            <w:r>
+              <w:t>09/08</w:t>
+            </w:r>
+          </w:p>
         </w:tc>
         <w:tc>
           <w:tcPr>
@@ -696,7 +714,11 @@
             </w:tcMar>
             <w:vAlign w:val="center"/>
           </w:tcPr>
-          <w:p/>
+          <w:p>
+            <w:r>
+              <w:t>Nicholas Armin Vronka</w:t>
+            </w:r>
+          </w:p>
         </w:tc>
         <w:tc>
           <w:tcPr>
@@ -709,7 +731,11 @@
             </w:tcMar>
             <w:vAlign w:val="center"/>
           </w:tcPr>
-          <w:p/>
+          <w:p>
+            <w:r>
+              <w:t>Added the Initial Risk Register and Initial Engineering Decision Log.</w:t>
+            </w:r>
+          </w:p>
         </w:tc>
         <w:tc>
           <w:tcPr>
@@ -831,9 +857,11 @@
       </w:r>
     </w:p>
     <w:p>
+      <w:proofErr w:type="spellStart"/>
       <w:r>
         <w:t>CivicConnect</w:t>
       </w:r>
+      <w:proofErr w:type="spellEnd"/>
       <w:r>
         <w:t xml:space="preserve"> currently manages service requests</w:t>
       </w:r>
@@ -885,7 +913,15 @@
         </w:numPr>
       </w:pPr>
       <w:r>
-        <w:t>There is weak accountability for who changed a request's status and what action was actually taken.</w:t>
+        <w:t xml:space="preserve">There is weak accountability for who changed a request's status and what action was </w:t>
+      </w:r>
+      <w:proofErr w:type="gramStart"/>
+      <w:r>
+        <w:t>actually taken</w:t>
+      </w:r>
+      <w:proofErr w:type="gramEnd"/>
+      <w:r>
+        <w:t>.</w:t>
       </w:r>
     </w:p>
     <w:p>
@@ -941,14 +977,13 @@
       </w:r>
     </w:p>
     <w:p>
+      <w:proofErr w:type="spellStart"/>
       <w:r>
-        <w:t xml:space="preserve">CivicConnect needs a controlled digital platform where they can gain access to a reliable, traceable and usable way to </w:t>
+        <w:t>CivicConnect</w:t>
       </w:r>
+      <w:proofErr w:type="spellEnd"/>
       <w:r>
-        <w:t>submit, manage and report on service requests. This is to improve the visibility and accountability without creating an unsustainable technical, operational or financial burden</w:t>
-      </w:r>
-      <w:r>
-        <w:t xml:space="preserve">  </w:t>
+        <w:t xml:space="preserve"> needs a controlled digital platform where they can gain access to a reliable, traceable and usable way to submit, manage and report on service requests. This is to improve the visibility and accountability without creating an unsustainable technical, operational or financial burden  </w:t>
       </w:r>
     </w:p>
     <w:p>
@@ -1559,6 +1594,7 @@
           </w:tcPr>
           <w:p>
             <w:r>
+              <w:lastRenderedPageBreak/>
               <w:t>Organisation / project sponsor</w:t>
             </w:r>
           </w:p>
@@ -1789,7 +1825,15 @@
         </w:numPr>
       </w:pPr>
       <w:r>
-        <w:t>Requester: view the current status of a submitted request.</w:t>
+        <w:t xml:space="preserve">Requester: view the </w:t>
+      </w:r>
+      <w:proofErr w:type="gramStart"/>
+      <w:r>
+        <w:t>current status</w:t>
+      </w:r>
+      <w:proofErr w:type="gramEnd"/>
+      <w:r>
+        <w:t xml:space="preserve"> of a submitted request.</w:t>
       </w:r>
     </w:p>
     <w:p>
@@ -2424,7 +2468,15 @@
               <w:t>will be</w:t>
             </w:r>
             <w:r>
-              <w:t xml:space="preserve"> blocked and a validation message </w:t>
+              <w:t xml:space="preserve"> </w:t>
+            </w:r>
+            <w:proofErr w:type="gramStart"/>
+            <w:r>
+              <w:t>blocked</w:t>
+            </w:r>
+            <w:proofErr w:type="gramEnd"/>
+            <w:r>
+              <w:t xml:space="preserve"> and a validation message </w:t>
             </w:r>
             <w:r>
               <w:t>will be</w:t>
@@ -2487,7 +2539,15 @@
               <w:t>will</w:t>
             </w:r>
             <w:r>
-              <w:t xml:space="preserve"> allow a requester to view the current status of a submitted request.</w:t>
+              <w:t xml:space="preserve"> allow a requester to view the </w:t>
+            </w:r>
+            <w:proofErr w:type="gramStart"/>
+            <w:r>
+              <w:t>current status</w:t>
+            </w:r>
+            <w:proofErr w:type="gramEnd"/>
+            <w:r>
+              <w:t xml:space="preserve"> of a submitted request.</w:t>
             </w:r>
           </w:p>
         </w:tc>
@@ -2538,11 +2598,16 @@
           </w:tcPr>
           <w:p>
             <w:r>
-              <w:t>Given a requester view</w:t>
+              <w:t xml:space="preserve">Given a </w:t>
+            </w:r>
+            <w:proofErr w:type="gramStart"/>
+            <w:r>
+              <w:t>requester view</w:t>
             </w:r>
             <w:r>
               <w:t>s</w:t>
             </w:r>
+            <w:proofErr w:type="gramEnd"/>
             <w:r>
               <w:t xml:space="preserve"> one of their own requests, when the page loads, then the current lifecycle stage and the date it was last updated are displayed</w:t>
             </w:r>
@@ -2643,7 +2708,15 @@
           </w:tcPr>
           <w:p>
             <w:r>
-              <w:t>Given a requester with 2 or more prior requests, when they open their request history, then every request they submitted is listed with its reference, category and current status.</w:t>
+              <w:t xml:space="preserve">Given a requester with 2 or more prior requests, when they open their request history, then every request they submitted is listed with its reference, category and </w:t>
+            </w:r>
+            <w:proofErr w:type="gramStart"/>
+            <w:r>
+              <w:t>current status</w:t>
+            </w:r>
+            <w:proofErr w:type="gramEnd"/>
+            <w:r>
+              <w:t>.</w:t>
             </w:r>
           </w:p>
         </w:tc>
@@ -2968,6 +3041,7 @@
           </w:tcPr>
           <w:p>
             <w:r>
+              <w:lastRenderedPageBreak/>
               <w:t>FR-008</w:t>
             </w:r>
           </w:p>
@@ -3336,10 +3410,7 @@
           </w:tcPr>
           <w:p>
             <w:r>
-              <w:t>Given an assigned request, when staff adds a comment or resolution note it gets stored with the author timestamp</w:t>
-            </w:r>
-            <w:r>
-              <w:t xml:space="preserve"> will be visible in the request’s history</w:t>
+              <w:t>Given an assigned request, when staff adds a comment or resolution note it gets stored with the author timestamp will be visible in the request’s history</w:t>
             </w:r>
           </w:p>
         </w:tc>
@@ -3525,13 +3596,7 @@
           </w:tcPr>
           <w:p>
             <w:r>
-              <w:t xml:space="preserve">Given a manager account, when they open the activity view they can they will get aggregate counts of requests by status </w:t>
-            </w:r>
-            <w:r>
-              <w:t>displayed by a selectable date range (default 7 days)</w:t>
-            </w:r>
-            <w:r>
-              <w:t xml:space="preserve"> </w:t>
+              <w:t xml:space="preserve">Given a manager account, when they open the activity view they can they will get aggregate counts of requests by status displayed by a selectable date range (default 7 days) </w:t>
             </w:r>
           </w:p>
         </w:tc>
@@ -4231,19 +4296,7 @@
           </w:tcPr>
           <w:p>
             <w:r>
-              <w:t>Access restricted by authenticated role</w:t>
-            </w:r>
-            <w:r>
-              <w:t>.</w:t>
-            </w:r>
-            <w:r>
-              <w:t xml:space="preserve"> </w:t>
-            </w:r>
-            <w:r>
-              <w:t>N</w:t>
-            </w:r>
-            <w:r>
-              <w:t>o personal data exposed via public/unauthenticated endpoints</w:t>
+              <w:t>Access restricted by authenticated role. No personal data exposed via public/unauthenticated endpoints</w:t>
             </w:r>
           </w:p>
           <w:p/>
@@ -4360,10 +4413,7 @@
           </w:tcPr>
           <w:p>
             <w:r>
-              <w:t xml:space="preserve">An uptime-monitoring report over a </w:t>
-            </w:r>
-            <w:r>
-              <w:t>30</w:t>
+              <w:t>An uptime-monitoring report over a 30</w:t>
             </w:r>
             <w:r>
               <w:t>-day</w:t>
@@ -4498,10 +4548,7 @@
           </w:tcPr>
           <w:p>
             <w:r>
-              <w:t>M</w:t>
-            </w:r>
-            <w:r>
-              <w:t>edium</w:t>
+              <w:t>Medium</w:t>
             </w:r>
           </w:p>
         </w:tc>
@@ -6121,7 +6168,8 @@
     </w:p>
     <w:tbl>
       <w:tblPr>
-        <w:tblW w:w="10343" w:type="dxa"/>
+        <w:tblW w:w="10506" w:type="dxa"/>
+        <w:tblInd w:w="-431" w:type="dxa"/>
         <w:tblBorders>
           <w:top w:val="single" w:sz="4" w:space="0" w:color="auto"/>
           <w:left w:val="single" w:sz="4" w:space="0" w:color="auto"/>
@@ -6130,6 +6178,7 @@
           <w:insideH w:val="single" w:sz="4" w:space="0" w:color="auto"/>
           <w:insideV w:val="single" w:sz="4" w:space="0" w:color="auto"/>
         </w:tblBorders>
+        <w:tblLayout w:type="fixed"/>
         <w:tblCellMar>
           <w:left w:w="10" w:type="dxa"/>
           <w:right w:w="10" w:type="dxa"/>
@@ -6137,23 +6186,25 @@
         <w:tblLook w:val="0000" w:firstRow="0" w:lastRow="0" w:firstColumn="0" w:lastColumn="0" w:noHBand="0" w:noVBand="0"/>
       </w:tblPr>
       <w:tblGrid>
-        <w:gridCol w:w="845"/>
-        <w:gridCol w:w="2040"/>
-        <w:gridCol w:w="1461"/>
-        <w:gridCol w:w="692"/>
-        <w:gridCol w:w="776"/>
-        <w:gridCol w:w="819"/>
-        <w:gridCol w:w="1857"/>
-        <w:gridCol w:w="1133"/>
+        <w:gridCol w:w="786"/>
+        <w:gridCol w:w="1170"/>
+        <w:gridCol w:w="1164"/>
+        <w:gridCol w:w="1026"/>
+        <w:gridCol w:w="878"/>
+        <w:gridCol w:w="878"/>
+        <w:gridCol w:w="1454"/>
+        <w:gridCol w:w="1198"/>
+        <w:gridCol w:w="1232"/>
         <w:gridCol w:w="720"/>
       </w:tblGrid>
       <w:tr>
         <w:trPr>
+          <w:trHeight w:val="200"/>
           <w:tblHeader/>
         </w:trPr>
         <w:tc>
           <w:tcPr>
-            <w:tcW w:w="891" w:type="dxa"/>
+            <w:tcW w:w="786" w:type="dxa"/>
             <w:shd w:val="clear" w:color="auto" w:fill="1F4E5F"/>
             <w:tcMar>
               <w:top w:w="80" w:type="dxa"/>
@@ -6178,7 +6229,7 @@
         </w:tc>
         <w:tc>
           <w:tcPr>
-            <w:tcW w:w="2175" w:type="dxa"/>
+            <w:tcW w:w="1170" w:type="dxa"/>
             <w:shd w:val="clear" w:color="auto" w:fill="1F4E5F"/>
             <w:tcMar>
               <w:top w:w="80" w:type="dxa"/>
@@ -6203,7 +6254,7 @@
         </w:tc>
         <w:tc>
           <w:tcPr>
-            <w:tcW w:w="1578" w:type="dxa"/>
+            <w:tcW w:w="1164" w:type="dxa"/>
             <w:shd w:val="clear" w:color="auto" w:fill="1F4E5F"/>
             <w:tcMar>
               <w:top w:w="80" w:type="dxa"/>
@@ -6228,7 +6279,7 @@
         </w:tc>
         <w:tc>
           <w:tcPr>
-            <w:tcW w:w="699" w:type="dxa"/>
+            <w:tcW w:w="1026" w:type="dxa"/>
             <w:shd w:val="clear" w:color="auto" w:fill="1F4E5F"/>
             <w:tcMar>
               <w:top w:w="80" w:type="dxa"/>
@@ -6247,13 +6298,13 @@
                 <w:sz w:val="20"/>
                 <w:szCs w:val="20"/>
               </w:rPr>
-              <w:t>Prob.</w:t>
-            </w:r>
-          </w:p>
-        </w:tc>
-        <w:tc>
-          <w:tcPr>
-            <w:tcW w:w="776" w:type="dxa"/>
+              <w:t>Problem</w:t>
+            </w:r>
+          </w:p>
+        </w:tc>
+        <w:tc>
+          <w:tcPr>
+            <w:tcW w:w="878" w:type="dxa"/>
             <w:shd w:val="clear" w:color="auto" w:fill="1F4E5F"/>
             <w:tcMar>
               <w:top w:w="80" w:type="dxa"/>
@@ -6272,13 +6323,13 @@
                 <w:sz w:val="20"/>
                 <w:szCs w:val="20"/>
               </w:rPr>
-              <w:t>Impact</w:t>
-            </w:r>
-          </w:p>
-        </w:tc>
-        <w:tc>
-          <w:tcPr>
-            <w:tcW w:w="819" w:type="dxa"/>
+              <w:t>Impact Priority</w:t>
+            </w:r>
+          </w:p>
+        </w:tc>
+        <w:tc>
+          <w:tcPr>
+            <w:tcW w:w="878" w:type="dxa"/>
             <w:shd w:val="clear" w:color="auto" w:fill="1F4E5F"/>
             <w:tcMar>
               <w:top w:w="80" w:type="dxa"/>
@@ -6303,7 +6354,7 @@
         </w:tc>
         <w:tc>
           <w:tcPr>
-            <w:tcW w:w="1977" w:type="dxa"/>
+            <w:tcW w:w="1454" w:type="dxa"/>
             <w:shd w:val="clear" w:color="auto" w:fill="1F4E5F"/>
             <w:tcMar>
               <w:top w:w="80" w:type="dxa"/>
@@ -6328,7 +6379,34 @@
         </w:tc>
         <w:tc>
           <w:tcPr>
-            <w:tcW w:w="1189" w:type="dxa"/>
+            <w:tcW w:w="1198" w:type="dxa"/>
+            <w:shd w:val="clear" w:color="auto" w:fill="1F4E5F"/>
+          </w:tcPr>
+          <w:p>
+            <w:pPr>
+              <w:rPr>
+                <w:b/>
+                <w:bCs/>
+                <w:color w:val="FFFFFF"/>
+                <w:sz w:val="20"/>
+                <w:szCs w:val="20"/>
+              </w:rPr>
+            </w:pPr>
+            <w:r>
+              <w:rPr>
+                <w:b/>
+                <w:bCs/>
+                <w:color w:val="FFFFFF"/>
+                <w:sz w:val="20"/>
+                <w:szCs w:val="20"/>
+              </w:rPr>
+              <w:t>Project Contingency</w:t>
+            </w:r>
+          </w:p>
+        </w:tc>
+        <w:tc>
+          <w:tcPr>
+            <w:tcW w:w="1232" w:type="dxa"/>
             <w:shd w:val="clear" w:color="auto" w:fill="1F4E5F"/>
             <w:tcMar>
               <w:top w:w="80" w:type="dxa"/>
@@ -6353,7 +6431,7 @@
         </w:tc>
         <w:tc>
           <w:tcPr>
-            <w:tcW w:w="239" w:type="dxa"/>
+            <w:tcW w:w="720" w:type="dxa"/>
             <w:shd w:val="clear" w:color="auto" w:fill="1F4E5F"/>
             <w:tcMar>
               <w:top w:w="80" w:type="dxa"/>
@@ -6379,490 +6457,1231 @@
       </w:tr>
       <w:tr>
         <w:trPr>
-          <w:trHeight w:val="700"/>
+          <w:trHeight w:val="588"/>
         </w:trPr>
         <w:tc>
           <w:tcPr>
-            <w:tcW w:w="891" w:type="dxa"/>
-            <w:tcMar>
-              <w:top w:w="80" w:type="dxa"/>
-              <w:left w:w="100" w:type="dxa"/>
-              <w:bottom w:w="80" w:type="dxa"/>
-              <w:right w:w="100" w:type="dxa"/>
-            </w:tcMar>
-            <w:vAlign w:val="center"/>
-          </w:tcPr>
-          <w:p/>
-        </w:tc>
-        <w:tc>
-          <w:tcPr>
-            <w:tcW w:w="2175" w:type="dxa"/>
-            <w:tcMar>
-              <w:top w:w="80" w:type="dxa"/>
-              <w:left w:w="100" w:type="dxa"/>
-              <w:bottom w:w="80" w:type="dxa"/>
-              <w:right w:w="100" w:type="dxa"/>
-            </w:tcMar>
-            <w:vAlign w:val="center"/>
-          </w:tcPr>
-          <w:p/>
-        </w:tc>
-        <w:tc>
-          <w:tcPr>
-            <w:tcW w:w="1578" w:type="dxa"/>
-            <w:tcMar>
-              <w:top w:w="80" w:type="dxa"/>
-              <w:left w:w="100" w:type="dxa"/>
-              <w:bottom w:w="80" w:type="dxa"/>
-              <w:right w:w="100" w:type="dxa"/>
-            </w:tcMar>
-            <w:vAlign w:val="center"/>
-          </w:tcPr>
-          <w:p/>
-        </w:tc>
-        <w:tc>
-          <w:tcPr>
-            <w:tcW w:w="699" w:type="dxa"/>
-            <w:tcMar>
-              <w:top w:w="80" w:type="dxa"/>
-              <w:left w:w="100" w:type="dxa"/>
-              <w:bottom w:w="80" w:type="dxa"/>
-              <w:right w:w="100" w:type="dxa"/>
-            </w:tcMar>
-            <w:vAlign w:val="center"/>
-          </w:tcPr>
-          <w:p/>
-        </w:tc>
-        <w:tc>
-          <w:tcPr>
-            <w:tcW w:w="776" w:type="dxa"/>
-            <w:tcMar>
-              <w:top w:w="80" w:type="dxa"/>
-              <w:left w:w="100" w:type="dxa"/>
-              <w:bottom w:w="80" w:type="dxa"/>
-              <w:right w:w="100" w:type="dxa"/>
-            </w:tcMar>
-            <w:vAlign w:val="center"/>
-          </w:tcPr>
-          <w:p/>
-        </w:tc>
-        <w:tc>
-          <w:tcPr>
-            <w:tcW w:w="819" w:type="dxa"/>
-            <w:tcMar>
-              <w:top w:w="80" w:type="dxa"/>
-              <w:left w:w="100" w:type="dxa"/>
-              <w:bottom w:w="80" w:type="dxa"/>
-              <w:right w:w="100" w:type="dxa"/>
-            </w:tcMar>
-            <w:vAlign w:val="center"/>
-          </w:tcPr>
-          <w:p/>
-        </w:tc>
-        <w:tc>
-          <w:tcPr>
-            <w:tcW w:w="1977" w:type="dxa"/>
-            <w:tcMar>
-              <w:top w:w="80" w:type="dxa"/>
-              <w:left w:w="100" w:type="dxa"/>
-              <w:bottom w:w="80" w:type="dxa"/>
-              <w:right w:w="100" w:type="dxa"/>
-            </w:tcMar>
-            <w:vAlign w:val="center"/>
-          </w:tcPr>
-          <w:p/>
-        </w:tc>
-        <w:tc>
-          <w:tcPr>
-            <w:tcW w:w="1189" w:type="dxa"/>
-            <w:tcMar>
-              <w:top w:w="80" w:type="dxa"/>
-              <w:left w:w="100" w:type="dxa"/>
-              <w:bottom w:w="80" w:type="dxa"/>
-              <w:right w:w="100" w:type="dxa"/>
-            </w:tcMar>
-            <w:vAlign w:val="center"/>
-          </w:tcPr>
-          <w:p/>
-        </w:tc>
-        <w:tc>
-          <w:tcPr>
-            <w:tcW w:w="239" w:type="dxa"/>
-            <w:tcMar>
-              <w:top w:w="80" w:type="dxa"/>
-              <w:left w:w="100" w:type="dxa"/>
-              <w:bottom w:w="80" w:type="dxa"/>
-              <w:right w:w="100" w:type="dxa"/>
-            </w:tcMar>
-            <w:vAlign w:val="center"/>
-          </w:tcPr>
-          <w:p/>
+            <w:tcW w:w="786" w:type="dxa"/>
+            <w:tcMar>
+              <w:top w:w="80" w:type="dxa"/>
+              <w:left w:w="100" w:type="dxa"/>
+              <w:bottom w:w="80" w:type="dxa"/>
+              <w:right w:w="100" w:type="dxa"/>
+            </w:tcMar>
+            <w:vAlign w:val="center"/>
+          </w:tcPr>
+          <w:p>
+            <w:r>
+              <w:t>R-001</w:t>
+            </w:r>
+          </w:p>
+        </w:tc>
+        <w:tc>
+          <w:tcPr>
+            <w:tcW w:w="1170" w:type="dxa"/>
+            <w:tcMar>
+              <w:top w:w="80" w:type="dxa"/>
+              <w:left w:w="100" w:type="dxa"/>
+              <w:bottom w:w="80" w:type="dxa"/>
+              <w:right w:w="100" w:type="dxa"/>
+            </w:tcMar>
+            <w:vAlign w:val="center"/>
+          </w:tcPr>
+          <w:p>
+            <w:r>
+              <w:t>Outlined requirements created during planning get changed due to client feedback during milestone review. Invalidating sections of approved scope</w:t>
+            </w:r>
+          </w:p>
+        </w:tc>
+        <w:tc>
+          <w:tcPr>
+            <w:tcW w:w="1164" w:type="dxa"/>
+            <w:tcMar>
+              <w:top w:w="80" w:type="dxa"/>
+              <w:left w:w="100" w:type="dxa"/>
+              <w:bottom w:w="80" w:type="dxa"/>
+              <w:right w:w="100" w:type="dxa"/>
+            </w:tcMar>
+            <w:vAlign w:val="center"/>
+          </w:tcPr>
+          <w:p>
+            <w:r>
+              <w:t>Informal feedback that was received verbally in presentation of work rather than through formal Change Request Process</w:t>
+            </w:r>
+          </w:p>
+        </w:tc>
+        <w:tc>
+          <w:tcPr>
+            <w:tcW w:w="1026" w:type="dxa"/>
+            <w:tcMar>
+              <w:top w:w="80" w:type="dxa"/>
+              <w:left w:w="100" w:type="dxa"/>
+              <w:bottom w:w="80" w:type="dxa"/>
+              <w:right w:w="100" w:type="dxa"/>
+            </w:tcMar>
+            <w:vAlign w:val="center"/>
+          </w:tcPr>
+          <w:p>
+            <w:r>
+              <w:t>Medium</w:t>
+            </w:r>
+            <w:r>
+              <w:t xml:space="preserve"> </w:t>
+            </w:r>
+          </w:p>
+        </w:tc>
+        <w:tc>
+          <w:tcPr>
+            <w:tcW w:w="878" w:type="dxa"/>
+            <w:tcMar>
+              <w:top w:w="80" w:type="dxa"/>
+              <w:left w:w="100" w:type="dxa"/>
+              <w:bottom w:w="80" w:type="dxa"/>
+              <w:right w:w="100" w:type="dxa"/>
+            </w:tcMar>
+            <w:vAlign w:val="center"/>
+          </w:tcPr>
+          <w:p>
+            <w:r>
+              <w:t>High</w:t>
+            </w:r>
+          </w:p>
+        </w:tc>
+        <w:tc>
+          <w:tcPr>
+            <w:tcW w:w="878" w:type="dxa"/>
+            <w:tcMar>
+              <w:top w:w="80" w:type="dxa"/>
+              <w:left w:w="100" w:type="dxa"/>
+              <w:bottom w:w="80" w:type="dxa"/>
+              <w:right w:w="100" w:type="dxa"/>
+            </w:tcMar>
+            <w:vAlign w:val="center"/>
+          </w:tcPr>
+          <w:p>
+            <w:r>
+              <w:t>High</w:t>
+            </w:r>
+          </w:p>
+        </w:tc>
+        <w:tc>
+          <w:tcPr>
+            <w:tcW w:w="1454" w:type="dxa"/>
+            <w:tcMar>
+              <w:top w:w="80" w:type="dxa"/>
+              <w:left w:w="100" w:type="dxa"/>
+              <w:bottom w:w="80" w:type="dxa"/>
+              <w:right w:w="100" w:type="dxa"/>
+            </w:tcMar>
+            <w:vAlign w:val="center"/>
+          </w:tcPr>
+          <w:p>
+            <w:r>
+              <w:t>Require all proposed changes- no matter the origin to go through CR/ Impact analysis before it touches the project baseline.</w:t>
+            </w:r>
+          </w:p>
+        </w:tc>
+        <w:tc>
+          <w:tcPr>
+            <w:tcW w:w="1198" w:type="dxa"/>
+          </w:tcPr>
+          <w:p/>
+          <w:p>
+            <w:r>
+              <w:t>Log proposed request as deferred until formal impact analysis approvals are completed. Ensure proper process is followed</w:t>
+            </w:r>
+          </w:p>
+        </w:tc>
+        <w:tc>
+          <w:tcPr>
+            <w:tcW w:w="1232" w:type="dxa"/>
+            <w:tcMar>
+              <w:top w:w="80" w:type="dxa"/>
+              <w:left w:w="100" w:type="dxa"/>
+              <w:bottom w:w="80" w:type="dxa"/>
+              <w:right w:w="100" w:type="dxa"/>
+            </w:tcMar>
+            <w:vAlign w:val="center"/>
+          </w:tcPr>
+          <w:p>
+            <w:r>
+              <w:t xml:space="preserve">Michiel Coenraad </w:t>
+            </w:r>
+            <w:proofErr w:type="spellStart"/>
+            <w:r>
+              <w:t>TerBlanche</w:t>
+            </w:r>
+            <w:proofErr w:type="spellEnd"/>
+          </w:p>
+        </w:tc>
+        <w:tc>
+          <w:tcPr>
+            <w:tcW w:w="720" w:type="dxa"/>
+            <w:tcMar>
+              <w:top w:w="80" w:type="dxa"/>
+              <w:left w:w="100" w:type="dxa"/>
+              <w:bottom w:w="80" w:type="dxa"/>
+              <w:right w:w="100" w:type="dxa"/>
+            </w:tcMar>
+            <w:vAlign w:val="center"/>
+          </w:tcPr>
+          <w:p>
+            <w:r>
+              <w:t>Open</w:t>
+            </w:r>
+          </w:p>
         </w:tc>
       </w:tr>
       <w:tr>
         <w:trPr>
-          <w:trHeight w:val="700"/>
+          <w:trHeight w:val="588"/>
         </w:trPr>
         <w:tc>
           <w:tcPr>
-            <w:tcW w:w="891" w:type="dxa"/>
-            <w:tcMar>
-              <w:top w:w="80" w:type="dxa"/>
-              <w:left w:w="100" w:type="dxa"/>
-              <w:bottom w:w="80" w:type="dxa"/>
-              <w:right w:w="100" w:type="dxa"/>
-            </w:tcMar>
-            <w:vAlign w:val="center"/>
-          </w:tcPr>
-          <w:p/>
-        </w:tc>
-        <w:tc>
-          <w:tcPr>
-            <w:tcW w:w="2175" w:type="dxa"/>
-            <w:tcMar>
-              <w:top w:w="80" w:type="dxa"/>
-              <w:left w:w="100" w:type="dxa"/>
-              <w:bottom w:w="80" w:type="dxa"/>
-              <w:right w:w="100" w:type="dxa"/>
-            </w:tcMar>
-            <w:vAlign w:val="center"/>
-          </w:tcPr>
-          <w:p/>
-        </w:tc>
-        <w:tc>
-          <w:tcPr>
-            <w:tcW w:w="1578" w:type="dxa"/>
-            <w:tcMar>
-              <w:top w:w="80" w:type="dxa"/>
-              <w:left w:w="100" w:type="dxa"/>
-              <w:bottom w:w="80" w:type="dxa"/>
-              <w:right w:w="100" w:type="dxa"/>
-            </w:tcMar>
-            <w:vAlign w:val="center"/>
-          </w:tcPr>
-          <w:p/>
-        </w:tc>
-        <w:tc>
-          <w:tcPr>
-            <w:tcW w:w="699" w:type="dxa"/>
-            <w:tcMar>
-              <w:top w:w="80" w:type="dxa"/>
-              <w:left w:w="100" w:type="dxa"/>
-              <w:bottom w:w="80" w:type="dxa"/>
-              <w:right w:w="100" w:type="dxa"/>
-            </w:tcMar>
-            <w:vAlign w:val="center"/>
-          </w:tcPr>
-          <w:p/>
-        </w:tc>
-        <w:tc>
-          <w:tcPr>
-            <w:tcW w:w="776" w:type="dxa"/>
-            <w:tcMar>
-              <w:top w:w="80" w:type="dxa"/>
-              <w:left w:w="100" w:type="dxa"/>
-              <w:bottom w:w="80" w:type="dxa"/>
-              <w:right w:w="100" w:type="dxa"/>
-            </w:tcMar>
-            <w:vAlign w:val="center"/>
-          </w:tcPr>
-          <w:p/>
-        </w:tc>
-        <w:tc>
-          <w:tcPr>
-            <w:tcW w:w="819" w:type="dxa"/>
-            <w:tcMar>
-              <w:top w:w="80" w:type="dxa"/>
-              <w:left w:w="100" w:type="dxa"/>
-              <w:bottom w:w="80" w:type="dxa"/>
-              <w:right w:w="100" w:type="dxa"/>
-            </w:tcMar>
-            <w:vAlign w:val="center"/>
-          </w:tcPr>
-          <w:p/>
-        </w:tc>
-        <w:tc>
-          <w:tcPr>
-            <w:tcW w:w="1977" w:type="dxa"/>
-            <w:tcMar>
-              <w:top w:w="80" w:type="dxa"/>
-              <w:left w:w="100" w:type="dxa"/>
-              <w:bottom w:w="80" w:type="dxa"/>
-              <w:right w:w="100" w:type="dxa"/>
-            </w:tcMar>
-            <w:vAlign w:val="center"/>
-          </w:tcPr>
-          <w:p/>
-        </w:tc>
-        <w:tc>
-          <w:tcPr>
-            <w:tcW w:w="1189" w:type="dxa"/>
-            <w:tcMar>
-              <w:top w:w="80" w:type="dxa"/>
-              <w:left w:w="100" w:type="dxa"/>
-              <w:bottom w:w="80" w:type="dxa"/>
-              <w:right w:w="100" w:type="dxa"/>
-            </w:tcMar>
-            <w:vAlign w:val="center"/>
-          </w:tcPr>
-          <w:p/>
-        </w:tc>
-        <w:tc>
-          <w:tcPr>
-            <w:tcW w:w="239" w:type="dxa"/>
-            <w:tcMar>
-              <w:top w:w="80" w:type="dxa"/>
-              <w:left w:w="100" w:type="dxa"/>
-              <w:bottom w:w="80" w:type="dxa"/>
-              <w:right w:w="100" w:type="dxa"/>
-            </w:tcMar>
-            <w:vAlign w:val="center"/>
-          </w:tcPr>
-          <w:p/>
+            <w:tcW w:w="786" w:type="dxa"/>
+            <w:tcMar>
+              <w:top w:w="80" w:type="dxa"/>
+              <w:left w:w="100" w:type="dxa"/>
+              <w:bottom w:w="80" w:type="dxa"/>
+              <w:right w:w="100" w:type="dxa"/>
+            </w:tcMar>
+            <w:vAlign w:val="center"/>
+          </w:tcPr>
+          <w:p>
+            <w:r>
+              <w:t>R-002</w:t>
+            </w:r>
+          </w:p>
+        </w:tc>
+        <w:tc>
+          <w:tcPr>
+            <w:tcW w:w="1170" w:type="dxa"/>
+            <w:tcMar>
+              <w:top w:w="80" w:type="dxa"/>
+              <w:left w:w="100" w:type="dxa"/>
+              <w:bottom w:w="80" w:type="dxa"/>
+              <w:right w:w="100" w:type="dxa"/>
+            </w:tcMar>
+            <w:vAlign w:val="center"/>
+          </w:tcPr>
+          <w:p>
+            <w:r>
+              <w:t xml:space="preserve">Two-reviewer approval system gets bypassed </w:t>
+            </w:r>
+            <w:r>
+              <w:lastRenderedPageBreak/>
+              <w:t>due to a third member making decisions without team approval</w:t>
+            </w:r>
+          </w:p>
+        </w:tc>
+        <w:tc>
+          <w:tcPr>
+            <w:tcW w:w="1164" w:type="dxa"/>
+            <w:tcMar>
+              <w:top w:w="80" w:type="dxa"/>
+              <w:left w:w="100" w:type="dxa"/>
+              <w:bottom w:w="80" w:type="dxa"/>
+              <w:right w:w="100" w:type="dxa"/>
+            </w:tcMar>
+            <w:vAlign w:val="center"/>
+          </w:tcPr>
+          <w:p>
+            <w:r>
+              <w:lastRenderedPageBreak/>
+              <w:t xml:space="preserve">Small team size, increasing pressure near deadlines, </w:t>
+            </w:r>
+            <w:r>
+              <w:lastRenderedPageBreak/>
+              <w:t>misplaced trust in own work</w:t>
+            </w:r>
+          </w:p>
+        </w:tc>
+        <w:tc>
+          <w:tcPr>
+            <w:tcW w:w="1026" w:type="dxa"/>
+            <w:tcMar>
+              <w:top w:w="80" w:type="dxa"/>
+              <w:left w:w="100" w:type="dxa"/>
+              <w:bottom w:w="80" w:type="dxa"/>
+              <w:right w:w="100" w:type="dxa"/>
+            </w:tcMar>
+            <w:vAlign w:val="center"/>
+          </w:tcPr>
+          <w:p>
+            <w:r>
+              <w:lastRenderedPageBreak/>
+              <w:t xml:space="preserve">Medium </w:t>
+            </w:r>
+          </w:p>
+        </w:tc>
+        <w:tc>
+          <w:tcPr>
+            <w:tcW w:w="878" w:type="dxa"/>
+            <w:tcMar>
+              <w:top w:w="80" w:type="dxa"/>
+              <w:left w:w="100" w:type="dxa"/>
+              <w:bottom w:w="80" w:type="dxa"/>
+              <w:right w:w="100" w:type="dxa"/>
+            </w:tcMar>
+            <w:vAlign w:val="center"/>
+          </w:tcPr>
+          <w:p>
+            <w:r>
+              <w:t>High</w:t>
+            </w:r>
+          </w:p>
+        </w:tc>
+        <w:tc>
+          <w:tcPr>
+            <w:tcW w:w="878" w:type="dxa"/>
+            <w:tcMar>
+              <w:top w:w="80" w:type="dxa"/>
+              <w:left w:w="100" w:type="dxa"/>
+              <w:bottom w:w="80" w:type="dxa"/>
+              <w:right w:w="100" w:type="dxa"/>
+            </w:tcMar>
+            <w:vAlign w:val="center"/>
+          </w:tcPr>
+          <w:p>
+            <w:r>
+              <w:t>High</w:t>
+            </w:r>
+          </w:p>
+        </w:tc>
+        <w:tc>
+          <w:tcPr>
+            <w:tcW w:w="1454" w:type="dxa"/>
+            <w:tcMar>
+              <w:top w:w="80" w:type="dxa"/>
+              <w:left w:w="100" w:type="dxa"/>
+              <w:bottom w:w="80" w:type="dxa"/>
+              <w:right w:w="100" w:type="dxa"/>
+            </w:tcMar>
+            <w:vAlign w:val="center"/>
+          </w:tcPr>
+          <w:p>
+            <w:r>
+              <w:t xml:space="preserve">Configure branch protection to block self-approval of work while </w:t>
+            </w:r>
+            <w:r>
+              <w:lastRenderedPageBreak/>
+              <w:t>requiring 2 non-author reviews to qualify work. Rotate reviewers periodically.</w:t>
+            </w:r>
+          </w:p>
+        </w:tc>
+        <w:tc>
+          <w:tcPr>
+            <w:tcW w:w="1198" w:type="dxa"/>
+          </w:tcPr>
+          <w:p>
+            <w:r>
+              <w:lastRenderedPageBreak/>
+              <w:t xml:space="preserve">Retroactively re-review work completed to ensure that it meets </w:t>
+            </w:r>
+            <w:r>
+              <w:lastRenderedPageBreak/>
+              <w:t>standards given. If not escalate to lecturer for remediation of work if control fails.</w:t>
+            </w:r>
+          </w:p>
+        </w:tc>
+        <w:tc>
+          <w:tcPr>
+            <w:tcW w:w="1232" w:type="dxa"/>
+            <w:tcMar>
+              <w:top w:w="80" w:type="dxa"/>
+              <w:left w:w="100" w:type="dxa"/>
+              <w:bottom w:w="80" w:type="dxa"/>
+              <w:right w:w="100" w:type="dxa"/>
+            </w:tcMar>
+            <w:vAlign w:val="center"/>
+          </w:tcPr>
+          <w:p>
+            <w:r>
+              <w:lastRenderedPageBreak/>
+              <w:t>Nicholas Vronka</w:t>
+            </w:r>
+          </w:p>
+        </w:tc>
+        <w:tc>
+          <w:tcPr>
+            <w:tcW w:w="720" w:type="dxa"/>
+            <w:tcMar>
+              <w:top w:w="80" w:type="dxa"/>
+              <w:left w:w="100" w:type="dxa"/>
+              <w:bottom w:w="80" w:type="dxa"/>
+              <w:right w:w="100" w:type="dxa"/>
+            </w:tcMar>
+            <w:vAlign w:val="center"/>
+          </w:tcPr>
+          <w:p>
+            <w:r>
+              <w:t>Open</w:t>
+            </w:r>
+          </w:p>
         </w:tc>
       </w:tr>
       <w:tr>
         <w:trPr>
-          <w:trHeight w:val="700"/>
+          <w:trHeight w:val="588"/>
         </w:trPr>
         <w:tc>
           <w:tcPr>
-            <w:tcW w:w="891" w:type="dxa"/>
-            <w:tcMar>
-              <w:top w:w="80" w:type="dxa"/>
-              <w:left w:w="100" w:type="dxa"/>
-              <w:bottom w:w="80" w:type="dxa"/>
-              <w:right w:w="100" w:type="dxa"/>
-            </w:tcMar>
-            <w:vAlign w:val="center"/>
-          </w:tcPr>
-          <w:p/>
-        </w:tc>
-        <w:tc>
-          <w:tcPr>
-            <w:tcW w:w="2175" w:type="dxa"/>
-            <w:tcMar>
-              <w:top w:w="80" w:type="dxa"/>
-              <w:left w:w="100" w:type="dxa"/>
-              <w:bottom w:w="80" w:type="dxa"/>
-              <w:right w:w="100" w:type="dxa"/>
-            </w:tcMar>
-            <w:vAlign w:val="center"/>
-          </w:tcPr>
-          <w:p/>
-        </w:tc>
-        <w:tc>
-          <w:tcPr>
-            <w:tcW w:w="1578" w:type="dxa"/>
-            <w:tcMar>
-              <w:top w:w="80" w:type="dxa"/>
-              <w:left w:w="100" w:type="dxa"/>
-              <w:bottom w:w="80" w:type="dxa"/>
-              <w:right w:w="100" w:type="dxa"/>
-            </w:tcMar>
-            <w:vAlign w:val="center"/>
-          </w:tcPr>
-          <w:p/>
-        </w:tc>
-        <w:tc>
-          <w:tcPr>
-            <w:tcW w:w="699" w:type="dxa"/>
-            <w:tcMar>
-              <w:top w:w="80" w:type="dxa"/>
-              <w:left w:w="100" w:type="dxa"/>
-              <w:bottom w:w="80" w:type="dxa"/>
-              <w:right w:w="100" w:type="dxa"/>
-            </w:tcMar>
-            <w:vAlign w:val="center"/>
-          </w:tcPr>
-          <w:p/>
-        </w:tc>
-        <w:tc>
-          <w:tcPr>
-            <w:tcW w:w="776" w:type="dxa"/>
-            <w:tcMar>
-              <w:top w:w="80" w:type="dxa"/>
-              <w:left w:w="100" w:type="dxa"/>
-              <w:bottom w:w="80" w:type="dxa"/>
-              <w:right w:w="100" w:type="dxa"/>
-            </w:tcMar>
-            <w:vAlign w:val="center"/>
-          </w:tcPr>
-          <w:p/>
-        </w:tc>
-        <w:tc>
-          <w:tcPr>
-            <w:tcW w:w="819" w:type="dxa"/>
-            <w:tcMar>
-              <w:top w:w="80" w:type="dxa"/>
-              <w:left w:w="100" w:type="dxa"/>
-              <w:bottom w:w="80" w:type="dxa"/>
-              <w:right w:w="100" w:type="dxa"/>
-            </w:tcMar>
-            <w:vAlign w:val="center"/>
-          </w:tcPr>
-          <w:p/>
-        </w:tc>
-        <w:tc>
-          <w:tcPr>
-            <w:tcW w:w="1977" w:type="dxa"/>
-            <w:tcMar>
-              <w:top w:w="80" w:type="dxa"/>
-              <w:left w:w="100" w:type="dxa"/>
-              <w:bottom w:w="80" w:type="dxa"/>
-              <w:right w:w="100" w:type="dxa"/>
-            </w:tcMar>
-            <w:vAlign w:val="center"/>
-          </w:tcPr>
-          <w:p/>
-        </w:tc>
-        <w:tc>
-          <w:tcPr>
-            <w:tcW w:w="1189" w:type="dxa"/>
-            <w:tcMar>
-              <w:top w:w="80" w:type="dxa"/>
-              <w:left w:w="100" w:type="dxa"/>
-              <w:bottom w:w="80" w:type="dxa"/>
-              <w:right w:w="100" w:type="dxa"/>
-            </w:tcMar>
-            <w:vAlign w:val="center"/>
-          </w:tcPr>
-          <w:p/>
-        </w:tc>
-        <w:tc>
-          <w:tcPr>
-            <w:tcW w:w="239" w:type="dxa"/>
-            <w:tcMar>
-              <w:top w:w="80" w:type="dxa"/>
-              <w:left w:w="100" w:type="dxa"/>
-              <w:bottom w:w="80" w:type="dxa"/>
-              <w:right w:w="100" w:type="dxa"/>
-            </w:tcMar>
-            <w:vAlign w:val="center"/>
-          </w:tcPr>
-          <w:p/>
+            <w:tcW w:w="786" w:type="dxa"/>
+            <w:tcMar>
+              <w:top w:w="80" w:type="dxa"/>
+              <w:left w:w="100" w:type="dxa"/>
+              <w:bottom w:w="80" w:type="dxa"/>
+              <w:right w:w="100" w:type="dxa"/>
+            </w:tcMar>
+            <w:vAlign w:val="center"/>
+          </w:tcPr>
+          <w:p>
+            <w:r>
+              <w:t>R-003</w:t>
+            </w:r>
+          </w:p>
+        </w:tc>
+        <w:tc>
+          <w:tcPr>
+            <w:tcW w:w="1170" w:type="dxa"/>
+            <w:tcMar>
+              <w:top w:w="80" w:type="dxa"/>
+              <w:left w:w="100" w:type="dxa"/>
+              <w:bottom w:w="80" w:type="dxa"/>
+              <w:right w:w="100" w:type="dxa"/>
+            </w:tcMar>
+            <w:vAlign w:val="center"/>
+          </w:tcPr>
+          <w:p>
+            <w:r>
+              <w:t>Sensitive service-request information (e.g. security concerns, complaint details) handled inconsistently before proper access controls are created.</w:t>
+            </w:r>
+          </w:p>
+        </w:tc>
+        <w:tc>
+          <w:tcPr>
+            <w:tcW w:w="1164" w:type="dxa"/>
+            <w:tcMar>
+              <w:top w:w="80" w:type="dxa"/>
+              <w:left w:w="100" w:type="dxa"/>
+              <w:bottom w:w="80" w:type="dxa"/>
+              <w:right w:w="100" w:type="dxa"/>
+            </w:tcMar>
+            <w:vAlign w:val="center"/>
+          </w:tcPr>
+          <w:p>
+            <w:r>
+              <w:t>No access-control requirements or data classification have been defined such as a Role Based Access Control system.</w:t>
+            </w:r>
+          </w:p>
+        </w:tc>
+        <w:tc>
+          <w:tcPr>
+            <w:tcW w:w="1026" w:type="dxa"/>
+            <w:tcMar>
+              <w:top w:w="80" w:type="dxa"/>
+              <w:left w:w="100" w:type="dxa"/>
+              <w:bottom w:w="80" w:type="dxa"/>
+              <w:right w:w="100" w:type="dxa"/>
+            </w:tcMar>
+            <w:vAlign w:val="center"/>
+          </w:tcPr>
+          <w:p>
+            <w:r>
+              <w:t xml:space="preserve">Medium </w:t>
+            </w:r>
+          </w:p>
+        </w:tc>
+        <w:tc>
+          <w:tcPr>
+            <w:tcW w:w="878" w:type="dxa"/>
+            <w:tcMar>
+              <w:top w:w="80" w:type="dxa"/>
+              <w:left w:w="100" w:type="dxa"/>
+              <w:bottom w:w="80" w:type="dxa"/>
+              <w:right w:w="100" w:type="dxa"/>
+            </w:tcMar>
+            <w:vAlign w:val="center"/>
+          </w:tcPr>
+          <w:p>
+            <w:r>
+              <w:t>High</w:t>
+            </w:r>
+          </w:p>
+        </w:tc>
+        <w:tc>
+          <w:tcPr>
+            <w:tcW w:w="878" w:type="dxa"/>
+            <w:tcMar>
+              <w:top w:w="80" w:type="dxa"/>
+              <w:left w:w="100" w:type="dxa"/>
+              <w:bottom w:w="80" w:type="dxa"/>
+              <w:right w:w="100" w:type="dxa"/>
+            </w:tcMar>
+            <w:vAlign w:val="center"/>
+          </w:tcPr>
+          <w:p>
+            <w:r>
+              <w:t>High</w:t>
+            </w:r>
+          </w:p>
+        </w:tc>
+        <w:tc>
+          <w:tcPr>
+            <w:tcW w:w="1454" w:type="dxa"/>
+            <w:tcMar>
+              <w:top w:w="80" w:type="dxa"/>
+              <w:left w:w="100" w:type="dxa"/>
+              <w:bottom w:w="80" w:type="dxa"/>
+              <w:right w:w="100" w:type="dxa"/>
+            </w:tcMar>
+            <w:vAlign w:val="center"/>
+          </w:tcPr>
+          <w:p>
+            <w:r>
+              <w:t>Define minimum handling Non-Functional Requirements (NFR) for who may view each field even when proper implementation is deferred to Milestone 2, restrict data categories until then.</w:t>
+            </w:r>
+          </w:p>
+        </w:tc>
+        <w:tc>
+          <w:tcPr>
+            <w:tcW w:w="1198" w:type="dxa"/>
+          </w:tcPr>
+          <w:p/>
+          <w:p/>
+          <w:p>
+            <w:r>
+              <w:t>Limit initial requests form to non-sensitive fields until proper access control is defined for the project.</w:t>
+            </w:r>
+          </w:p>
+        </w:tc>
+        <w:tc>
+          <w:tcPr>
+            <w:tcW w:w="1232" w:type="dxa"/>
+            <w:tcMar>
+              <w:top w:w="80" w:type="dxa"/>
+              <w:left w:w="100" w:type="dxa"/>
+              <w:bottom w:w="80" w:type="dxa"/>
+              <w:right w:w="100" w:type="dxa"/>
+            </w:tcMar>
+            <w:vAlign w:val="center"/>
+          </w:tcPr>
+          <w:p>
+            <w:r>
+              <w:t>Rivan Maritz</w:t>
+            </w:r>
+          </w:p>
+        </w:tc>
+        <w:tc>
+          <w:tcPr>
+            <w:tcW w:w="720" w:type="dxa"/>
+            <w:tcMar>
+              <w:top w:w="80" w:type="dxa"/>
+              <w:left w:w="100" w:type="dxa"/>
+              <w:bottom w:w="80" w:type="dxa"/>
+              <w:right w:w="100" w:type="dxa"/>
+            </w:tcMar>
+            <w:vAlign w:val="center"/>
+          </w:tcPr>
+          <w:p>
+            <w:r>
+              <w:t>Open</w:t>
+            </w:r>
+          </w:p>
         </w:tc>
       </w:tr>
       <w:tr>
         <w:trPr>
-          <w:trHeight w:val="700"/>
+          <w:trHeight w:val="588"/>
         </w:trPr>
         <w:tc>
           <w:tcPr>
-            <w:tcW w:w="891" w:type="dxa"/>
-            <w:tcMar>
-              <w:top w:w="80" w:type="dxa"/>
-              <w:left w:w="100" w:type="dxa"/>
-              <w:bottom w:w="80" w:type="dxa"/>
-              <w:right w:w="100" w:type="dxa"/>
-            </w:tcMar>
-            <w:vAlign w:val="center"/>
-          </w:tcPr>
-          <w:p/>
-        </w:tc>
-        <w:tc>
-          <w:tcPr>
-            <w:tcW w:w="2175" w:type="dxa"/>
-            <w:tcMar>
-              <w:top w:w="80" w:type="dxa"/>
-              <w:left w:w="100" w:type="dxa"/>
-              <w:bottom w:w="80" w:type="dxa"/>
-              <w:right w:w="100" w:type="dxa"/>
-            </w:tcMar>
-            <w:vAlign w:val="center"/>
-          </w:tcPr>
-          <w:p/>
-        </w:tc>
-        <w:tc>
-          <w:tcPr>
-            <w:tcW w:w="1578" w:type="dxa"/>
-            <w:tcMar>
-              <w:top w:w="80" w:type="dxa"/>
-              <w:left w:w="100" w:type="dxa"/>
-              <w:bottom w:w="80" w:type="dxa"/>
-              <w:right w:w="100" w:type="dxa"/>
-            </w:tcMar>
-            <w:vAlign w:val="center"/>
-          </w:tcPr>
-          <w:p/>
-        </w:tc>
-        <w:tc>
-          <w:tcPr>
-            <w:tcW w:w="699" w:type="dxa"/>
-            <w:tcMar>
-              <w:top w:w="80" w:type="dxa"/>
-              <w:left w:w="100" w:type="dxa"/>
-              <w:bottom w:w="80" w:type="dxa"/>
-              <w:right w:w="100" w:type="dxa"/>
-            </w:tcMar>
-            <w:vAlign w:val="center"/>
-          </w:tcPr>
-          <w:p/>
-        </w:tc>
-        <w:tc>
-          <w:tcPr>
-            <w:tcW w:w="776" w:type="dxa"/>
-            <w:tcMar>
-              <w:top w:w="80" w:type="dxa"/>
-              <w:left w:w="100" w:type="dxa"/>
-              <w:bottom w:w="80" w:type="dxa"/>
-              <w:right w:w="100" w:type="dxa"/>
-            </w:tcMar>
-            <w:vAlign w:val="center"/>
-          </w:tcPr>
-          <w:p/>
-        </w:tc>
-        <w:tc>
-          <w:tcPr>
-            <w:tcW w:w="819" w:type="dxa"/>
-            <w:tcMar>
-              <w:top w:w="80" w:type="dxa"/>
-              <w:left w:w="100" w:type="dxa"/>
-              <w:bottom w:w="80" w:type="dxa"/>
-              <w:right w:w="100" w:type="dxa"/>
-            </w:tcMar>
-            <w:vAlign w:val="center"/>
-          </w:tcPr>
-          <w:p/>
-        </w:tc>
-        <w:tc>
-          <w:tcPr>
-            <w:tcW w:w="1977" w:type="dxa"/>
-            <w:tcMar>
-              <w:top w:w="80" w:type="dxa"/>
-              <w:left w:w="100" w:type="dxa"/>
-              <w:bottom w:w="80" w:type="dxa"/>
-              <w:right w:w="100" w:type="dxa"/>
-            </w:tcMar>
-            <w:vAlign w:val="center"/>
-          </w:tcPr>
-          <w:p/>
-        </w:tc>
-        <w:tc>
-          <w:tcPr>
-            <w:tcW w:w="1189" w:type="dxa"/>
-            <w:tcMar>
-              <w:top w:w="80" w:type="dxa"/>
-              <w:left w:w="100" w:type="dxa"/>
-              <w:bottom w:w="80" w:type="dxa"/>
-              <w:right w:w="100" w:type="dxa"/>
-            </w:tcMar>
-            <w:vAlign w:val="center"/>
-          </w:tcPr>
-          <w:p/>
-        </w:tc>
-        <w:tc>
-          <w:tcPr>
-            <w:tcW w:w="239" w:type="dxa"/>
-            <w:tcMar>
-              <w:top w:w="80" w:type="dxa"/>
-              <w:left w:w="100" w:type="dxa"/>
-              <w:bottom w:w="80" w:type="dxa"/>
-              <w:right w:w="100" w:type="dxa"/>
-            </w:tcMar>
-            <w:vAlign w:val="center"/>
-          </w:tcPr>
-          <w:p/>
+            <w:tcW w:w="786" w:type="dxa"/>
+            <w:tcMar>
+              <w:top w:w="80" w:type="dxa"/>
+              <w:left w:w="100" w:type="dxa"/>
+              <w:bottom w:w="80" w:type="dxa"/>
+              <w:right w:w="100" w:type="dxa"/>
+            </w:tcMar>
+            <w:vAlign w:val="center"/>
+          </w:tcPr>
+          <w:p>
+            <w:r>
+              <w:t>R-004</w:t>
+            </w:r>
+          </w:p>
+        </w:tc>
+        <w:tc>
+          <w:tcPr>
+            <w:tcW w:w="1170" w:type="dxa"/>
+            <w:tcMar>
+              <w:top w:w="80" w:type="dxa"/>
+              <w:left w:w="100" w:type="dxa"/>
+              <w:bottom w:w="80" w:type="dxa"/>
+              <w:right w:w="100" w:type="dxa"/>
+            </w:tcMar>
+            <w:vAlign w:val="center"/>
+          </w:tcPr>
+          <w:p>
+            <w:r>
+              <w:t>Schedule slippage in Milestone 2/3 as undefined project technology stack does not match team skill level.</w:t>
+            </w:r>
+          </w:p>
+        </w:tc>
+        <w:tc>
+          <w:tcPr>
+            <w:tcW w:w="1164" w:type="dxa"/>
+            <w:tcMar>
+              <w:top w:w="80" w:type="dxa"/>
+              <w:left w:w="100" w:type="dxa"/>
+              <w:bottom w:w="80" w:type="dxa"/>
+              <w:right w:w="100" w:type="dxa"/>
+            </w:tcMar>
+            <w:vAlign w:val="center"/>
+          </w:tcPr>
+          <w:p>
+            <w:r>
+              <w:t>Stack selection has been deferred to Milestone 2 leading to team skill profile not being assessed against candidate stack.</w:t>
+            </w:r>
+          </w:p>
+        </w:tc>
+        <w:tc>
+          <w:tcPr>
+            <w:tcW w:w="1026" w:type="dxa"/>
+            <w:tcMar>
+              <w:top w:w="80" w:type="dxa"/>
+              <w:left w:w="100" w:type="dxa"/>
+              <w:bottom w:w="80" w:type="dxa"/>
+              <w:right w:w="100" w:type="dxa"/>
+            </w:tcMar>
+            <w:vAlign w:val="center"/>
+          </w:tcPr>
+          <w:p>
+            <w:r>
+              <w:t>Medium</w:t>
+            </w:r>
+          </w:p>
+        </w:tc>
+        <w:tc>
+          <w:tcPr>
+            <w:tcW w:w="878" w:type="dxa"/>
+            <w:tcMar>
+              <w:top w:w="80" w:type="dxa"/>
+              <w:left w:w="100" w:type="dxa"/>
+              <w:bottom w:w="80" w:type="dxa"/>
+              <w:right w:w="100" w:type="dxa"/>
+            </w:tcMar>
+            <w:vAlign w:val="center"/>
+          </w:tcPr>
+          <w:p>
+            <w:r>
+              <w:t>Medium</w:t>
+            </w:r>
+          </w:p>
+        </w:tc>
+        <w:tc>
+          <w:tcPr>
+            <w:tcW w:w="878" w:type="dxa"/>
+            <w:tcMar>
+              <w:top w:w="80" w:type="dxa"/>
+              <w:left w:w="100" w:type="dxa"/>
+              <w:bottom w:w="80" w:type="dxa"/>
+              <w:right w:w="100" w:type="dxa"/>
+            </w:tcMar>
+            <w:vAlign w:val="center"/>
+          </w:tcPr>
+          <w:p>
+            <w:r>
+              <w:t>Medium</w:t>
+            </w:r>
+          </w:p>
+        </w:tc>
+        <w:tc>
+          <w:tcPr>
+            <w:tcW w:w="1454" w:type="dxa"/>
+            <w:tcMar>
+              <w:top w:w="80" w:type="dxa"/>
+              <w:left w:w="100" w:type="dxa"/>
+              <w:bottom w:w="80" w:type="dxa"/>
+              <w:right w:w="100" w:type="dxa"/>
+            </w:tcMar>
+            <w:vAlign w:val="center"/>
+          </w:tcPr>
+          <w:p>
+            <w:r>
+              <w:t>Capture team capability as an explicit weighted criterion in Milestone 2 technology decision matrix. Plan a short proof of concept in the meanwhile</w:t>
+            </w:r>
+          </w:p>
+        </w:tc>
+        <w:tc>
+          <w:tcPr>
+            <w:tcW w:w="1198" w:type="dxa"/>
+          </w:tcPr>
+          <w:p>
+            <w:r>
+              <w:t>Fall back to the most familiar stack that would satisfy the requirements even if limitations would need to recategorise to function.</w:t>
+            </w:r>
+          </w:p>
+        </w:tc>
+        <w:tc>
+          <w:tcPr>
+            <w:tcW w:w="1232" w:type="dxa"/>
+            <w:tcMar>
+              <w:top w:w="80" w:type="dxa"/>
+              <w:left w:w="100" w:type="dxa"/>
+              <w:bottom w:w="80" w:type="dxa"/>
+              <w:right w:w="100" w:type="dxa"/>
+            </w:tcMar>
+            <w:vAlign w:val="center"/>
+          </w:tcPr>
+          <w:p>
+            <w:r>
+              <w:t>Entire Team</w:t>
+            </w:r>
+          </w:p>
+        </w:tc>
+        <w:tc>
+          <w:tcPr>
+            <w:tcW w:w="720" w:type="dxa"/>
+            <w:tcMar>
+              <w:top w:w="80" w:type="dxa"/>
+              <w:left w:w="100" w:type="dxa"/>
+              <w:bottom w:w="80" w:type="dxa"/>
+              <w:right w:w="100" w:type="dxa"/>
+            </w:tcMar>
+            <w:vAlign w:val="center"/>
+          </w:tcPr>
+          <w:p>
+            <w:r>
+              <w:t>Open</w:t>
+            </w:r>
+          </w:p>
+        </w:tc>
+      </w:tr>
+      <w:tr>
+        <w:trPr>
+          <w:trHeight w:val="588"/>
+        </w:trPr>
+        <w:tc>
+          <w:tcPr>
+            <w:tcW w:w="786" w:type="dxa"/>
+            <w:tcMar>
+              <w:top w:w="80" w:type="dxa"/>
+              <w:left w:w="100" w:type="dxa"/>
+              <w:bottom w:w="80" w:type="dxa"/>
+              <w:right w:w="100" w:type="dxa"/>
+            </w:tcMar>
+            <w:vAlign w:val="center"/>
+          </w:tcPr>
+          <w:p>
+            <w:r>
+              <w:t>R-005</w:t>
+            </w:r>
+          </w:p>
+        </w:tc>
+        <w:tc>
+          <w:tcPr>
+            <w:tcW w:w="1170" w:type="dxa"/>
+            <w:tcMar>
+              <w:top w:w="80" w:type="dxa"/>
+              <w:left w:w="100" w:type="dxa"/>
+              <w:bottom w:w="80" w:type="dxa"/>
+              <w:right w:w="100" w:type="dxa"/>
+            </w:tcMar>
+            <w:vAlign w:val="center"/>
+          </w:tcPr>
+          <w:p>
+            <w:r>
+              <w:t xml:space="preserve">Additional project features added without careful analysis of assigned </w:t>
+            </w:r>
+            <w:r>
+              <w:lastRenderedPageBreak/>
+              <w:t>consequence.</w:t>
+            </w:r>
+          </w:p>
+        </w:tc>
+        <w:tc>
+          <w:tcPr>
+            <w:tcW w:w="1164" w:type="dxa"/>
+            <w:tcMar>
+              <w:top w:w="80" w:type="dxa"/>
+              <w:left w:w="100" w:type="dxa"/>
+              <w:bottom w:w="80" w:type="dxa"/>
+              <w:right w:w="100" w:type="dxa"/>
+            </w:tcMar>
+            <w:vAlign w:val="center"/>
+          </w:tcPr>
+          <w:p>
+            <w:r>
+              <w:lastRenderedPageBreak/>
+              <w:t xml:space="preserve">Team enthusiasm/ stakeholder demand outpaces set </w:t>
+            </w:r>
+            <w:r>
+              <w:lastRenderedPageBreak/>
+              <w:t xml:space="preserve">controlled change process. </w:t>
+            </w:r>
+          </w:p>
+        </w:tc>
+        <w:tc>
+          <w:tcPr>
+            <w:tcW w:w="1026" w:type="dxa"/>
+            <w:tcMar>
+              <w:top w:w="80" w:type="dxa"/>
+              <w:left w:w="100" w:type="dxa"/>
+              <w:bottom w:w="80" w:type="dxa"/>
+              <w:right w:w="100" w:type="dxa"/>
+            </w:tcMar>
+            <w:vAlign w:val="center"/>
+          </w:tcPr>
+          <w:p>
+            <w:r>
+              <w:lastRenderedPageBreak/>
+              <w:t>Medium</w:t>
+            </w:r>
+          </w:p>
+        </w:tc>
+        <w:tc>
+          <w:tcPr>
+            <w:tcW w:w="878" w:type="dxa"/>
+            <w:tcMar>
+              <w:top w:w="80" w:type="dxa"/>
+              <w:left w:w="100" w:type="dxa"/>
+              <w:bottom w:w="80" w:type="dxa"/>
+              <w:right w:w="100" w:type="dxa"/>
+            </w:tcMar>
+            <w:vAlign w:val="center"/>
+          </w:tcPr>
+          <w:p>
+            <w:r>
+              <w:t>Medium</w:t>
+            </w:r>
+          </w:p>
+        </w:tc>
+        <w:tc>
+          <w:tcPr>
+            <w:tcW w:w="878" w:type="dxa"/>
+            <w:tcMar>
+              <w:top w:w="80" w:type="dxa"/>
+              <w:left w:w="100" w:type="dxa"/>
+              <w:bottom w:w="80" w:type="dxa"/>
+              <w:right w:w="100" w:type="dxa"/>
+            </w:tcMar>
+            <w:vAlign w:val="center"/>
+          </w:tcPr>
+          <w:p>
+            <w:r>
+              <w:t>Medium</w:t>
+            </w:r>
+          </w:p>
+        </w:tc>
+        <w:tc>
+          <w:tcPr>
+            <w:tcW w:w="1454" w:type="dxa"/>
+            <w:tcMar>
+              <w:top w:w="80" w:type="dxa"/>
+              <w:left w:w="100" w:type="dxa"/>
+              <w:bottom w:w="80" w:type="dxa"/>
+              <w:right w:w="100" w:type="dxa"/>
+            </w:tcMar>
+            <w:vAlign w:val="center"/>
+          </w:tcPr>
+          <w:p>
+            <w:r>
+              <w:t xml:space="preserve">Additional features must be tested against a Decision Log with trade-off analysis before they </w:t>
+            </w:r>
+            <w:r>
+              <w:lastRenderedPageBreak/>
+              <w:t>enter project baseline.</w:t>
+            </w:r>
+          </w:p>
+        </w:tc>
+        <w:tc>
+          <w:tcPr>
+            <w:tcW w:w="1198" w:type="dxa"/>
+          </w:tcPr>
+          <w:p>
+            <w:r>
+              <w:lastRenderedPageBreak/>
+              <w:t xml:space="preserve">Reject suggestion or move it to a future scope deadline if it does not meet the </w:t>
+            </w:r>
+            <w:r>
+              <w:lastRenderedPageBreak/>
+              <w:t>current Milestone deadline.</w:t>
+            </w:r>
+          </w:p>
+        </w:tc>
+        <w:tc>
+          <w:tcPr>
+            <w:tcW w:w="1232" w:type="dxa"/>
+            <w:tcMar>
+              <w:top w:w="80" w:type="dxa"/>
+              <w:left w:w="100" w:type="dxa"/>
+              <w:bottom w:w="80" w:type="dxa"/>
+              <w:right w:w="100" w:type="dxa"/>
+            </w:tcMar>
+            <w:vAlign w:val="center"/>
+          </w:tcPr>
+          <w:p>
+            <w:r>
+              <w:lastRenderedPageBreak/>
+              <w:t>Rivan Maritz</w:t>
+            </w:r>
+          </w:p>
+        </w:tc>
+        <w:tc>
+          <w:tcPr>
+            <w:tcW w:w="720" w:type="dxa"/>
+            <w:tcMar>
+              <w:top w:w="80" w:type="dxa"/>
+              <w:left w:w="100" w:type="dxa"/>
+              <w:bottom w:w="80" w:type="dxa"/>
+              <w:right w:w="100" w:type="dxa"/>
+            </w:tcMar>
+            <w:vAlign w:val="center"/>
+          </w:tcPr>
+          <w:p>
+            <w:r>
+              <w:t>Open</w:t>
+            </w:r>
+          </w:p>
+        </w:tc>
+      </w:tr>
+      <w:tr>
+        <w:trPr>
+          <w:trHeight w:val="588"/>
+        </w:trPr>
+        <w:tc>
+          <w:tcPr>
+            <w:tcW w:w="786" w:type="dxa"/>
+            <w:tcMar>
+              <w:top w:w="80" w:type="dxa"/>
+              <w:left w:w="100" w:type="dxa"/>
+              <w:bottom w:w="80" w:type="dxa"/>
+              <w:right w:w="100" w:type="dxa"/>
+            </w:tcMar>
+            <w:vAlign w:val="center"/>
+          </w:tcPr>
+          <w:p>
+            <w:r>
+              <w:t>R-006</w:t>
+            </w:r>
+          </w:p>
+        </w:tc>
+        <w:tc>
+          <w:tcPr>
+            <w:tcW w:w="1170" w:type="dxa"/>
+            <w:tcMar>
+              <w:top w:w="80" w:type="dxa"/>
+              <w:left w:w="100" w:type="dxa"/>
+              <w:bottom w:w="80" w:type="dxa"/>
+              <w:right w:w="100" w:type="dxa"/>
+            </w:tcMar>
+            <w:vAlign w:val="center"/>
+          </w:tcPr>
+          <w:p>
+            <w:r>
+              <w:t>Repository evidence (commits/ issues) is produced in bursts near the deadline instead of progressively throughout the project.</w:t>
+            </w:r>
+          </w:p>
+        </w:tc>
+        <w:tc>
+          <w:tcPr>
+            <w:tcW w:w="1164" w:type="dxa"/>
+            <w:tcMar>
+              <w:top w:w="80" w:type="dxa"/>
+              <w:left w:w="100" w:type="dxa"/>
+              <w:bottom w:w="80" w:type="dxa"/>
+              <w:right w:w="100" w:type="dxa"/>
+            </w:tcMar>
+            <w:vAlign w:val="center"/>
+          </w:tcPr>
+          <w:p>
+            <w:r>
+              <w:t>Pressure from module coursework, assignments, milestone deadlines or real-life duty.</w:t>
+            </w:r>
+          </w:p>
+        </w:tc>
+        <w:tc>
+          <w:tcPr>
+            <w:tcW w:w="1026" w:type="dxa"/>
+            <w:tcMar>
+              <w:top w:w="80" w:type="dxa"/>
+              <w:left w:w="100" w:type="dxa"/>
+              <w:bottom w:w="80" w:type="dxa"/>
+              <w:right w:w="100" w:type="dxa"/>
+            </w:tcMar>
+            <w:vAlign w:val="center"/>
+          </w:tcPr>
+          <w:p>
+            <w:r>
+              <w:t xml:space="preserve">Medium </w:t>
+            </w:r>
+          </w:p>
+        </w:tc>
+        <w:tc>
+          <w:tcPr>
+            <w:tcW w:w="878" w:type="dxa"/>
+            <w:tcMar>
+              <w:top w:w="80" w:type="dxa"/>
+              <w:left w:w="100" w:type="dxa"/>
+              <w:bottom w:w="80" w:type="dxa"/>
+              <w:right w:w="100" w:type="dxa"/>
+            </w:tcMar>
+            <w:vAlign w:val="center"/>
+          </w:tcPr>
+          <w:p>
+            <w:r>
+              <w:t>High</w:t>
+            </w:r>
+          </w:p>
+        </w:tc>
+        <w:tc>
+          <w:tcPr>
+            <w:tcW w:w="878" w:type="dxa"/>
+            <w:tcMar>
+              <w:top w:w="80" w:type="dxa"/>
+              <w:left w:w="100" w:type="dxa"/>
+              <w:bottom w:w="80" w:type="dxa"/>
+              <w:right w:w="100" w:type="dxa"/>
+            </w:tcMar>
+            <w:vAlign w:val="center"/>
+          </w:tcPr>
+          <w:p>
+            <w:r>
+              <w:t>High</w:t>
+            </w:r>
+          </w:p>
+        </w:tc>
+        <w:tc>
+          <w:tcPr>
+            <w:tcW w:w="1454" w:type="dxa"/>
+            <w:tcMar>
+              <w:top w:w="80" w:type="dxa"/>
+              <w:left w:w="100" w:type="dxa"/>
+              <w:bottom w:w="80" w:type="dxa"/>
+              <w:right w:w="100" w:type="dxa"/>
+            </w:tcMar>
+            <w:vAlign w:val="center"/>
+          </w:tcPr>
+          <w:p>
+            <w:r>
+              <w:t>Weekly commit as outlined in Team Working Agreement that is facilitated at each team meeting.</w:t>
+            </w:r>
+          </w:p>
+        </w:tc>
+        <w:tc>
+          <w:tcPr>
+            <w:tcW w:w="1198" w:type="dxa"/>
+          </w:tcPr>
+          <w:p/>
+          <w:p/>
+          <w:p>
+            <w:r>
+              <w:t>Notify lecturer if a team member falls behind to set an intervention.</w:t>
+            </w:r>
+          </w:p>
+        </w:tc>
+        <w:tc>
+          <w:tcPr>
+            <w:tcW w:w="1232" w:type="dxa"/>
+            <w:tcMar>
+              <w:top w:w="80" w:type="dxa"/>
+              <w:left w:w="100" w:type="dxa"/>
+              <w:bottom w:w="80" w:type="dxa"/>
+              <w:right w:w="100" w:type="dxa"/>
+            </w:tcMar>
+            <w:vAlign w:val="center"/>
+          </w:tcPr>
+          <w:p>
+            <w:r>
+              <w:t>Nicholas Armin Vronka</w:t>
+            </w:r>
+          </w:p>
+        </w:tc>
+        <w:tc>
+          <w:tcPr>
+            <w:tcW w:w="720" w:type="dxa"/>
+            <w:tcMar>
+              <w:top w:w="80" w:type="dxa"/>
+              <w:left w:w="100" w:type="dxa"/>
+              <w:bottom w:w="80" w:type="dxa"/>
+              <w:right w:w="100" w:type="dxa"/>
+            </w:tcMar>
+            <w:vAlign w:val="center"/>
+          </w:tcPr>
+          <w:p>
+            <w:r>
+              <w:t>Open</w:t>
+            </w:r>
+          </w:p>
+        </w:tc>
+      </w:tr>
+      <w:tr>
+        <w:trPr>
+          <w:trHeight w:val="588"/>
+        </w:trPr>
+        <w:tc>
+          <w:tcPr>
+            <w:tcW w:w="786" w:type="dxa"/>
+            <w:tcMar>
+              <w:top w:w="80" w:type="dxa"/>
+              <w:left w:w="100" w:type="dxa"/>
+              <w:bottom w:w="80" w:type="dxa"/>
+              <w:right w:w="100" w:type="dxa"/>
+            </w:tcMar>
+            <w:vAlign w:val="center"/>
+          </w:tcPr>
+          <w:p>
+            <w:r>
+              <w:t>R-007</w:t>
+            </w:r>
+          </w:p>
+        </w:tc>
+        <w:tc>
+          <w:tcPr>
+            <w:tcW w:w="1170" w:type="dxa"/>
+            <w:tcMar>
+              <w:top w:w="80" w:type="dxa"/>
+              <w:left w:w="100" w:type="dxa"/>
+              <w:bottom w:w="80" w:type="dxa"/>
+              <w:right w:w="100" w:type="dxa"/>
+            </w:tcMar>
+            <w:vAlign w:val="center"/>
+          </w:tcPr>
+          <w:p>
+            <w:r>
+              <w:t>AI-assisted work, code or functions are accepted into project baseline without adequate human verification conducted to ensure quality and correctness of work</w:t>
+            </w:r>
+          </w:p>
+        </w:tc>
+        <w:tc>
+          <w:tcPr>
+            <w:tcW w:w="1164" w:type="dxa"/>
+            <w:tcMar>
+              <w:top w:w="80" w:type="dxa"/>
+              <w:left w:w="100" w:type="dxa"/>
+              <w:bottom w:w="80" w:type="dxa"/>
+              <w:right w:w="100" w:type="dxa"/>
+            </w:tcMar>
+            <w:vAlign w:val="center"/>
+          </w:tcPr>
+          <w:p>
+            <w:r>
+              <w:t>Time pressure, comprehension failure of project requirements or lack of interest promote lax standards of AI output</w:t>
+            </w:r>
+          </w:p>
+        </w:tc>
+        <w:tc>
+          <w:tcPr>
+            <w:tcW w:w="1026" w:type="dxa"/>
+            <w:tcMar>
+              <w:top w:w="80" w:type="dxa"/>
+              <w:left w:w="100" w:type="dxa"/>
+              <w:bottom w:w="80" w:type="dxa"/>
+              <w:right w:w="100" w:type="dxa"/>
+            </w:tcMar>
+            <w:vAlign w:val="center"/>
+          </w:tcPr>
+          <w:p>
+            <w:r>
+              <w:t>Medium</w:t>
+            </w:r>
+          </w:p>
+        </w:tc>
+        <w:tc>
+          <w:tcPr>
+            <w:tcW w:w="878" w:type="dxa"/>
+            <w:tcMar>
+              <w:top w:w="80" w:type="dxa"/>
+              <w:left w:w="100" w:type="dxa"/>
+              <w:bottom w:w="80" w:type="dxa"/>
+              <w:right w:w="100" w:type="dxa"/>
+            </w:tcMar>
+            <w:vAlign w:val="center"/>
+          </w:tcPr>
+          <w:p>
+            <w:r>
+              <w:t>Medium</w:t>
+            </w:r>
+          </w:p>
+        </w:tc>
+        <w:tc>
+          <w:tcPr>
+            <w:tcW w:w="878" w:type="dxa"/>
+            <w:tcMar>
+              <w:top w:w="80" w:type="dxa"/>
+              <w:left w:w="100" w:type="dxa"/>
+              <w:bottom w:w="80" w:type="dxa"/>
+              <w:right w:w="100" w:type="dxa"/>
+            </w:tcMar>
+            <w:vAlign w:val="center"/>
+          </w:tcPr>
+          <w:p>
+            <w:r>
+              <w:t>Medium</w:t>
+            </w:r>
+          </w:p>
+        </w:tc>
+        <w:tc>
+          <w:tcPr>
+            <w:tcW w:w="1454" w:type="dxa"/>
+            <w:tcMar>
+              <w:top w:w="80" w:type="dxa"/>
+              <w:left w:w="100" w:type="dxa"/>
+              <w:bottom w:w="80" w:type="dxa"/>
+              <w:right w:w="100" w:type="dxa"/>
+            </w:tcMar>
+            <w:vAlign w:val="center"/>
+          </w:tcPr>
+          <w:p>
+            <w:r>
+              <w:t>Every AI contribution will need an AI Usage Register entry created and a recorded verification step to be fulfilled before implementation.</w:t>
+            </w:r>
+          </w:p>
+        </w:tc>
+        <w:tc>
+          <w:tcPr>
+            <w:tcW w:w="1198" w:type="dxa"/>
+          </w:tcPr>
+          <w:p>
+            <w:r>
+              <w:t>Flagged items are to be reworked and reverified before they can be added in the next baseline, any content unverified will be removed.</w:t>
+            </w:r>
+          </w:p>
+        </w:tc>
+        <w:tc>
+          <w:tcPr>
+            <w:tcW w:w="1232" w:type="dxa"/>
+            <w:tcMar>
+              <w:top w:w="80" w:type="dxa"/>
+              <w:left w:w="100" w:type="dxa"/>
+              <w:bottom w:w="80" w:type="dxa"/>
+              <w:right w:w="100" w:type="dxa"/>
+            </w:tcMar>
+            <w:vAlign w:val="center"/>
+          </w:tcPr>
+          <w:p>
+            <w:r>
+              <w:t>Rivan Maritz</w:t>
+            </w:r>
+          </w:p>
+        </w:tc>
+        <w:tc>
+          <w:tcPr>
+            <w:tcW w:w="720" w:type="dxa"/>
+            <w:tcMar>
+              <w:top w:w="80" w:type="dxa"/>
+              <w:left w:w="100" w:type="dxa"/>
+              <w:bottom w:w="80" w:type="dxa"/>
+              <w:right w:w="100" w:type="dxa"/>
+            </w:tcMar>
+            <w:vAlign w:val="center"/>
+          </w:tcPr>
+          <w:p>
+            <w:r>
+              <w:t>Open</w:t>
+            </w:r>
+          </w:p>
         </w:tc>
       </w:tr>
     </w:tbl>
@@ -6882,7 +7701,8 @@
     </w:p>
     <w:tbl>
       <w:tblPr>
-        <w:tblW w:w="10100" w:type="dxa"/>
+        <w:tblW w:w="10641" w:type="dxa"/>
+        <w:tblInd w:w="-905" w:type="dxa"/>
         <w:tblBorders>
           <w:top w:val="single" w:sz="4" w:space="0" w:color="auto"/>
           <w:left w:val="single" w:sz="4" w:space="0" w:color="auto"/>
@@ -6891,6 +7711,7 @@
           <w:insideH w:val="single" w:sz="4" w:space="0" w:color="auto"/>
           <w:insideV w:val="single" w:sz="4" w:space="0" w:color="auto"/>
         </w:tblBorders>
+        <w:tblLayout w:type="fixed"/>
         <w:tblCellMar>
           <w:left w:w="10" w:type="dxa"/>
           <w:right w:w="10" w:type="dxa"/>
@@ -6898,20 +7719,24 @@
         <w:tblLook w:val="0000" w:firstRow="0" w:lastRow="0" w:firstColumn="0" w:lastColumn="0" w:noHBand="0" w:noVBand="0"/>
       </w:tblPr>
       <w:tblGrid>
-        <w:gridCol w:w="1100"/>
-        <w:gridCol w:w="1800"/>
-        <w:gridCol w:w="2000"/>
-        <w:gridCol w:w="1600"/>
-        <w:gridCol w:w="2200"/>
-        <w:gridCol w:w="1400"/>
+        <w:gridCol w:w="990"/>
+        <w:gridCol w:w="1311"/>
+        <w:gridCol w:w="1098"/>
+        <w:gridCol w:w="1421"/>
+        <w:gridCol w:w="1421"/>
+        <w:gridCol w:w="1278"/>
+        <w:gridCol w:w="671"/>
+        <w:gridCol w:w="1260"/>
+        <w:gridCol w:w="1191"/>
       </w:tblGrid>
       <w:tr>
         <w:trPr>
+          <w:trHeight w:val="548"/>
           <w:tblHeader/>
         </w:trPr>
         <w:tc>
           <w:tcPr>
-            <w:tcW w:w="1100" w:type="dxa"/>
+            <w:tcW w:w="990" w:type="dxa"/>
             <w:shd w:val="clear" w:color="auto" w:fill="1F4E5F"/>
             <w:tcMar>
               <w:top w:w="80" w:type="dxa"/>
@@ -6936,7 +7761,7 @@
         </w:tc>
         <w:tc>
           <w:tcPr>
-            <w:tcW w:w="1800" w:type="dxa"/>
+            <w:tcW w:w="1311" w:type="dxa"/>
             <w:shd w:val="clear" w:color="auto" w:fill="1F4E5F"/>
             <w:tcMar>
               <w:top w:w="80" w:type="dxa"/>
@@ -6961,7 +7786,34 @@
         </w:tc>
         <w:tc>
           <w:tcPr>
-            <w:tcW w:w="2000" w:type="dxa"/>
+            <w:tcW w:w="1098" w:type="dxa"/>
+            <w:shd w:val="clear" w:color="auto" w:fill="1F4E5F"/>
+          </w:tcPr>
+          <w:p>
+            <w:pPr>
+              <w:rPr>
+                <w:b/>
+                <w:bCs/>
+                <w:color w:val="FFFFFF"/>
+                <w:sz w:val="20"/>
+                <w:szCs w:val="20"/>
+              </w:rPr>
+            </w:pPr>
+            <w:r>
+              <w:rPr>
+                <w:b/>
+                <w:bCs/>
+                <w:color w:val="FFFFFF"/>
+                <w:sz w:val="20"/>
+                <w:szCs w:val="20"/>
+              </w:rPr>
+              <w:t>Project Constraints</w:t>
+            </w:r>
+          </w:p>
+        </w:tc>
+        <w:tc>
+          <w:tcPr>
+            <w:tcW w:w="1421" w:type="dxa"/>
             <w:shd w:val="clear" w:color="auto" w:fill="1F4E5F"/>
             <w:tcMar>
               <w:top w:w="80" w:type="dxa"/>
@@ -6986,7 +7838,7 @@
         </w:tc>
         <w:tc>
           <w:tcPr>
-            <w:tcW w:w="1600" w:type="dxa"/>
+            <w:tcW w:w="1421" w:type="dxa"/>
             <w:shd w:val="clear" w:color="auto" w:fill="1F4E5F"/>
             <w:tcMar>
               <w:top w:w="80" w:type="dxa"/>
@@ -7011,7 +7863,7 @@
         </w:tc>
         <w:tc>
           <w:tcPr>
-            <w:tcW w:w="2200" w:type="dxa"/>
+            <w:tcW w:w="1278" w:type="dxa"/>
             <w:shd w:val="clear" w:color="auto" w:fill="1F4E5F"/>
             <w:tcMar>
               <w:top w:w="80" w:type="dxa"/>
@@ -7036,7 +7888,34 @@
         </w:tc>
         <w:tc>
           <w:tcPr>
-            <w:tcW w:w="1400" w:type="dxa"/>
+            <w:tcW w:w="671" w:type="dxa"/>
+            <w:shd w:val="clear" w:color="auto" w:fill="1F4E5F"/>
+          </w:tcPr>
+          <w:p>
+            <w:pPr>
+              <w:rPr>
+                <w:b/>
+                <w:bCs/>
+                <w:color w:val="FFFFFF"/>
+                <w:sz w:val="20"/>
+                <w:szCs w:val="20"/>
+              </w:rPr>
+            </w:pPr>
+            <w:r>
+              <w:rPr>
+                <w:b/>
+                <w:bCs/>
+                <w:color w:val="FFFFFF"/>
+                <w:sz w:val="20"/>
+                <w:szCs w:val="20"/>
+              </w:rPr>
+              <w:t>Outlined Risks</w:t>
+            </w:r>
+          </w:p>
+        </w:tc>
+        <w:tc>
+          <w:tcPr>
+            <w:tcW w:w="1260" w:type="dxa"/>
             <w:shd w:val="clear" w:color="auto" w:fill="1F4E5F"/>
             <w:tcMar>
               <w:top w:w="80" w:type="dxa"/>
@@ -7059,254 +7938,972 @@
             </w:r>
           </w:p>
         </w:tc>
+        <w:tc>
+          <w:tcPr>
+            <w:tcW w:w="1191" w:type="dxa"/>
+            <w:shd w:val="clear" w:color="auto" w:fill="1F4E5F"/>
+          </w:tcPr>
+          <w:p>
+            <w:pPr>
+              <w:rPr>
+                <w:b/>
+                <w:bCs/>
+                <w:color w:val="FFFFFF"/>
+                <w:sz w:val="20"/>
+                <w:szCs w:val="20"/>
+              </w:rPr>
+            </w:pPr>
+            <w:r>
+              <w:rPr>
+                <w:b/>
+                <w:bCs/>
+                <w:color w:val="FFFFFF"/>
+                <w:sz w:val="20"/>
+                <w:szCs w:val="20"/>
+              </w:rPr>
+              <w:t>Later Consequences</w:t>
+            </w:r>
+          </w:p>
+        </w:tc>
       </w:tr>
       <w:tr>
         <w:trPr>
-          <w:trHeight w:val="700"/>
+          <w:trHeight w:val="800"/>
         </w:trPr>
         <w:tc>
           <w:tcPr>
-            <w:tcW w:w="1100" w:type="dxa"/>
-            <w:tcMar>
-              <w:top w:w="80" w:type="dxa"/>
-              <w:left w:w="100" w:type="dxa"/>
-              <w:bottom w:w="80" w:type="dxa"/>
-              <w:right w:w="100" w:type="dxa"/>
-            </w:tcMar>
-            <w:vAlign w:val="center"/>
-          </w:tcPr>
-          <w:p/>
-        </w:tc>
-        <w:tc>
-          <w:tcPr>
-            <w:tcW w:w="1800" w:type="dxa"/>
-            <w:tcMar>
-              <w:top w:w="80" w:type="dxa"/>
-              <w:left w:w="100" w:type="dxa"/>
-              <w:bottom w:w="80" w:type="dxa"/>
-              <w:right w:w="100" w:type="dxa"/>
-            </w:tcMar>
-            <w:vAlign w:val="center"/>
-          </w:tcPr>
-          <w:p/>
-        </w:tc>
-        <w:tc>
-          <w:tcPr>
-            <w:tcW w:w="2000" w:type="dxa"/>
-            <w:tcMar>
-              <w:top w:w="80" w:type="dxa"/>
-              <w:left w:w="100" w:type="dxa"/>
-              <w:bottom w:w="80" w:type="dxa"/>
-              <w:right w:w="100" w:type="dxa"/>
-            </w:tcMar>
-            <w:vAlign w:val="center"/>
-          </w:tcPr>
-          <w:p/>
-        </w:tc>
-        <w:tc>
-          <w:tcPr>
-            <w:tcW w:w="1600" w:type="dxa"/>
-            <w:tcMar>
-              <w:top w:w="80" w:type="dxa"/>
-              <w:left w:w="100" w:type="dxa"/>
-              <w:bottom w:w="80" w:type="dxa"/>
-              <w:right w:w="100" w:type="dxa"/>
-            </w:tcMar>
-            <w:vAlign w:val="center"/>
-          </w:tcPr>
-          <w:p/>
-        </w:tc>
-        <w:tc>
-          <w:tcPr>
-            <w:tcW w:w="2200" w:type="dxa"/>
-            <w:tcMar>
-              <w:top w:w="80" w:type="dxa"/>
-              <w:left w:w="100" w:type="dxa"/>
-              <w:bottom w:w="80" w:type="dxa"/>
-              <w:right w:w="100" w:type="dxa"/>
-            </w:tcMar>
-            <w:vAlign w:val="center"/>
-          </w:tcPr>
-          <w:p/>
-        </w:tc>
-        <w:tc>
-          <w:tcPr>
-            <w:tcW w:w="1400" w:type="dxa"/>
-            <w:tcMar>
-              <w:top w:w="80" w:type="dxa"/>
-              <w:left w:w="100" w:type="dxa"/>
-              <w:bottom w:w="80" w:type="dxa"/>
-              <w:right w:w="100" w:type="dxa"/>
-            </w:tcMar>
-            <w:vAlign w:val="center"/>
-          </w:tcPr>
-          <w:p/>
+            <w:tcW w:w="990" w:type="dxa"/>
+            <w:tcMar>
+              <w:top w:w="80" w:type="dxa"/>
+              <w:left w:w="100" w:type="dxa"/>
+              <w:bottom w:w="80" w:type="dxa"/>
+              <w:right w:w="100" w:type="dxa"/>
+            </w:tcMar>
+            <w:vAlign w:val="center"/>
+          </w:tcPr>
+          <w:p>
+            <w:r>
+              <w:t>ED-001</w:t>
+            </w:r>
+          </w:p>
+        </w:tc>
+        <w:tc>
+          <w:tcPr>
+            <w:tcW w:w="1311" w:type="dxa"/>
+            <w:tcMar>
+              <w:top w:w="80" w:type="dxa"/>
+              <w:left w:w="100" w:type="dxa"/>
+              <w:bottom w:w="80" w:type="dxa"/>
+              <w:right w:w="100" w:type="dxa"/>
+            </w:tcMar>
+            <w:vAlign w:val="center"/>
+          </w:tcPr>
+          <w:p>
+            <w:r>
+              <w:t>Milestone 1 explicitly excludes the finalised technology-stack selected but the team will need to plan for that later.</w:t>
+            </w:r>
+          </w:p>
+        </w:tc>
+        <w:tc>
+          <w:tcPr>
+            <w:tcW w:w="1098" w:type="dxa"/>
+          </w:tcPr>
+          <w:p>
+            <w:r>
+              <w:t>The schedule of fixed milestones, team capability not properly assessed, unknown security ecosystem added with requirements not matching project baseline.</w:t>
+            </w:r>
+          </w:p>
+        </w:tc>
+        <w:tc>
+          <w:tcPr>
+            <w:tcW w:w="1421" w:type="dxa"/>
+            <w:tcMar>
+              <w:top w:w="80" w:type="dxa"/>
+              <w:left w:w="100" w:type="dxa"/>
+              <w:bottom w:w="80" w:type="dxa"/>
+              <w:right w:w="100" w:type="dxa"/>
+            </w:tcMar>
+            <w:vAlign w:val="center"/>
+          </w:tcPr>
+          <w:p>
+            <w:r>
+              <w:t>A: Pick a familiar stack to get in “early progress” to show planning.</w:t>
+            </w:r>
+          </w:p>
+          <w:p>
+            <w:r>
+              <w:t>B: Formally pre-agree on evaluation criteria.</w:t>
+            </w:r>
+          </w:p>
+        </w:tc>
+        <w:tc>
+          <w:tcPr>
+            <w:tcW w:w="1421" w:type="dxa"/>
+            <w:tcMar>
+              <w:top w:w="80" w:type="dxa"/>
+              <w:left w:w="100" w:type="dxa"/>
+              <w:bottom w:w="80" w:type="dxa"/>
+              <w:right w:w="100" w:type="dxa"/>
+            </w:tcMar>
+            <w:vAlign w:val="center"/>
+          </w:tcPr>
+          <w:p>
+            <w:r>
+              <w:t>Defer the tech-stack selection to Milestone 2, record criteria now (requirement fit, team capability, security, cost, deployment capability).</w:t>
+            </w:r>
+          </w:p>
+        </w:tc>
+        <w:tc>
+          <w:tcPr>
+            <w:tcW w:w="1278" w:type="dxa"/>
+            <w:tcMar>
+              <w:top w:w="80" w:type="dxa"/>
+              <w:left w:w="100" w:type="dxa"/>
+              <w:bottom w:w="80" w:type="dxa"/>
+              <w:right w:w="100" w:type="dxa"/>
+            </w:tcMar>
+            <w:vAlign w:val="center"/>
+          </w:tcPr>
+          <w:p>
+            <w:r>
+              <w:t>Choosing early could risk locking the project into unsuitable or unusable technology before requirements are outlined properly.</w:t>
+            </w:r>
+          </w:p>
+          <w:p>
+            <w:r>
+              <w:t>Trade-off: no early code no risks at this stage.</w:t>
+            </w:r>
+          </w:p>
+        </w:tc>
+        <w:tc>
+          <w:tcPr>
+            <w:tcW w:w="671" w:type="dxa"/>
+          </w:tcPr>
+          <w:p>
+            <w:pPr>
+              <w:jc w:val="center"/>
+            </w:pPr>
+          </w:p>
+          <w:p>
+            <w:pPr>
+              <w:jc w:val="center"/>
+            </w:pPr>
+          </w:p>
+          <w:p>
+            <w:pPr>
+              <w:jc w:val="center"/>
+            </w:pPr>
+          </w:p>
+          <w:p>
+            <w:pPr>
+              <w:jc w:val="center"/>
+            </w:pPr>
+          </w:p>
+          <w:p>
+            <w:pPr>
+              <w:jc w:val="center"/>
+            </w:pPr>
+          </w:p>
+          <w:p>
+            <w:pPr>
+              <w:jc w:val="center"/>
+            </w:pPr>
+          </w:p>
+          <w:p>
+            <w:pPr>
+              <w:jc w:val="center"/>
+            </w:pPr>
+          </w:p>
+          <w:p>
+            <w:pPr>
+              <w:jc w:val="center"/>
+            </w:pPr>
+          </w:p>
+          <w:p>
+            <w:pPr>
+              <w:jc w:val="center"/>
+            </w:pPr>
+            <w:r>
+              <w:t>R-004</w:t>
+            </w:r>
+          </w:p>
+        </w:tc>
+        <w:tc>
+          <w:tcPr>
+            <w:tcW w:w="1260" w:type="dxa"/>
+            <w:tcMar>
+              <w:top w:w="80" w:type="dxa"/>
+              <w:left w:w="100" w:type="dxa"/>
+              <w:bottom w:w="80" w:type="dxa"/>
+              <w:right w:w="100" w:type="dxa"/>
+            </w:tcMar>
+            <w:vAlign w:val="center"/>
+          </w:tcPr>
+          <w:p>
+            <w:r>
+              <w:t>PE3D Forward Engineering Consideration section.</w:t>
+            </w:r>
+          </w:p>
+        </w:tc>
+        <w:tc>
+          <w:tcPr>
+            <w:tcW w:w="1191" w:type="dxa"/>
+          </w:tcPr>
+          <w:p/>
+          <w:p/>
+          <w:p/>
+          <w:p/>
+          <w:p/>
+          <w:p>
+            <w:r>
+              <w:t>To be finalised with an ADR at Milestone 2 once stack is selected.</w:t>
+            </w:r>
+          </w:p>
         </w:tc>
       </w:tr>
       <w:tr>
         <w:trPr>
-          <w:trHeight w:val="700"/>
+          <w:trHeight w:val="800"/>
         </w:trPr>
         <w:tc>
           <w:tcPr>
-            <w:tcW w:w="1100" w:type="dxa"/>
-            <w:tcMar>
-              <w:top w:w="80" w:type="dxa"/>
-              <w:left w:w="100" w:type="dxa"/>
-              <w:bottom w:w="80" w:type="dxa"/>
-              <w:right w:w="100" w:type="dxa"/>
-            </w:tcMar>
-            <w:vAlign w:val="center"/>
-          </w:tcPr>
-          <w:p/>
-        </w:tc>
-        <w:tc>
-          <w:tcPr>
-            <w:tcW w:w="1800" w:type="dxa"/>
-            <w:tcMar>
-              <w:top w:w="80" w:type="dxa"/>
-              <w:left w:w="100" w:type="dxa"/>
-              <w:bottom w:w="80" w:type="dxa"/>
-              <w:right w:w="100" w:type="dxa"/>
-            </w:tcMar>
-            <w:vAlign w:val="center"/>
-          </w:tcPr>
-          <w:p/>
-        </w:tc>
-        <w:tc>
-          <w:tcPr>
-            <w:tcW w:w="2000" w:type="dxa"/>
-            <w:tcMar>
-              <w:top w:w="80" w:type="dxa"/>
-              <w:left w:w="100" w:type="dxa"/>
-              <w:bottom w:w="80" w:type="dxa"/>
-              <w:right w:w="100" w:type="dxa"/>
-            </w:tcMar>
-            <w:vAlign w:val="center"/>
-          </w:tcPr>
-          <w:p/>
-        </w:tc>
-        <w:tc>
-          <w:tcPr>
-            <w:tcW w:w="1600" w:type="dxa"/>
-            <w:tcMar>
-              <w:top w:w="80" w:type="dxa"/>
-              <w:left w:w="100" w:type="dxa"/>
-              <w:bottom w:w="80" w:type="dxa"/>
-              <w:right w:w="100" w:type="dxa"/>
-            </w:tcMar>
-            <w:vAlign w:val="center"/>
-          </w:tcPr>
-          <w:p/>
-        </w:tc>
-        <w:tc>
-          <w:tcPr>
-            <w:tcW w:w="2200" w:type="dxa"/>
-            <w:tcMar>
-              <w:top w:w="80" w:type="dxa"/>
-              <w:left w:w="100" w:type="dxa"/>
-              <w:bottom w:w="80" w:type="dxa"/>
-              <w:right w:w="100" w:type="dxa"/>
-            </w:tcMar>
-            <w:vAlign w:val="center"/>
-          </w:tcPr>
-          <w:p/>
-        </w:tc>
-        <w:tc>
-          <w:tcPr>
-            <w:tcW w:w="1400" w:type="dxa"/>
-            <w:tcMar>
-              <w:top w:w="80" w:type="dxa"/>
-              <w:left w:w="100" w:type="dxa"/>
-              <w:bottom w:w="80" w:type="dxa"/>
-              <w:right w:w="100" w:type="dxa"/>
-            </w:tcMar>
-            <w:vAlign w:val="center"/>
-          </w:tcPr>
-          <w:p/>
+            <w:tcW w:w="990" w:type="dxa"/>
+            <w:tcMar>
+              <w:top w:w="80" w:type="dxa"/>
+              <w:left w:w="100" w:type="dxa"/>
+              <w:bottom w:w="80" w:type="dxa"/>
+              <w:right w:w="100" w:type="dxa"/>
+            </w:tcMar>
+            <w:vAlign w:val="center"/>
+          </w:tcPr>
+          <w:p>
+            <w:r>
+              <w:t>ED-002</w:t>
+            </w:r>
+          </w:p>
+        </w:tc>
+        <w:tc>
+          <w:tcPr>
+            <w:tcW w:w="1311" w:type="dxa"/>
+            <w:tcMar>
+              <w:top w:w="80" w:type="dxa"/>
+              <w:left w:w="100" w:type="dxa"/>
+              <w:bottom w:w="80" w:type="dxa"/>
+              <w:right w:w="100" w:type="dxa"/>
+            </w:tcMar>
+            <w:vAlign w:val="center"/>
+          </w:tcPr>
+          <w:p>
+            <w:r>
+              <w:t>The brief states that there must be a protected-main and mandatory two-reviewer approval at the start of the project work, not just once the coding has begun.</w:t>
+            </w:r>
+          </w:p>
+        </w:tc>
+        <w:tc>
+          <w:tcPr>
+            <w:tcW w:w="1098" w:type="dxa"/>
+          </w:tcPr>
+          <w:p>
+            <w:r>
+              <w:t xml:space="preserve">3-person project team means every project requirement demands full team engagement as there will always be 1 author and 2 reviewers. </w:t>
+            </w:r>
+          </w:p>
+        </w:tc>
+        <w:tc>
+          <w:tcPr>
+            <w:tcW w:w="1421" w:type="dxa"/>
+            <w:tcMar>
+              <w:top w:w="80" w:type="dxa"/>
+              <w:left w:w="100" w:type="dxa"/>
+              <w:bottom w:w="80" w:type="dxa"/>
+              <w:right w:w="100" w:type="dxa"/>
+            </w:tcMar>
+            <w:vAlign w:val="center"/>
+          </w:tcPr>
+          <w:p>
+            <w:r>
+              <w:t>A: Apply proper governance only once construction of project begins (Milestone 2/3).</w:t>
+            </w:r>
+          </w:p>
+          <w:p>
+            <w:r>
+              <w:t>B: Apply this from the first Milestone 1 commit, covering documentation as well.</w:t>
+            </w:r>
+          </w:p>
+        </w:tc>
+        <w:tc>
+          <w:tcPr>
+            <w:tcW w:w="1421" w:type="dxa"/>
+            <w:tcMar>
+              <w:top w:w="80" w:type="dxa"/>
+              <w:left w:w="100" w:type="dxa"/>
+              <w:bottom w:w="80" w:type="dxa"/>
+              <w:right w:w="100" w:type="dxa"/>
+            </w:tcMar>
+            <w:vAlign w:val="center"/>
+          </w:tcPr>
+          <w:p>
+            <w:r>
+              <w:t>Enable branch protection and the 2-reviewer rule from day 1 of Milestone 1. Applied to code, registers and documentation</w:t>
+            </w:r>
+          </w:p>
+        </w:tc>
+        <w:tc>
+          <w:tcPr>
+            <w:tcW w:w="1278" w:type="dxa"/>
+            <w:tcMar>
+              <w:top w:w="80" w:type="dxa"/>
+              <w:left w:w="100" w:type="dxa"/>
+              <w:bottom w:w="80" w:type="dxa"/>
+              <w:right w:w="100" w:type="dxa"/>
+            </w:tcMar>
+            <w:vAlign w:val="center"/>
+          </w:tcPr>
+          <w:p>
+            <w:r>
+              <w:t xml:space="preserve">GitHub is an </w:t>
+            </w:r>
+            <w:r>
+              <w:t>"an engineering control and evidence environment, not merely the place where final code is uploaded"</w:t>
+            </w:r>
+            <w:r>
+              <w:t>.</w:t>
+            </w:r>
+          </w:p>
+          <w:p>
+            <w:r>
+              <w:t>Trade-off: Slow early document iteration for history.</w:t>
+            </w:r>
+          </w:p>
+        </w:tc>
+        <w:tc>
+          <w:tcPr>
+            <w:tcW w:w="671" w:type="dxa"/>
+          </w:tcPr>
+          <w:p/>
+          <w:p/>
+          <w:p/>
+          <w:p/>
+          <w:p/>
+          <w:p/>
+          <w:p/>
+          <w:p/>
+          <w:p>
+            <w:r>
+              <w:t>R-002</w:t>
+            </w:r>
+          </w:p>
+        </w:tc>
+        <w:tc>
+          <w:tcPr>
+            <w:tcW w:w="1260" w:type="dxa"/>
+            <w:tcMar>
+              <w:top w:w="80" w:type="dxa"/>
+              <w:left w:w="100" w:type="dxa"/>
+              <w:bottom w:w="80" w:type="dxa"/>
+              <w:right w:w="100" w:type="dxa"/>
+            </w:tcMar>
+            <w:vAlign w:val="center"/>
+          </w:tcPr>
+          <w:p>
+            <w:r>
+              <w:t>Repository branch protection settings.</w:t>
+            </w:r>
+          </w:p>
+        </w:tc>
+        <w:tc>
+          <w:tcPr>
+            <w:tcW w:w="1191" w:type="dxa"/>
+          </w:tcPr>
+          <w:p/>
+          <w:p/>
+          <w:p/>
+          <w:p/>
+          <w:p/>
+          <w:p/>
+          <w:p>
+            <w:r>
+              <w:t>Reviewed once Milestone 2 has begun.</w:t>
+            </w:r>
+          </w:p>
         </w:tc>
       </w:tr>
       <w:tr>
         <w:trPr>
-          <w:trHeight w:val="700"/>
+          <w:trHeight w:val="800"/>
         </w:trPr>
         <w:tc>
           <w:tcPr>
-            <w:tcW w:w="1100" w:type="dxa"/>
-            <w:tcMar>
-              <w:top w:w="80" w:type="dxa"/>
-              <w:left w:w="100" w:type="dxa"/>
-              <w:bottom w:w="80" w:type="dxa"/>
-              <w:right w:w="100" w:type="dxa"/>
-            </w:tcMar>
-            <w:vAlign w:val="center"/>
-          </w:tcPr>
-          <w:p/>
-        </w:tc>
-        <w:tc>
-          <w:tcPr>
-            <w:tcW w:w="1800" w:type="dxa"/>
-            <w:tcMar>
-              <w:top w:w="80" w:type="dxa"/>
-              <w:left w:w="100" w:type="dxa"/>
-              <w:bottom w:w="80" w:type="dxa"/>
-              <w:right w:w="100" w:type="dxa"/>
-            </w:tcMar>
-            <w:vAlign w:val="center"/>
-          </w:tcPr>
-          <w:p/>
-        </w:tc>
-        <w:tc>
-          <w:tcPr>
-            <w:tcW w:w="2000" w:type="dxa"/>
-            <w:tcMar>
-              <w:top w:w="80" w:type="dxa"/>
-              <w:left w:w="100" w:type="dxa"/>
-              <w:bottom w:w="80" w:type="dxa"/>
-              <w:right w:w="100" w:type="dxa"/>
-            </w:tcMar>
-            <w:vAlign w:val="center"/>
-          </w:tcPr>
-          <w:p/>
-        </w:tc>
-        <w:tc>
-          <w:tcPr>
-            <w:tcW w:w="1600" w:type="dxa"/>
-            <w:tcMar>
-              <w:top w:w="80" w:type="dxa"/>
-              <w:left w:w="100" w:type="dxa"/>
-              <w:bottom w:w="80" w:type="dxa"/>
-              <w:right w:w="100" w:type="dxa"/>
-            </w:tcMar>
-            <w:vAlign w:val="center"/>
-          </w:tcPr>
-          <w:p/>
-        </w:tc>
-        <w:tc>
-          <w:tcPr>
-            <w:tcW w:w="2200" w:type="dxa"/>
-            <w:tcMar>
-              <w:top w:w="80" w:type="dxa"/>
-              <w:left w:w="100" w:type="dxa"/>
-              <w:bottom w:w="80" w:type="dxa"/>
-              <w:right w:w="100" w:type="dxa"/>
-            </w:tcMar>
-            <w:vAlign w:val="center"/>
-          </w:tcPr>
-          <w:p/>
-        </w:tc>
-        <w:tc>
-          <w:tcPr>
-            <w:tcW w:w="1400" w:type="dxa"/>
-            <w:tcMar>
-              <w:top w:w="80" w:type="dxa"/>
-              <w:left w:w="100" w:type="dxa"/>
-              <w:bottom w:w="80" w:type="dxa"/>
-              <w:right w:w="100" w:type="dxa"/>
-            </w:tcMar>
-            <w:vAlign w:val="center"/>
-          </w:tcPr>
-          <w:p/>
+            <w:tcW w:w="990" w:type="dxa"/>
+            <w:tcMar>
+              <w:top w:w="80" w:type="dxa"/>
+              <w:left w:w="100" w:type="dxa"/>
+              <w:bottom w:w="80" w:type="dxa"/>
+              <w:right w:w="100" w:type="dxa"/>
+            </w:tcMar>
+            <w:vAlign w:val="center"/>
+          </w:tcPr>
+          <w:p>
+            <w:r>
+              <w:t>ED-003</w:t>
+            </w:r>
+          </w:p>
+        </w:tc>
+        <w:tc>
+          <w:tcPr>
+            <w:tcW w:w="1311" w:type="dxa"/>
+            <w:tcMar>
+              <w:top w:w="80" w:type="dxa"/>
+              <w:left w:w="100" w:type="dxa"/>
+              <w:bottom w:w="80" w:type="dxa"/>
+              <w:right w:w="100" w:type="dxa"/>
+            </w:tcMar>
+            <w:vAlign w:val="center"/>
+          </w:tcPr>
+          <w:p>
+            <w:r>
+              <w:t>Requester capabilities must be accessible from various devices, implementation of additional features if needed.</w:t>
+            </w:r>
+          </w:p>
+        </w:tc>
+        <w:tc>
+          <w:tcPr>
+            <w:tcW w:w="1098" w:type="dxa"/>
+          </w:tcPr>
+          <w:p>
+            <w:r>
+              <w:t xml:space="preserve">3-student team, single-semester timeline, unconfirmed native mobile capability, cost of maintaining </w:t>
+            </w:r>
+            <w:r>
+              <w:lastRenderedPageBreak/>
+              <w:t>2 codebases.</w:t>
+            </w:r>
+          </w:p>
+        </w:tc>
+        <w:tc>
+          <w:tcPr>
+            <w:tcW w:w="1421" w:type="dxa"/>
+            <w:tcMar>
+              <w:top w:w="80" w:type="dxa"/>
+              <w:left w:w="100" w:type="dxa"/>
+              <w:bottom w:w="80" w:type="dxa"/>
+              <w:right w:w="100" w:type="dxa"/>
+            </w:tcMar>
+            <w:vAlign w:val="center"/>
+          </w:tcPr>
+          <w:p>
+            <w:r>
+              <w:lastRenderedPageBreak/>
+              <w:t>A: Native Mobile applications for project consideration.</w:t>
+            </w:r>
+          </w:p>
+          <w:p>
+            <w:r>
+              <w:t>B: Only a responsive Web-app.</w:t>
+            </w:r>
+          </w:p>
+          <w:p>
+            <w:r>
+              <w:t xml:space="preserve">C: Hybrid Framework </w:t>
+            </w:r>
+            <w:r>
+              <w:lastRenderedPageBreak/>
+              <w:t>to be implemented</w:t>
+            </w:r>
+          </w:p>
+        </w:tc>
+        <w:tc>
+          <w:tcPr>
+            <w:tcW w:w="1421" w:type="dxa"/>
+            <w:tcMar>
+              <w:top w:w="80" w:type="dxa"/>
+              <w:left w:w="100" w:type="dxa"/>
+              <w:bottom w:w="80" w:type="dxa"/>
+              <w:right w:w="100" w:type="dxa"/>
+            </w:tcMar>
+            <w:vAlign w:val="center"/>
+          </w:tcPr>
+          <w:p>
+            <w:r>
+              <w:lastRenderedPageBreak/>
+              <w:t>Deliver a responsive web application only. Native mobile apps are currently out of scope.</w:t>
+            </w:r>
+          </w:p>
+        </w:tc>
+        <w:tc>
+          <w:tcPr>
+            <w:tcW w:w="1278" w:type="dxa"/>
+            <w:tcMar>
+              <w:top w:w="80" w:type="dxa"/>
+              <w:left w:w="100" w:type="dxa"/>
+              <w:bottom w:w="80" w:type="dxa"/>
+              <w:right w:w="100" w:type="dxa"/>
+            </w:tcMar>
+            <w:vAlign w:val="center"/>
+          </w:tcPr>
+          <w:p>
+            <w:r>
+              <w:t xml:space="preserve">A native web app satisfies all requirements from the 3 present stakeholders without increasing the workload. Consistent </w:t>
+            </w:r>
+            <w:r>
+              <w:lastRenderedPageBreak/>
+              <w:t>with the briefs point of a smaller, controlled, high-quality solution.</w:t>
+            </w:r>
+          </w:p>
+        </w:tc>
+        <w:tc>
+          <w:tcPr>
+            <w:tcW w:w="671" w:type="dxa"/>
+          </w:tcPr>
+          <w:p/>
+          <w:p/>
+          <w:p/>
+          <w:p/>
+          <w:p/>
+          <w:p>
+            <w:r>
+              <w:t>R-005</w:t>
+            </w:r>
+          </w:p>
+        </w:tc>
+        <w:tc>
+          <w:tcPr>
+            <w:tcW w:w="1260" w:type="dxa"/>
+            <w:tcMar>
+              <w:top w:w="80" w:type="dxa"/>
+              <w:left w:w="100" w:type="dxa"/>
+              <w:bottom w:w="80" w:type="dxa"/>
+              <w:right w:w="100" w:type="dxa"/>
+            </w:tcMar>
+            <w:vAlign w:val="center"/>
+          </w:tcPr>
+          <w:p>
+            <w:r>
+              <w:t>PED Scope Baseline section.</w:t>
+            </w:r>
+          </w:p>
+        </w:tc>
+        <w:tc>
+          <w:tcPr>
+            <w:tcW w:w="1191" w:type="dxa"/>
+          </w:tcPr>
+          <w:p/>
+          <w:p>
+            <w:r>
+              <w:t>Revisit only if a formal change request is justified for the project baseline.</w:t>
+            </w:r>
+          </w:p>
+        </w:tc>
+      </w:tr>
+      <w:tr>
+        <w:trPr>
+          <w:trHeight w:val="800"/>
+        </w:trPr>
+        <w:tc>
+          <w:tcPr>
+            <w:tcW w:w="990" w:type="dxa"/>
+            <w:tcMar>
+              <w:top w:w="80" w:type="dxa"/>
+              <w:left w:w="100" w:type="dxa"/>
+              <w:bottom w:w="80" w:type="dxa"/>
+              <w:right w:w="100" w:type="dxa"/>
+            </w:tcMar>
+            <w:vAlign w:val="center"/>
+          </w:tcPr>
+          <w:p>
+            <w:r>
+              <w:t>ED-004</w:t>
+            </w:r>
+          </w:p>
+        </w:tc>
+        <w:tc>
+          <w:tcPr>
+            <w:tcW w:w="1311" w:type="dxa"/>
+            <w:tcMar>
+              <w:top w:w="80" w:type="dxa"/>
+              <w:left w:w="100" w:type="dxa"/>
+              <w:bottom w:w="80" w:type="dxa"/>
+              <w:right w:w="100" w:type="dxa"/>
+            </w:tcMar>
+            <w:vAlign w:val="center"/>
+          </w:tcPr>
+          <w:p>
+            <w:r>
+              <w:t>Brief requires that unique, stable requirement IDs and one evolving Requirement Traceability Matrix (RTM) across all Milestones.</w:t>
+            </w:r>
+          </w:p>
+        </w:tc>
+        <w:tc>
+          <w:tcPr>
+            <w:tcW w:w="1098" w:type="dxa"/>
+          </w:tcPr>
+          <w:p>
+            <w:pPr>
+              <w:jc w:val="center"/>
+            </w:pPr>
+          </w:p>
+          <w:p>
+            <w:pPr>
+              <w:jc w:val="center"/>
+            </w:pPr>
+          </w:p>
+          <w:p>
+            <w:pPr>
+              <w:jc w:val="center"/>
+            </w:pPr>
+          </w:p>
+          <w:p>
+            <w:pPr>
+              <w:jc w:val="center"/>
+            </w:pPr>
+          </w:p>
+          <w:p>
+            <w:pPr>
+              <w:jc w:val="center"/>
+            </w:pPr>
+            <w:r>
+              <w:t>Multiple contributors that edit the work concurrently. Progress must stay stable and visible for traceability into Milestone 2.</w:t>
+            </w:r>
+          </w:p>
+        </w:tc>
+        <w:tc>
+          <w:tcPr>
+            <w:tcW w:w="1421" w:type="dxa"/>
+            <w:tcMar>
+              <w:top w:w="80" w:type="dxa"/>
+              <w:left w:w="100" w:type="dxa"/>
+              <w:bottom w:w="80" w:type="dxa"/>
+              <w:right w:w="100" w:type="dxa"/>
+            </w:tcMar>
+            <w:vAlign w:val="center"/>
+          </w:tcPr>
+          <w:p>
+            <w:r>
+              <w:t>A: Renumber requirement per their impact for each Milestone.</w:t>
+            </w:r>
+          </w:p>
+          <w:p>
+            <w:r>
+              <w:t>B: Fix the ID scheme now and never need to renumber.</w:t>
+            </w:r>
+          </w:p>
+        </w:tc>
+        <w:tc>
+          <w:tcPr>
+            <w:tcW w:w="1421" w:type="dxa"/>
+            <w:tcMar>
+              <w:top w:w="80" w:type="dxa"/>
+              <w:left w:w="100" w:type="dxa"/>
+              <w:bottom w:w="80" w:type="dxa"/>
+              <w:right w:w="100" w:type="dxa"/>
+            </w:tcMar>
+            <w:vAlign w:val="center"/>
+          </w:tcPr>
+          <w:p>
+            <w:r>
+              <w:t>Adopt R-0XX/ED-0XX that is assigned sequentially, never reused, tracked in a single RTM file from Milestone 1 onwards.</w:t>
+            </w:r>
+          </w:p>
+        </w:tc>
+        <w:tc>
+          <w:tcPr>
+            <w:tcW w:w="1278" w:type="dxa"/>
+            <w:tcMar>
+              <w:top w:w="80" w:type="dxa"/>
+              <w:left w:w="100" w:type="dxa"/>
+              <w:bottom w:w="80" w:type="dxa"/>
+              <w:right w:w="100" w:type="dxa"/>
+            </w:tcMar>
+            <w:vAlign w:val="center"/>
+          </w:tcPr>
+          <w:p>
+            <w:pPr>
+              <w:jc w:val="center"/>
+            </w:pPr>
+            <w:r>
+              <w:t>Stable IDs are required for there to be a proper traceability chain.</w:t>
+            </w:r>
+          </w:p>
+          <w:p>
+            <w:pPr>
+              <w:jc w:val="center"/>
+            </w:pPr>
+            <w:r>
+              <w:t>Trade-off: Numbering gaps will begin if a requirement is later removed, in exchange traceability integrity is stable.</w:t>
+            </w:r>
+          </w:p>
+        </w:tc>
+        <w:tc>
+          <w:tcPr>
+            <w:tcW w:w="671" w:type="dxa"/>
+          </w:tcPr>
+          <w:p/>
+          <w:p/>
+          <w:p/>
+          <w:p/>
+          <w:p/>
+          <w:p/>
+          <w:p/>
+          <w:p/>
+          <w:p/>
+          <w:p>
+            <w:r>
+              <w:t>R-001</w:t>
+            </w:r>
+          </w:p>
+        </w:tc>
+        <w:tc>
+          <w:tcPr>
+            <w:tcW w:w="1260" w:type="dxa"/>
+            <w:tcMar>
+              <w:top w:w="80" w:type="dxa"/>
+              <w:left w:w="100" w:type="dxa"/>
+              <w:bottom w:w="80" w:type="dxa"/>
+              <w:right w:w="100" w:type="dxa"/>
+            </w:tcMar>
+            <w:vAlign w:val="center"/>
+          </w:tcPr>
+          <w:p>
+            <w:r>
+              <w:t>RTM file, PED requirements section.</w:t>
+            </w:r>
+          </w:p>
+        </w:tc>
+        <w:tc>
+          <w:tcPr>
+            <w:tcW w:w="1191" w:type="dxa"/>
+          </w:tcPr>
+          <w:p/>
+          <w:p/>
+          <w:p/>
+          <w:p/>
+          <w:p/>
+          <w:p/>
+          <w:p>
+            <w:r>
+              <w:t>Enforced at every future project baseline update.</w:t>
+            </w:r>
+          </w:p>
+        </w:tc>
+      </w:tr>
+      <w:tr>
+        <w:trPr>
+          <w:trHeight w:val="800"/>
+        </w:trPr>
+        <w:tc>
+          <w:tcPr>
+            <w:tcW w:w="990" w:type="dxa"/>
+            <w:tcMar>
+              <w:top w:w="80" w:type="dxa"/>
+              <w:left w:w="100" w:type="dxa"/>
+              <w:bottom w:w="80" w:type="dxa"/>
+              <w:right w:w="100" w:type="dxa"/>
+            </w:tcMar>
+            <w:vAlign w:val="center"/>
+          </w:tcPr>
+          <w:p>
+            <w:r>
+              <w:t>ED-005</w:t>
+            </w:r>
+          </w:p>
+        </w:tc>
+        <w:tc>
+          <w:tcPr>
+            <w:tcW w:w="1311" w:type="dxa"/>
+            <w:tcMar>
+              <w:top w:w="80" w:type="dxa"/>
+              <w:left w:w="100" w:type="dxa"/>
+              <w:bottom w:w="80" w:type="dxa"/>
+              <w:right w:w="100" w:type="dxa"/>
+            </w:tcMar>
+            <w:vAlign w:val="center"/>
+          </w:tcPr>
+          <w:p>
+            <w:r>
+              <w:t>Exclusion of detailed database design and detailed RBAC from Milestone 1, however R-003 shows why it is needed for access control to already exist.</w:t>
+            </w:r>
+          </w:p>
+        </w:tc>
+        <w:tc>
+          <w:tcPr>
+            <w:tcW w:w="1098" w:type="dxa"/>
+          </w:tcPr>
+          <w:p>
+            <w:pPr>
+              <w:jc w:val="center"/>
+            </w:pPr>
+            <w:r>
+              <w:t>Security requirement identified early in project development with detailed designs needing architecture-level analysis that has not yet been performed.</w:t>
+            </w:r>
+          </w:p>
+        </w:tc>
+        <w:tc>
+          <w:tcPr>
+            <w:tcW w:w="1421" w:type="dxa"/>
+            <w:tcMar>
+              <w:top w:w="80" w:type="dxa"/>
+              <w:left w:w="100" w:type="dxa"/>
+              <w:bottom w:w="80" w:type="dxa"/>
+              <w:right w:w="100" w:type="dxa"/>
+            </w:tcMar>
+            <w:vAlign w:val="center"/>
+          </w:tcPr>
+          <w:p>
+            <w:pPr>
+              <w:jc w:val="center"/>
+            </w:pPr>
+            <w:r>
+              <w:t>N/A</w:t>
+            </w:r>
+          </w:p>
+        </w:tc>
+        <w:tc>
+          <w:tcPr>
+            <w:tcW w:w="1421" w:type="dxa"/>
+            <w:tcMar>
+              <w:top w:w="80" w:type="dxa"/>
+              <w:left w:w="100" w:type="dxa"/>
+              <w:bottom w:w="80" w:type="dxa"/>
+              <w:right w:w="100" w:type="dxa"/>
+            </w:tcMar>
+            <w:vAlign w:val="center"/>
+          </w:tcPr>
+          <w:p>
+            <w:r>
+              <w:t>Defer the persistent technology and detailed RBAC model to Milestone 2 ADR, record only the NFR that support role-based access.</w:t>
+            </w:r>
+          </w:p>
+        </w:tc>
+        <w:tc>
+          <w:tcPr>
+            <w:tcW w:w="1278" w:type="dxa"/>
+            <w:tcMar>
+              <w:top w:w="80" w:type="dxa"/>
+              <w:left w:w="100" w:type="dxa"/>
+              <w:bottom w:w="80" w:type="dxa"/>
+              <w:right w:w="100" w:type="dxa"/>
+            </w:tcMar>
+            <w:vAlign w:val="center"/>
+          </w:tcPr>
+          <w:p>
+            <w:pPr>
+              <w:jc w:val="center"/>
+            </w:pPr>
+            <w:r>
+              <w:t>Commit to a data/access design before requirements are fully outlined with risks and constraints understood.</w:t>
+            </w:r>
+          </w:p>
+          <w:p>
+            <w:pPr>
+              <w:jc w:val="center"/>
+            </w:pPr>
+            <w:r>
+              <w:t>No trade-off has been recorded yet as none exist until a decision is made.</w:t>
+            </w:r>
+          </w:p>
+        </w:tc>
+        <w:tc>
+          <w:tcPr>
+            <w:tcW w:w="671" w:type="dxa"/>
+          </w:tcPr>
+          <w:p>
+            <w:pPr>
+              <w:jc w:val="center"/>
+            </w:pPr>
+          </w:p>
+          <w:p>
+            <w:pPr>
+              <w:jc w:val="center"/>
+            </w:pPr>
+          </w:p>
+          <w:p>
+            <w:pPr>
+              <w:jc w:val="center"/>
+            </w:pPr>
+          </w:p>
+          <w:p>
+            <w:pPr>
+              <w:jc w:val="center"/>
+            </w:pPr>
+          </w:p>
+          <w:p>
+            <w:pPr>
+              <w:jc w:val="center"/>
+            </w:pPr>
+          </w:p>
+          <w:p>
+            <w:pPr>
+              <w:jc w:val="center"/>
+            </w:pPr>
+          </w:p>
+          <w:p>
+            <w:pPr>
+              <w:jc w:val="center"/>
+            </w:pPr>
+          </w:p>
+          <w:p>
+            <w:pPr>
+              <w:jc w:val="center"/>
+            </w:pPr>
+          </w:p>
+          <w:p>
+            <w:pPr>
+              <w:jc w:val="center"/>
+            </w:pPr>
+            <w:r>
+              <w:t>R-003</w:t>
+            </w:r>
+          </w:p>
+        </w:tc>
+        <w:tc>
+          <w:tcPr>
+            <w:tcW w:w="1260" w:type="dxa"/>
+            <w:tcMar>
+              <w:top w:w="80" w:type="dxa"/>
+              <w:left w:w="100" w:type="dxa"/>
+              <w:bottom w:w="80" w:type="dxa"/>
+              <w:right w:w="100" w:type="dxa"/>
+            </w:tcMar>
+            <w:vAlign w:val="center"/>
+          </w:tcPr>
+          <w:p>
+            <w:r>
+              <w:t>Forward Engineering Considerations register.</w:t>
+            </w:r>
+          </w:p>
+        </w:tc>
+        <w:tc>
+          <w:tcPr>
+            <w:tcW w:w="1191" w:type="dxa"/>
+          </w:tcPr>
+          <w:p>
+            <w:pPr>
+              <w:jc w:val="center"/>
+            </w:pPr>
+          </w:p>
+          <w:p>
+            <w:pPr>
+              <w:jc w:val="center"/>
+            </w:pPr>
+          </w:p>
+          <w:p>
+            <w:pPr>
+              <w:jc w:val="center"/>
+            </w:pPr>
+          </w:p>
+          <w:p>
+            <w:pPr>
+              <w:jc w:val="center"/>
+            </w:pPr>
+          </w:p>
+          <w:p>
+            <w:pPr>
+              <w:jc w:val="center"/>
+            </w:pPr>
+            <w:r>
+              <w:t>To become formal as the ADR in Milestone 2 of the project.</w:t>
+            </w:r>
+          </w:p>
         </w:tc>
       </w:tr>
     </w:tbl>
@@ -7314,7 +8911,13 @@
       <w:pPr>
         <w:pStyle w:val="Heading1"/>
       </w:pPr>
+    </w:p>
+    <w:p>
+      <w:pPr>
+        <w:pStyle w:val="Heading1"/>
+      </w:pPr>
       <w:r>
+        <w:lastRenderedPageBreak/>
         <w:t>9. GitHub Repository &amp; Governance</w:t>
       </w:r>
     </w:p>
@@ -7610,13 +9213,18 @@
         <w:spacing w:after="80"/>
       </w:pPr>
       <w:r>
-        <w:t>No secrets/credentials committed (.</w:t>
+        <w:t xml:space="preserve">No secrets/credentials committed </w:t>
+      </w:r>
+      <w:proofErr w:type="gramStart"/>
+      <w:r>
+        <w:t>(.</w:t>
       </w:r>
       <w:proofErr w:type="spellStart"/>
       <w:r>
         <w:t>gitignore</w:t>
       </w:r>
       <w:proofErr w:type="spellEnd"/>
+      <w:proofErr w:type="gramEnd"/>
       <w:r>
         <w:t xml:space="preserve"> configured)</w:t>
       </w:r>
@@ -7637,7 +9245,8 @@
     </w:p>
     <w:tbl>
       <w:tblPr>
-        <w:tblW w:w="9600" w:type="dxa"/>
+        <w:tblW w:w="10025" w:type="dxa"/>
+        <w:tblInd w:w="-289" w:type="dxa"/>
         <w:tblBorders>
           <w:top w:val="single" w:sz="4" w:space="0" w:color="auto"/>
           <w:left w:val="single" w:sz="4" w:space="0" w:color="auto"/>
@@ -7653,14 +9262,14 @@
         <w:tblLook w:val="0000" w:firstRow="0" w:lastRow="0" w:firstColumn="0" w:lastColumn="0" w:noHBand="0" w:noVBand="0"/>
       </w:tblPr>
       <w:tblGrid>
-        <w:gridCol w:w="1262"/>
+        <w:gridCol w:w="1347"/>
         <w:gridCol w:w="1203"/>
-        <w:gridCol w:w="865"/>
-        <w:gridCol w:w="1394"/>
-        <w:gridCol w:w="1358"/>
-        <w:gridCol w:w="1233"/>
-        <w:gridCol w:w="1115"/>
-        <w:gridCol w:w="1170"/>
+        <w:gridCol w:w="814"/>
+        <w:gridCol w:w="1352"/>
+        <w:gridCol w:w="1263"/>
+        <w:gridCol w:w="1168"/>
+        <w:gridCol w:w="1407"/>
+        <w:gridCol w:w="1471"/>
       </w:tblGrid>
       <w:tr>
         <w:trPr>
@@ -7668,7 +9277,7 @@
         </w:trPr>
         <w:tc>
           <w:tcPr>
-            <w:tcW w:w="900" w:type="dxa"/>
+            <w:tcW w:w="1526" w:type="dxa"/>
             <w:shd w:val="clear" w:color="auto" w:fill="1F4E5F"/>
             <w:tcMar>
               <w:top w:w="80" w:type="dxa"/>
@@ -7693,7 +9302,7 @@
         </w:tc>
         <w:tc>
           <w:tcPr>
-            <w:tcW w:w="1000" w:type="dxa"/>
+            <w:tcW w:w="1178" w:type="dxa"/>
             <w:shd w:val="clear" w:color="auto" w:fill="1F4E5F"/>
             <w:tcMar>
               <w:top w:w="80" w:type="dxa"/>
@@ -7718,7 +9327,7 @@
         </w:tc>
         <w:tc>
           <w:tcPr>
-            <w:tcW w:w="1000" w:type="dxa"/>
+            <w:tcW w:w="799" w:type="dxa"/>
             <w:shd w:val="clear" w:color="auto" w:fill="1F4E5F"/>
             <w:tcMar>
               <w:top w:w="80" w:type="dxa"/>
@@ -7743,7 +9352,7 @@
         </w:tc>
         <w:tc>
           <w:tcPr>
-            <w:tcW w:w="1500" w:type="dxa"/>
+            <w:tcW w:w="1324" w:type="dxa"/>
             <w:shd w:val="clear" w:color="auto" w:fill="1F4E5F"/>
             <w:tcMar>
               <w:top w:w="80" w:type="dxa"/>
@@ -7768,7 +9377,7 @@
         </w:tc>
         <w:tc>
           <w:tcPr>
-            <w:tcW w:w="1600" w:type="dxa"/>
+            <w:tcW w:w="1237" w:type="dxa"/>
             <w:shd w:val="clear" w:color="auto" w:fill="1F4E5F"/>
             <w:tcMar>
               <w:top w:w="80" w:type="dxa"/>
@@ -7793,7 +9402,7 @@
         </w:tc>
         <w:tc>
           <w:tcPr>
-            <w:tcW w:w="1400" w:type="dxa"/>
+            <w:tcW w:w="1144" w:type="dxa"/>
             <w:shd w:val="clear" w:color="auto" w:fill="1F4E5F"/>
             <w:tcMar>
               <w:top w:w="80" w:type="dxa"/>
@@ -7818,7 +9427,7 @@
         </w:tc>
         <w:tc>
           <w:tcPr>
-            <w:tcW w:w="1000" w:type="dxa"/>
+            <w:tcW w:w="1377" w:type="dxa"/>
             <w:shd w:val="clear" w:color="auto" w:fill="1F4E5F"/>
             <w:tcMar>
               <w:top w:w="80" w:type="dxa"/>
@@ -7843,7 +9452,7 @@
         </w:tc>
         <w:tc>
           <w:tcPr>
-            <w:tcW w:w="1200" w:type="dxa"/>
+            <w:tcW w:w="1440" w:type="dxa"/>
             <w:shd w:val="clear" w:color="auto" w:fill="1F4E5F"/>
             <w:tcMar>
               <w:top w:w="80" w:type="dxa"/>
@@ -7873,7 +9482,7 @@
         </w:trPr>
         <w:tc>
           <w:tcPr>
-            <w:tcW w:w="900" w:type="dxa"/>
+            <w:tcW w:w="1526" w:type="dxa"/>
             <w:tcMar>
               <w:top w:w="80" w:type="dxa"/>
               <w:left w:w="100" w:type="dxa"/>
@@ -7890,7 +9499,7 @@
         </w:tc>
         <w:tc>
           <w:tcPr>
-            <w:tcW w:w="1000" w:type="dxa"/>
+            <w:tcW w:w="1178" w:type="dxa"/>
             <w:tcMar>
               <w:top w:w="80" w:type="dxa"/>
               <w:left w:w="100" w:type="dxa"/>
@@ -7907,7 +9516,7 @@
         </w:tc>
         <w:tc>
           <w:tcPr>
-            <w:tcW w:w="1000" w:type="dxa"/>
+            <w:tcW w:w="799" w:type="dxa"/>
             <w:tcMar>
               <w:top w:w="80" w:type="dxa"/>
               <w:left w:w="100" w:type="dxa"/>
@@ -7924,7 +9533,7 @@
         </w:tc>
         <w:tc>
           <w:tcPr>
-            <w:tcW w:w="1500" w:type="dxa"/>
+            <w:tcW w:w="1324" w:type="dxa"/>
             <w:tcMar>
               <w:top w:w="80" w:type="dxa"/>
               <w:left w:w="100" w:type="dxa"/>
@@ -7941,7 +9550,7 @@
         </w:tc>
         <w:tc>
           <w:tcPr>
-            <w:tcW w:w="1600" w:type="dxa"/>
+            <w:tcW w:w="1237" w:type="dxa"/>
             <w:tcMar>
               <w:top w:w="80" w:type="dxa"/>
               <w:left w:w="100" w:type="dxa"/>
@@ -7958,7 +9567,7 @@
         </w:tc>
         <w:tc>
           <w:tcPr>
-            <w:tcW w:w="1400" w:type="dxa"/>
+            <w:tcW w:w="1144" w:type="dxa"/>
             <w:tcMar>
               <w:top w:w="80" w:type="dxa"/>
               <w:left w:w="100" w:type="dxa"/>
@@ -7975,7 +9584,7 @@
         </w:tc>
         <w:tc>
           <w:tcPr>
-            <w:tcW w:w="1000" w:type="dxa"/>
+            <w:tcW w:w="1377" w:type="dxa"/>
             <w:tcMar>
               <w:top w:w="80" w:type="dxa"/>
               <w:left w:w="100" w:type="dxa"/>
@@ -7992,7 +9601,7 @@
         </w:tc>
         <w:tc>
           <w:tcPr>
-            <w:tcW w:w="1200" w:type="dxa"/>
+            <w:tcW w:w="1440" w:type="dxa"/>
             <w:tcMar>
               <w:top w:w="80" w:type="dxa"/>
               <w:left w:w="100" w:type="dxa"/>
@@ -8014,7 +9623,7 @@
         </w:trPr>
         <w:tc>
           <w:tcPr>
-            <w:tcW w:w="900" w:type="dxa"/>
+            <w:tcW w:w="1526" w:type="dxa"/>
             <w:tcMar>
               <w:top w:w="80" w:type="dxa"/>
               <w:left w:w="100" w:type="dxa"/>
@@ -8031,24 +9640,29 @@
         </w:tc>
         <w:tc>
           <w:tcPr>
-            <w:tcW w:w="1000" w:type="dxa"/>
-            <w:tcMar>
-              <w:top w:w="80" w:type="dxa"/>
-              <w:left w:w="100" w:type="dxa"/>
-              <w:bottom w:w="80" w:type="dxa"/>
-              <w:right w:w="100" w:type="dxa"/>
-            </w:tcMar>
-            <w:vAlign w:val="center"/>
-          </w:tcPr>
-          <w:p>
-            <w:r>
-              <w:t>Michiel Coenraad TerBlanche</w:t>
-            </w:r>
-          </w:p>
-        </w:tc>
-        <w:tc>
-          <w:tcPr>
-            <w:tcW w:w="1000" w:type="dxa"/>
+            <w:tcW w:w="1178" w:type="dxa"/>
+            <w:tcMar>
+              <w:top w:w="80" w:type="dxa"/>
+              <w:left w:w="100" w:type="dxa"/>
+              <w:bottom w:w="80" w:type="dxa"/>
+              <w:right w:w="100" w:type="dxa"/>
+            </w:tcMar>
+            <w:vAlign w:val="center"/>
+          </w:tcPr>
+          <w:p>
+            <w:r>
+              <w:t xml:space="preserve">Michiel Coenraad </w:t>
+            </w:r>
+            <w:proofErr w:type="spellStart"/>
+            <w:r>
+              <w:t>TerBlanche</w:t>
+            </w:r>
+            <w:proofErr w:type="spellEnd"/>
+          </w:p>
+        </w:tc>
+        <w:tc>
+          <w:tcPr>
+            <w:tcW w:w="799" w:type="dxa"/>
             <w:tcMar>
               <w:top w:w="80" w:type="dxa"/>
               <w:left w:w="100" w:type="dxa"/>
@@ -8065,24 +9679,32 @@
         </w:tc>
         <w:tc>
           <w:tcPr>
-            <w:tcW w:w="1500" w:type="dxa"/>
-            <w:tcMar>
-              <w:top w:w="80" w:type="dxa"/>
-              <w:left w:w="100" w:type="dxa"/>
-              <w:bottom w:w="80" w:type="dxa"/>
-              <w:right w:w="100" w:type="dxa"/>
-            </w:tcMar>
-            <w:vAlign w:val="center"/>
-          </w:tcPr>
-          <w:p>
-            <w:r>
-              <w:t>Used to help go through the CivicConnect Master Brief</w:t>
-            </w:r>
-          </w:p>
-        </w:tc>
-        <w:tc>
-          <w:tcPr>
-            <w:tcW w:w="1600" w:type="dxa"/>
+            <w:tcW w:w="1324" w:type="dxa"/>
+            <w:tcMar>
+              <w:top w:w="80" w:type="dxa"/>
+              <w:left w:w="100" w:type="dxa"/>
+              <w:bottom w:w="80" w:type="dxa"/>
+              <w:right w:w="100" w:type="dxa"/>
+            </w:tcMar>
+            <w:vAlign w:val="center"/>
+          </w:tcPr>
+          <w:p>
+            <w:r>
+              <w:t xml:space="preserve">Used to help go through the </w:t>
+            </w:r>
+            <w:proofErr w:type="spellStart"/>
+            <w:r>
+              <w:t>CivicConnect</w:t>
+            </w:r>
+            <w:proofErr w:type="spellEnd"/>
+            <w:r>
+              <w:t xml:space="preserve"> Master Brief</w:t>
+            </w:r>
+          </w:p>
+        </w:tc>
+        <w:tc>
+          <w:tcPr>
+            <w:tcW w:w="1237" w:type="dxa"/>
             <w:tcMar>
               <w:top w:w="80" w:type="dxa"/>
               <w:left w:w="100" w:type="dxa"/>
@@ -8099,20 +9721,20 @@
         </w:tc>
         <w:tc>
           <w:tcPr>
-            <w:tcW w:w="1400" w:type="dxa"/>
-            <w:tcMar>
-              <w:top w:w="80" w:type="dxa"/>
-              <w:left w:w="100" w:type="dxa"/>
-              <w:bottom w:w="80" w:type="dxa"/>
-              <w:right w:w="100" w:type="dxa"/>
-            </w:tcMar>
-            <w:vAlign w:val="center"/>
-          </w:tcPr>
-          <w:p/>
-        </w:tc>
-        <w:tc>
-          <w:tcPr>
-            <w:tcW w:w="1000" w:type="dxa"/>
+            <w:tcW w:w="1144" w:type="dxa"/>
+            <w:tcMar>
+              <w:top w:w="80" w:type="dxa"/>
+              <w:left w:w="100" w:type="dxa"/>
+              <w:bottom w:w="80" w:type="dxa"/>
+              <w:right w:w="100" w:type="dxa"/>
+            </w:tcMar>
+            <w:vAlign w:val="center"/>
+          </w:tcPr>
+          <w:p/>
+        </w:tc>
+        <w:tc>
+          <w:tcPr>
+            <w:tcW w:w="1377" w:type="dxa"/>
             <w:tcMar>
               <w:top w:w="80" w:type="dxa"/>
               <w:left w:w="100" w:type="dxa"/>
@@ -8129,7 +9751,7 @@
         </w:tc>
         <w:tc>
           <w:tcPr>
-            <w:tcW w:w="1200" w:type="dxa"/>
+            <w:tcW w:w="1440" w:type="dxa"/>
             <w:tcMar>
               <w:top w:w="80" w:type="dxa"/>
               <w:left w:w="100" w:type="dxa"/>
@@ -8151,107 +9773,143 @@
         </w:trPr>
         <w:tc>
           <w:tcPr>
-            <w:tcW w:w="900" w:type="dxa"/>
-            <w:tcMar>
-              <w:top w:w="80" w:type="dxa"/>
-              <w:left w:w="100" w:type="dxa"/>
-              <w:bottom w:w="80" w:type="dxa"/>
-              <w:right w:w="100" w:type="dxa"/>
-            </w:tcMar>
-            <w:vAlign w:val="center"/>
-          </w:tcPr>
-          <w:p/>
-        </w:tc>
-        <w:tc>
-          <w:tcPr>
-            <w:tcW w:w="1000" w:type="dxa"/>
-            <w:tcMar>
-              <w:top w:w="80" w:type="dxa"/>
-              <w:left w:w="100" w:type="dxa"/>
-              <w:bottom w:w="80" w:type="dxa"/>
-              <w:right w:w="100" w:type="dxa"/>
-            </w:tcMar>
-            <w:vAlign w:val="center"/>
-          </w:tcPr>
-          <w:p/>
-        </w:tc>
-        <w:tc>
-          <w:tcPr>
-            <w:tcW w:w="1000" w:type="dxa"/>
-            <w:tcMar>
-              <w:top w:w="80" w:type="dxa"/>
-              <w:left w:w="100" w:type="dxa"/>
-              <w:bottom w:w="80" w:type="dxa"/>
-              <w:right w:w="100" w:type="dxa"/>
-            </w:tcMar>
-            <w:vAlign w:val="center"/>
-          </w:tcPr>
-          <w:p/>
-        </w:tc>
-        <w:tc>
-          <w:tcPr>
-            <w:tcW w:w="1500" w:type="dxa"/>
-            <w:tcMar>
-              <w:top w:w="80" w:type="dxa"/>
-              <w:left w:w="100" w:type="dxa"/>
-              <w:bottom w:w="80" w:type="dxa"/>
-              <w:right w:w="100" w:type="dxa"/>
-            </w:tcMar>
-            <w:vAlign w:val="center"/>
-          </w:tcPr>
-          <w:p/>
-        </w:tc>
-        <w:tc>
-          <w:tcPr>
-            <w:tcW w:w="1600" w:type="dxa"/>
-            <w:tcMar>
-              <w:top w:w="80" w:type="dxa"/>
-              <w:left w:w="100" w:type="dxa"/>
-              <w:bottom w:w="80" w:type="dxa"/>
-              <w:right w:w="100" w:type="dxa"/>
-            </w:tcMar>
-            <w:vAlign w:val="center"/>
-          </w:tcPr>
-          <w:p/>
-        </w:tc>
-        <w:tc>
-          <w:tcPr>
-            <w:tcW w:w="1400" w:type="dxa"/>
-            <w:tcMar>
-              <w:top w:w="80" w:type="dxa"/>
-              <w:left w:w="100" w:type="dxa"/>
-              <w:bottom w:w="80" w:type="dxa"/>
-              <w:right w:w="100" w:type="dxa"/>
-            </w:tcMar>
-            <w:vAlign w:val="center"/>
-          </w:tcPr>
-          <w:p/>
-        </w:tc>
-        <w:tc>
-          <w:tcPr>
-            <w:tcW w:w="1000" w:type="dxa"/>
-            <w:tcMar>
-              <w:top w:w="80" w:type="dxa"/>
-              <w:left w:w="100" w:type="dxa"/>
-              <w:bottom w:w="80" w:type="dxa"/>
-              <w:right w:w="100" w:type="dxa"/>
-            </w:tcMar>
-            <w:vAlign w:val="center"/>
-          </w:tcPr>
-          <w:p/>
-        </w:tc>
-        <w:tc>
-          <w:tcPr>
-            <w:tcW w:w="1200" w:type="dxa"/>
-            <w:tcMar>
-              <w:top w:w="80" w:type="dxa"/>
-              <w:left w:w="100" w:type="dxa"/>
-              <w:bottom w:w="80" w:type="dxa"/>
-              <w:right w:w="100" w:type="dxa"/>
-            </w:tcMar>
-            <w:vAlign w:val="center"/>
-          </w:tcPr>
-          <w:p/>
+            <w:tcW w:w="1526" w:type="dxa"/>
+            <w:tcMar>
+              <w:top w:w="80" w:type="dxa"/>
+              <w:left w:w="100" w:type="dxa"/>
+              <w:bottom w:w="80" w:type="dxa"/>
+              <w:right w:w="100" w:type="dxa"/>
+            </w:tcMar>
+            <w:vAlign w:val="center"/>
+          </w:tcPr>
+          <w:p>
+            <w:r>
+              <w:t>09/08/2026</w:t>
+            </w:r>
+          </w:p>
+        </w:tc>
+        <w:tc>
+          <w:tcPr>
+            <w:tcW w:w="1178" w:type="dxa"/>
+            <w:tcMar>
+              <w:top w:w="80" w:type="dxa"/>
+              <w:left w:w="100" w:type="dxa"/>
+              <w:bottom w:w="80" w:type="dxa"/>
+              <w:right w:w="100" w:type="dxa"/>
+            </w:tcMar>
+            <w:vAlign w:val="center"/>
+          </w:tcPr>
+          <w:p>
+            <w:r>
+              <w:t>Nicholas Armin Vronka</w:t>
+            </w:r>
+          </w:p>
+        </w:tc>
+        <w:tc>
+          <w:tcPr>
+            <w:tcW w:w="799" w:type="dxa"/>
+            <w:tcMar>
+              <w:top w:w="80" w:type="dxa"/>
+              <w:left w:w="100" w:type="dxa"/>
+              <w:bottom w:w="80" w:type="dxa"/>
+              <w:right w:w="100" w:type="dxa"/>
+            </w:tcMar>
+            <w:vAlign w:val="center"/>
+          </w:tcPr>
+          <w:p>
+            <w:r>
+              <w:t>Claude AI</w:t>
+            </w:r>
+          </w:p>
+        </w:tc>
+        <w:tc>
+          <w:tcPr>
+            <w:tcW w:w="1324" w:type="dxa"/>
+            <w:tcMar>
+              <w:top w:w="80" w:type="dxa"/>
+              <w:left w:w="100" w:type="dxa"/>
+              <w:bottom w:w="80" w:type="dxa"/>
+              <w:right w:w="100" w:type="dxa"/>
+            </w:tcMar>
+            <w:vAlign w:val="center"/>
+          </w:tcPr>
+          <w:p>
+            <w:r>
+              <w:t xml:space="preserve">Used to summarise the </w:t>
+            </w:r>
+            <w:proofErr w:type="spellStart"/>
+            <w:r>
+              <w:t>CivicConnect</w:t>
+            </w:r>
+            <w:proofErr w:type="spellEnd"/>
+            <w:r>
+              <w:t xml:space="preserve"> Master brief for Milestone 1.</w:t>
+            </w:r>
+          </w:p>
+        </w:tc>
+        <w:tc>
+          <w:tcPr>
+            <w:tcW w:w="1237" w:type="dxa"/>
+            <w:tcMar>
+              <w:top w:w="80" w:type="dxa"/>
+              <w:left w:w="100" w:type="dxa"/>
+              <w:bottom w:w="80" w:type="dxa"/>
+              <w:right w:w="100" w:type="dxa"/>
+            </w:tcMar>
+            <w:vAlign w:val="center"/>
+          </w:tcPr>
+          <w:p>
+            <w:r>
+              <w:t>Helped me remove sections that were not my assigned work in this document.</w:t>
+            </w:r>
+          </w:p>
+        </w:tc>
+        <w:tc>
+          <w:tcPr>
+            <w:tcW w:w="1144" w:type="dxa"/>
+            <w:tcMar>
+              <w:top w:w="80" w:type="dxa"/>
+              <w:left w:w="100" w:type="dxa"/>
+              <w:bottom w:w="80" w:type="dxa"/>
+              <w:right w:w="100" w:type="dxa"/>
+            </w:tcMar>
+            <w:vAlign w:val="center"/>
+          </w:tcPr>
+          <w:p/>
+        </w:tc>
+        <w:tc>
+          <w:tcPr>
+            <w:tcW w:w="1377" w:type="dxa"/>
+            <w:tcMar>
+              <w:top w:w="80" w:type="dxa"/>
+              <w:left w:w="100" w:type="dxa"/>
+              <w:bottom w:w="80" w:type="dxa"/>
+              <w:right w:w="100" w:type="dxa"/>
+            </w:tcMar>
+            <w:vAlign w:val="center"/>
+          </w:tcPr>
+          <w:p>
+            <w:r>
+              <w:t>Implemented the suggestions once they had been double checked by myself and were relevant to the topic covered.</w:t>
+            </w:r>
+          </w:p>
+        </w:tc>
+        <w:tc>
+          <w:tcPr>
+            <w:tcW w:w="1440" w:type="dxa"/>
+            <w:tcMar>
+              <w:top w:w="80" w:type="dxa"/>
+              <w:left w:w="100" w:type="dxa"/>
+              <w:bottom w:w="80" w:type="dxa"/>
+              <w:right w:w="100" w:type="dxa"/>
+            </w:tcMar>
+            <w:vAlign w:val="center"/>
+          </w:tcPr>
+          <w:p>
+            <w:r>
+              <w:t>Trimmed false information given and corrected sections that were not relevant to the Milestone 1 requirements.</w:t>
+            </w:r>
+          </w:p>
         </w:tc>
       </w:tr>
       <w:tr>
@@ -8260,98 +9918,98 @@
         </w:trPr>
         <w:tc>
           <w:tcPr>
-            <w:tcW w:w="900" w:type="dxa"/>
-            <w:tcMar>
-              <w:top w:w="80" w:type="dxa"/>
-              <w:left w:w="100" w:type="dxa"/>
-              <w:bottom w:w="80" w:type="dxa"/>
-              <w:right w:w="100" w:type="dxa"/>
-            </w:tcMar>
-            <w:vAlign w:val="center"/>
-          </w:tcPr>
-          <w:p/>
-        </w:tc>
-        <w:tc>
-          <w:tcPr>
-            <w:tcW w:w="1000" w:type="dxa"/>
-            <w:tcMar>
-              <w:top w:w="80" w:type="dxa"/>
-              <w:left w:w="100" w:type="dxa"/>
-              <w:bottom w:w="80" w:type="dxa"/>
-              <w:right w:w="100" w:type="dxa"/>
-            </w:tcMar>
-            <w:vAlign w:val="center"/>
-          </w:tcPr>
-          <w:p/>
-        </w:tc>
-        <w:tc>
-          <w:tcPr>
-            <w:tcW w:w="1000" w:type="dxa"/>
-            <w:tcMar>
-              <w:top w:w="80" w:type="dxa"/>
-              <w:left w:w="100" w:type="dxa"/>
-              <w:bottom w:w="80" w:type="dxa"/>
-              <w:right w:w="100" w:type="dxa"/>
-            </w:tcMar>
-            <w:vAlign w:val="center"/>
-          </w:tcPr>
-          <w:p/>
-        </w:tc>
-        <w:tc>
-          <w:tcPr>
-            <w:tcW w:w="1500" w:type="dxa"/>
-            <w:tcMar>
-              <w:top w:w="80" w:type="dxa"/>
-              <w:left w:w="100" w:type="dxa"/>
-              <w:bottom w:w="80" w:type="dxa"/>
-              <w:right w:w="100" w:type="dxa"/>
-            </w:tcMar>
-            <w:vAlign w:val="center"/>
-          </w:tcPr>
-          <w:p/>
-        </w:tc>
-        <w:tc>
-          <w:tcPr>
-            <w:tcW w:w="1600" w:type="dxa"/>
-            <w:tcMar>
-              <w:top w:w="80" w:type="dxa"/>
-              <w:left w:w="100" w:type="dxa"/>
-              <w:bottom w:w="80" w:type="dxa"/>
-              <w:right w:w="100" w:type="dxa"/>
-            </w:tcMar>
-            <w:vAlign w:val="center"/>
-          </w:tcPr>
-          <w:p/>
-        </w:tc>
-        <w:tc>
-          <w:tcPr>
-            <w:tcW w:w="1400" w:type="dxa"/>
-            <w:tcMar>
-              <w:top w:w="80" w:type="dxa"/>
-              <w:left w:w="100" w:type="dxa"/>
-              <w:bottom w:w="80" w:type="dxa"/>
-              <w:right w:w="100" w:type="dxa"/>
-            </w:tcMar>
-            <w:vAlign w:val="center"/>
-          </w:tcPr>
-          <w:p/>
-        </w:tc>
-        <w:tc>
-          <w:tcPr>
-            <w:tcW w:w="1000" w:type="dxa"/>
-            <w:tcMar>
-              <w:top w:w="80" w:type="dxa"/>
-              <w:left w:w="100" w:type="dxa"/>
-              <w:bottom w:w="80" w:type="dxa"/>
-              <w:right w:w="100" w:type="dxa"/>
-            </w:tcMar>
-            <w:vAlign w:val="center"/>
-          </w:tcPr>
-          <w:p/>
-        </w:tc>
-        <w:tc>
-          <w:tcPr>
-            <w:tcW w:w="1200" w:type="dxa"/>
+            <w:tcW w:w="1526" w:type="dxa"/>
+            <w:tcMar>
+              <w:top w:w="80" w:type="dxa"/>
+              <w:left w:w="100" w:type="dxa"/>
+              <w:bottom w:w="80" w:type="dxa"/>
+              <w:right w:w="100" w:type="dxa"/>
+            </w:tcMar>
+            <w:vAlign w:val="center"/>
+          </w:tcPr>
+          <w:p/>
+        </w:tc>
+        <w:tc>
+          <w:tcPr>
+            <w:tcW w:w="1178" w:type="dxa"/>
+            <w:tcMar>
+              <w:top w:w="80" w:type="dxa"/>
+              <w:left w:w="100" w:type="dxa"/>
+              <w:bottom w:w="80" w:type="dxa"/>
+              <w:right w:w="100" w:type="dxa"/>
+            </w:tcMar>
+            <w:vAlign w:val="center"/>
+          </w:tcPr>
+          <w:p/>
+        </w:tc>
+        <w:tc>
+          <w:tcPr>
+            <w:tcW w:w="799" w:type="dxa"/>
+            <w:tcMar>
+              <w:top w:w="80" w:type="dxa"/>
+              <w:left w:w="100" w:type="dxa"/>
+              <w:bottom w:w="80" w:type="dxa"/>
+              <w:right w:w="100" w:type="dxa"/>
+            </w:tcMar>
+            <w:vAlign w:val="center"/>
+          </w:tcPr>
+          <w:p/>
+        </w:tc>
+        <w:tc>
+          <w:tcPr>
+            <w:tcW w:w="1324" w:type="dxa"/>
+            <w:tcMar>
+              <w:top w:w="80" w:type="dxa"/>
+              <w:left w:w="100" w:type="dxa"/>
+              <w:bottom w:w="80" w:type="dxa"/>
+              <w:right w:w="100" w:type="dxa"/>
+            </w:tcMar>
+            <w:vAlign w:val="center"/>
+          </w:tcPr>
+          <w:p/>
+        </w:tc>
+        <w:tc>
+          <w:tcPr>
+            <w:tcW w:w="1237" w:type="dxa"/>
+            <w:tcMar>
+              <w:top w:w="80" w:type="dxa"/>
+              <w:left w:w="100" w:type="dxa"/>
+              <w:bottom w:w="80" w:type="dxa"/>
+              <w:right w:w="100" w:type="dxa"/>
+            </w:tcMar>
+            <w:vAlign w:val="center"/>
+          </w:tcPr>
+          <w:p/>
+        </w:tc>
+        <w:tc>
+          <w:tcPr>
+            <w:tcW w:w="1144" w:type="dxa"/>
+            <w:tcMar>
+              <w:top w:w="80" w:type="dxa"/>
+              <w:left w:w="100" w:type="dxa"/>
+              <w:bottom w:w="80" w:type="dxa"/>
+              <w:right w:w="100" w:type="dxa"/>
+            </w:tcMar>
+            <w:vAlign w:val="center"/>
+          </w:tcPr>
+          <w:p/>
+        </w:tc>
+        <w:tc>
+          <w:tcPr>
+            <w:tcW w:w="1377" w:type="dxa"/>
+            <w:tcMar>
+              <w:top w:w="80" w:type="dxa"/>
+              <w:left w:w="100" w:type="dxa"/>
+              <w:bottom w:w="80" w:type="dxa"/>
+              <w:right w:w="100" w:type="dxa"/>
+            </w:tcMar>
+            <w:vAlign w:val="center"/>
+          </w:tcPr>
+          <w:p/>
+        </w:tc>
+        <w:tc>
+          <w:tcPr>
+            <w:tcW w:w="1440" w:type="dxa"/>
             <w:tcMar>
               <w:top w:w="80" w:type="dxa"/>
               <w:left w:w="100" w:type="dxa"/>
@@ -8646,6 +10304,7 @@
             <w:vAlign w:val="center"/>
           </w:tcPr>
           <w:p>
+            <w:proofErr w:type="spellStart"/>
             <w:r>
               <w:rPr>
                 <w:color w:val="000000"/>
@@ -8654,6 +10313,7 @@
               </w:rPr>
               <w:t>CivicConnect</w:t>
             </w:r>
+            <w:proofErr w:type="spellEnd"/>
           </w:p>
         </w:tc>
       </w:tr>
@@ -9355,6 +11015,7 @@
       </w:tr>
     </w:tbl>
     <w:p/>
+    <w:p/>
     <w:sectPr>
       <w:headerReference w:type="default" r:id="rId7"/>
       <w:footerReference w:type="default" r:id="rId8"/>
@@ -9368,7 +11029,7 @@
 </file>
 
 <file path=word/endnotes.xml><?xml version="1.0" encoding="utf-8"?>
-<w:endnotes xmlns:wpc="http://schemas.microsoft.com/office/word/2010/wordprocessingCanvas" xmlns:cx="http://schemas.microsoft.com/office/drawing/2014/chartex" xmlns:cx1="http://schemas.microsoft.com/office/drawing/2015/9/8/chartex" xmlns:cx2="http://schemas.microsoft.com/office/drawing/2015/10/21/chartex" xmlns:cx3="http://schemas.microsoft.com/office/drawing/2016/5/9/chartex" xmlns:cx4="http://schemas.microsoft.com/office/drawing/2016/5/10/chartex" xmlns:cx5="http://schemas.microsoft.com/office/drawing/2016/5/11/chartex" xmlns:cx6="http://schemas.microsoft.com/office/drawing/2016/5/12/chartex" xmlns:cx7="http://schemas.microsoft.com/office/drawing/2016/5/13/chartex" xmlns:cx8="http://schemas.microsoft.com/office/drawing/2016/5/14/chartex" xmlns:mc="http://schemas.openxmlformats.org/markup-compatibility/2006" xmlns:aink="http://schemas.microsoft.com/office/drawing/2016/ink" xmlns:am3d="http://schemas.microsoft.com/office/drawing/2017/model3d" xmlns:o="urn:schemas-microsoft-com:office:office" xmlns:oel="http://schemas.microsoft.com/office/2019/extlst" xmlns:r="http://schemas.openxmlformats.org/officeDocument/2006/relationships" xmlns:m="http://schemas.openxmlformats.org/officeDocument/2006/math" xmlns:v="urn:schemas-microsoft-com:vml" xmlns:wp14="http://schemas.microsoft.com/office/word/2010/wordprocessingDrawing" xmlns:wp="http://schemas.openxmlformats.org/drawingml/2006/wordprocessingDrawing" xmlns:w10="urn:schemas-microsoft-com:office:word" xmlns:w="http://schemas.openxmlformats.org/wordprocessingml/2006/main" xmlns:w14="http://schemas.microsoft.com/office/word/2010/wordml" xmlns:w15="http://schemas.microsoft.com/office/word/2012/wordml" xmlns:w16cex="http://schemas.microsoft.com/office/word/2018/wordml/cex" xmlns:w16cid="http://schemas.microsoft.com/office/word/2016/wordml/cid" xmlns:w16="http://schemas.microsoft.com/office/word/2018/wordml" xmlns:w16sdtdh="http://schemas.microsoft.com/office/word/2020/wordml/sdtdatahash" xmlns:w16se="http://schemas.microsoft.com/office/word/2015/wordml/symex" xmlns:wpg="http://schemas.microsoft.com/office/word/2010/wordprocessingGroup" xmlns:wpi="http://schemas.microsoft.com/office/word/2010/wordprocessingInk" xmlns:wne="http://schemas.microsoft.com/office/word/2006/wordml" xmlns:wps="http://schemas.microsoft.com/office/word/2010/wordprocessingShape" mc:Ignorable="w14 w15 w16se w16cid w16 w16cex w16sdtdh wp14">
+<w:endnotes xmlns:wpc="http://schemas.microsoft.com/office/word/2010/wordprocessingCanvas" xmlns:cx="http://schemas.microsoft.com/office/drawing/2014/chartex" xmlns:cx1="http://schemas.microsoft.com/office/drawing/2015/9/8/chartex" xmlns:cx2="http://schemas.microsoft.com/office/drawing/2015/10/21/chartex" xmlns:cx3="http://schemas.microsoft.com/office/drawing/2016/5/9/chartex" xmlns:cx4="http://schemas.microsoft.com/office/drawing/2016/5/10/chartex" xmlns:cx5="http://schemas.microsoft.com/office/drawing/2016/5/11/chartex" xmlns:cx6="http://schemas.microsoft.com/office/drawing/2016/5/12/chartex" xmlns:cx7="http://schemas.microsoft.com/office/drawing/2016/5/13/chartex" xmlns:cx8="http://schemas.microsoft.com/office/drawing/2016/5/14/chartex" xmlns:mc="http://schemas.openxmlformats.org/markup-compatibility/2006" xmlns:aink="http://schemas.microsoft.com/office/drawing/2016/ink" xmlns:am3d="http://schemas.microsoft.com/office/drawing/2017/model3d" xmlns:o="urn:schemas-microsoft-com:office:office" xmlns:oel="http://schemas.microsoft.com/office/2019/extlst" xmlns:r="http://schemas.openxmlformats.org/officeDocument/2006/relationships" xmlns:m="http://schemas.openxmlformats.org/officeDocument/2006/math" xmlns:v="urn:schemas-microsoft-com:vml" xmlns:wp14="http://schemas.microsoft.com/office/word/2010/wordprocessingDrawing" xmlns:wp="http://schemas.openxmlformats.org/drawingml/2006/wordprocessingDrawing" xmlns:w10="urn:schemas-microsoft-com:office:word" xmlns:w="http://schemas.openxmlformats.org/wordprocessingml/2006/main" xmlns:w14="http://schemas.microsoft.com/office/word/2010/wordml" xmlns:w15="http://schemas.microsoft.com/office/word/2012/wordml" xmlns:w16cex="http://schemas.microsoft.com/office/word/2018/wordml/cex" xmlns:w16cid="http://schemas.microsoft.com/office/word/2016/wordml/cid" xmlns:w16="http://schemas.microsoft.com/office/word/2018/wordml" xmlns:w16du="http://schemas.microsoft.com/office/word/2023/wordml/word16du" xmlns:w16sdtdh="http://schemas.microsoft.com/office/word/2020/wordml/sdtdatahash" xmlns:w16sdtfl="http://schemas.microsoft.com/office/word/2024/wordml/sdtformatlock" xmlns:w16se="http://schemas.microsoft.com/office/word/2015/wordml/symex" xmlns:wpg="http://schemas.microsoft.com/office/word/2010/wordprocessingGroup" xmlns:wpi="http://schemas.microsoft.com/office/word/2010/wordprocessingInk" xmlns:wne="http://schemas.microsoft.com/office/word/2006/wordml" xmlns:wps="http://schemas.microsoft.com/office/word/2010/wordprocessingShape" mc:Ignorable="w14 w15 w16se w16cid w16 w16cex w16sdtdh w16sdtfl w16du wp14">
   <w:endnote w:type="separator" w:id="-1">
     <w:p>
       <w:r>
@@ -9387,7 +11048,7 @@
 </file>
 
 <file path=word/footer1.xml><?xml version="1.0" encoding="utf-8"?>
-<w:ftr xmlns:wpc="http://schemas.microsoft.com/office/word/2010/wordprocessingCanvas" xmlns:cx="http://schemas.microsoft.com/office/drawing/2014/chartex" xmlns:cx1="http://schemas.microsoft.com/office/drawing/2015/9/8/chartex" xmlns:cx2="http://schemas.microsoft.com/office/drawing/2015/10/21/chartex" xmlns:cx3="http://schemas.microsoft.com/office/drawing/2016/5/9/chartex" xmlns:cx4="http://schemas.microsoft.com/office/drawing/2016/5/10/chartex" xmlns:cx5="http://schemas.microsoft.com/office/drawing/2016/5/11/chartex" xmlns:cx6="http://schemas.microsoft.com/office/drawing/2016/5/12/chartex" xmlns:cx7="http://schemas.microsoft.com/office/drawing/2016/5/13/chartex" xmlns:cx8="http://schemas.microsoft.com/office/drawing/2016/5/14/chartex" xmlns:mc="http://schemas.openxmlformats.org/markup-compatibility/2006" xmlns:aink="http://schemas.microsoft.com/office/drawing/2016/ink" xmlns:am3d="http://schemas.microsoft.com/office/drawing/2017/model3d" xmlns:o="urn:schemas-microsoft-com:office:office" xmlns:oel="http://schemas.microsoft.com/office/2019/extlst" xmlns:r="http://schemas.openxmlformats.org/officeDocument/2006/relationships" xmlns:m="http://schemas.openxmlformats.org/officeDocument/2006/math" xmlns:v="urn:schemas-microsoft-com:vml" xmlns:wp14="http://schemas.microsoft.com/office/word/2010/wordprocessingDrawing" xmlns:wp="http://schemas.openxmlformats.org/drawingml/2006/wordprocessingDrawing" xmlns:w10="urn:schemas-microsoft-com:office:word" xmlns:w="http://schemas.openxmlformats.org/wordprocessingml/2006/main" xmlns:w14="http://schemas.microsoft.com/office/word/2010/wordml" xmlns:w15="http://schemas.microsoft.com/office/word/2012/wordml" xmlns:w16cex="http://schemas.microsoft.com/office/word/2018/wordml/cex" xmlns:w16cid="http://schemas.microsoft.com/office/word/2016/wordml/cid" xmlns:w16="http://schemas.microsoft.com/office/word/2018/wordml" xmlns:w16sdtdh="http://schemas.microsoft.com/office/word/2020/wordml/sdtdatahash" xmlns:w16se="http://schemas.microsoft.com/office/word/2015/wordml/symex" xmlns:wpg="http://schemas.microsoft.com/office/word/2010/wordprocessingGroup" xmlns:wpi="http://schemas.microsoft.com/office/word/2010/wordprocessingInk" xmlns:wne="http://schemas.microsoft.com/office/word/2006/wordml" xmlns:wps="http://schemas.microsoft.com/office/word/2010/wordprocessingShape" mc:Ignorable="w14 w15 w16se w16cid w16 w16cex w16sdtdh wp14">
+<w:ftr xmlns:wpc="http://schemas.microsoft.com/office/word/2010/wordprocessingCanvas" xmlns:cx="http://schemas.microsoft.com/office/drawing/2014/chartex" xmlns:cx1="http://schemas.microsoft.com/office/drawing/2015/9/8/chartex" xmlns:cx2="http://schemas.microsoft.com/office/drawing/2015/10/21/chartex" xmlns:cx3="http://schemas.microsoft.com/office/drawing/2016/5/9/chartex" xmlns:cx4="http://schemas.microsoft.com/office/drawing/2016/5/10/chartex" xmlns:cx5="http://schemas.microsoft.com/office/drawing/2016/5/11/chartex" xmlns:cx6="http://schemas.microsoft.com/office/drawing/2016/5/12/chartex" xmlns:cx7="http://schemas.microsoft.com/office/drawing/2016/5/13/chartex" xmlns:cx8="http://schemas.microsoft.com/office/drawing/2016/5/14/chartex" xmlns:mc="http://schemas.openxmlformats.org/markup-compatibility/2006" xmlns:aink="http://schemas.microsoft.com/office/drawing/2016/ink" xmlns:am3d="http://schemas.microsoft.com/office/drawing/2017/model3d" xmlns:o="urn:schemas-microsoft-com:office:office" xmlns:oel="http://schemas.microsoft.com/office/2019/extlst" xmlns:r="http://schemas.openxmlformats.org/officeDocument/2006/relationships" xmlns:m="http://schemas.openxmlformats.org/officeDocument/2006/math" xmlns:v="urn:schemas-microsoft-com:vml" xmlns:wp14="http://schemas.microsoft.com/office/word/2010/wordprocessingDrawing" xmlns:wp="http://schemas.openxmlformats.org/drawingml/2006/wordprocessingDrawing" xmlns:w10="urn:schemas-microsoft-com:office:word" xmlns:w="http://schemas.openxmlformats.org/wordprocessingml/2006/main" xmlns:w14="http://schemas.microsoft.com/office/word/2010/wordml" xmlns:w15="http://schemas.microsoft.com/office/word/2012/wordml" xmlns:w16cex="http://schemas.microsoft.com/office/word/2018/wordml/cex" xmlns:w16cid="http://schemas.microsoft.com/office/word/2016/wordml/cid" xmlns:w16="http://schemas.microsoft.com/office/word/2018/wordml" xmlns:w16du="http://schemas.microsoft.com/office/word/2023/wordml/word16du" xmlns:w16sdtdh="http://schemas.microsoft.com/office/word/2020/wordml/sdtdatahash" xmlns:w16sdtfl="http://schemas.microsoft.com/office/word/2024/wordml/sdtformatlock" xmlns:w16se="http://schemas.microsoft.com/office/word/2015/wordml/symex" xmlns:wpg="http://schemas.microsoft.com/office/word/2010/wordprocessingGroup" xmlns:wpi="http://schemas.microsoft.com/office/word/2010/wordprocessingInk" xmlns:wne="http://schemas.microsoft.com/office/word/2006/wordml" xmlns:wps="http://schemas.microsoft.com/office/word/2010/wordprocessingShape" mc:Ignorable="w14 w15 w16se w16cid w16 w16cex w16sdtdh w16sdtfl w16du wp14">
   <w:p>
     <w:pPr>
       <w:jc w:val="center"/>
@@ -9495,7 +11156,7 @@
 </file>
 
 <file path=word/footnotes.xml><?xml version="1.0" encoding="utf-8"?>
-<w:footnotes xmlns:wpc="http://schemas.microsoft.com/office/word/2010/wordprocessingCanvas" xmlns:cx="http://schemas.microsoft.com/office/drawing/2014/chartex" xmlns:cx1="http://schemas.microsoft.com/office/drawing/2015/9/8/chartex" xmlns:cx2="http://schemas.microsoft.com/office/drawing/2015/10/21/chartex" xmlns:cx3="http://schemas.microsoft.com/office/drawing/2016/5/9/chartex" xmlns:cx4="http://schemas.microsoft.com/office/drawing/2016/5/10/chartex" xmlns:cx5="http://schemas.microsoft.com/office/drawing/2016/5/11/chartex" xmlns:cx6="http://schemas.microsoft.com/office/drawing/2016/5/12/chartex" xmlns:cx7="http://schemas.microsoft.com/office/drawing/2016/5/13/chartex" xmlns:cx8="http://schemas.microsoft.com/office/drawing/2016/5/14/chartex" xmlns:mc="http://schemas.openxmlformats.org/markup-compatibility/2006" xmlns:aink="http://schemas.microsoft.com/office/drawing/2016/ink" xmlns:am3d="http://schemas.microsoft.com/office/drawing/2017/model3d" xmlns:o="urn:schemas-microsoft-com:office:office" xmlns:oel="http://schemas.microsoft.com/office/2019/extlst" xmlns:r="http://schemas.openxmlformats.org/officeDocument/2006/relationships" xmlns:m="http://schemas.openxmlformats.org/officeDocument/2006/math" xmlns:v="urn:schemas-microsoft-com:vml" xmlns:wp14="http://schemas.microsoft.com/office/word/2010/wordprocessingDrawing" xmlns:wp="http://schemas.openxmlformats.org/drawingml/2006/wordprocessingDrawing" xmlns:w10="urn:schemas-microsoft-com:office:word" xmlns:w="http://schemas.openxmlformats.org/wordprocessingml/2006/main" xmlns:w14="http://schemas.microsoft.com/office/word/2010/wordml" xmlns:w15="http://schemas.microsoft.com/office/word/2012/wordml" xmlns:w16cex="http://schemas.microsoft.com/office/word/2018/wordml/cex" xmlns:w16cid="http://schemas.microsoft.com/office/word/2016/wordml/cid" xmlns:w16="http://schemas.microsoft.com/office/word/2018/wordml" xmlns:w16sdtdh="http://schemas.microsoft.com/office/word/2020/wordml/sdtdatahash" xmlns:w16se="http://schemas.microsoft.com/office/word/2015/wordml/symex" xmlns:wpg="http://schemas.microsoft.com/office/word/2010/wordprocessingGroup" xmlns:wpi="http://schemas.microsoft.com/office/word/2010/wordprocessingInk" xmlns:wne="http://schemas.microsoft.com/office/word/2006/wordml" xmlns:wps="http://schemas.microsoft.com/office/word/2010/wordprocessingShape" mc:Ignorable="w14 w15 w16se w16cid w16 w16cex w16sdtdh wp14">
+<w:footnotes xmlns:wpc="http://schemas.microsoft.com/office/word/2010/wordprocessingCanvas" xmlns:cx="http://schemas.microsoft.com/office/drawing/2014/chartex" xmlns:cx1="http://schemas.microsoft.com/office/drawing/2015/9/8/chartex" xmlns:cx2="http://schemas.microsoft.com/office/drawing/2015/10/21/chartex" xmlns:cx3="http://schemas.microsoft.com/office/drawing/2016/5/9/chartex" xmlns:cx4="http://schemas.microsoft.com/office/drawing/2016/5/10/chartex" xmlns:cx5="http://schemas.microsoft.com/office/drawing/2016/5/11/chartex" xmlns:cx6="http://schemas.microsoft.com/office/drawing/2016/5/12/chartex" xmlns:cx7="http://schemas.microsoft.com/office/drawing/2016/5/13/chartex" xmlns:cx8="http://schemas.microsoft.com/office/drawing/2016/5/14/chartex" xmlns:mc="http://schemas.openxmlformats.org/markup-compatibility/2006" xmlns:aink="http://schemas.microsoft.com/office/drawing/2016/ink" xmlns:am3d="http://schemas.microsoft.com/office/drawing/2017/model3d" xmlns:o="urn:schemas-microsoft-com:office:office" xmlns:oel="http://schemas.microsoft.com/office/2019/extlst" xmlns:r="http://schemas.openxmlformats.org/officeDocument/2006/relationships" xmlns:m="http://schemas.openxmlformats.org/officeDocument/2006/math" xmlns:v="urn:schemas-microsoft-com:vml" xmlns:wp14="http://schemas.microsoft.com/office/word/2010/wordprocessingDrawing" xmlns:wp="http://schemas.openxmlformats.org/drawingml/2006/wordprocessingDrawing" xmlns:w10="urn:schemas-microsoft-com:office:word" xmlns:w="http://schemas.openxmlformats.org/wordprocessingml/2006/main" xmlns:w14="http://schemas.microsoft.com/office/word/2010/wordml" xmlns:w15="http://schemas.microsoft.com/office/word/2012/wordml" xmlns:w16cex="http://schemas.microsoft.com/office/word/2018/wordml/cex" xmlns:w16cid="http://schemas.microsoft.com/office/word/2016/wordml/cid" xmlns:w16="http://schemas.microsoft.com/office/word/2018/wordml" xmlns:w16du="http://schemas.microsoft.com/office/word/2023/wordml/word16du" xmlns:w16sdtdh="http://schemas.microsoft.com/office/word/2020/wordml/sdtdatahash" xmlns:w16sdtfl="http://schemas.microsoft.com/office/word/2024/wordml/sdtformatlock" xmlns:w16se="http://schemas.microsoft.com/office/word/2015/wordml/symex" xmlns:wpg="http://schemas.microsoft.com/office/word/2010/wordprocessingGroup" xmlns:wpi="http://schemas.microsoft.com/office/word/2010/wordprocessingInk" xmlns:wne="http://schemas.microsoft.com/office/word/2006/wordml" xmlns:wps="http://schemas.microsoft.com/office/word/2010/wordprocessingShape" mc:Ignorable="w14 w15 w16se w16cid w16 w16cex w16sdtdh w16sdtfl w16du wp14">
   <w:footnote w:type="separator" w:id="-1">
     <w:p>
       <w:r>
@@ -9514,7 +11175,7 @@
 </file>
 
 <file path=word/header1.xml><?xml version="1.0" encoding="utf-8"?>
-<w:hdr xmlns:wpc="http://schemas.microsoft.com/office/word/2010/wordprocessingCanvas" xmlns:cx="http://schemas.microsoft.com/office/drawing/2014/chartex" xmlns:cx1="http://schemas.microsoft.com/office/drawing/2015/9/8/chartex" xmlns:cx2="http://schemas.microsoft.com/office/drawing/2015/10/21/chartex" xmlns:cx3="http://schemas.microsoft.com/office/drawing/2016/5/9/chartex" xmlns:cx4="http://schemas.microsoft.com/office/drawing/2016/5/10/chartex" xmlns:cx5="http://schemas.microsoft.com/office/drawing/2016/5/11/chartex" xmlns:cx6="http://schemas.microsoft.com/office/drawing/2016/5/12/chartex" xmlns:cx7="http://schemas.microsoft.com/office/drawing/2016/5/13/chartex" xmlns:cx8="http://schemas.microsoft.com/office/drawing/2016/5/14/chartex" xmlns:mc="http://schemas.openxmlformats.org/markup-compatibility/2006" xmlns:aink="http://schemas.microsoft.com/office/drawing/2016/ink" xmlns:am3d="http://schemas.microsoft.com/office/drawing/2017/model3d" xmlns:o="urn:schemas-microsoft-com:office:office" xmlns:oel="http://schemas.microsoft.com/office/2019/extlst" xmlns:r="http://schemas.openxmlformats.org/officeDocument/2006/relationships" xmlns:m="http://schemas.openxmlformats.org/officeDocument/2006/math" xmlns:v="urn:schemas-microsoft-com:vml" xmlns:wp14="http://schemas.microsoft.com/office/word/2010/wordprocessingDrawing" xmlns:wp="http://schemas.openxmlformats.org/drawingml/2006/wordprocessingDrawing" xmlns:w10="urn:schemas-microsoft-com:office:word" xmlns:w="http://schemas.openxmlformats.org/wordprocessingml/2006/main" xmlns:w14="http://schemas.microsoft.com/office/word/2010/wordml" xmlns:w15="http://schemas.microsoft.com/office/word/2012/wordml" xmlns:w16cex="http://schemas.microsoft.com/office/word/2018/wordml/cex" xmlns:w16cid="http://schemas.microsoft.com/office/word/2016/wordml/cid" xmlns:w16="http://schemas.microsoft.com/office/word/2018/wordml" xmlns:w16sdtdh="http://schemas.microsoft.com/office/word/2020/wordml/sdtdatahash" xmlns:w16se="http://schemas.microsoft.com/office/word/2015/wordml/symex" xmlns:wpg="http://schemas.microsoft.com/office/word/2010/wordprocessingGroup" xmlns:wpi="http://schemas.microsoft.com/office/word/2010/wordprocessingInk" xmlns:wne="http://schemas.microsoft.com/office/word/2006/wordml" xmlns:wps="http://schemas.microsoft.com/office/word/2010/wordprocessingShape" mc:Ignorable="w14 w15 w16se w16cid w16 w16cex w16sdtdh wp14">
+<w:hdr xmlns:wpc="http://schemas.microsoft.com/office/word/2010/wordprocessingCanvas" xmlns:cx="http://schemas.microsoft.com/office/drawing/2014/chartex" xmlns:cx1="http://schemas.microsoft.com/office/drawing/2015/9/8/chartex" xmlns:cx2="http://schemas.microsoft.com/office/drawing/2015/10/21/chartex" xmlns:cx3="http://schemas.microsoft.com/office/drawing/2016/5/9/chartex" xmlns:cx4="http://schemas.microsoft.com/office/drawing/2016/5/10/chartex" xmlns:cx5="http://schemas.microsoft.com/office/drawing/2016/5/11/chartex" xmlns:cx6="http://schemas.microsoft.com/office/drawing/2016/5/12/chartex" xmlns:cx7="http://schemas.microsoft.com/office/drawing/2016/5/13/chartex" xmlns:cx8="http://schemas.microsoft.com/office/drawing/2016/5/14/chartex" xmlns:mc="http://schemas.openxmlformats.org/markup-compatibility/2006" xmlns:aink="http://schemas.microsoft.com/office/drawing/2016/ink" xmlns:am3d="http://schemas.microsoft.com/office/drawing/2017/model3d" xmlns:o="urn:schemas-microsoft-com:office:office" xmlns:oel="http://schemas.microsoft.com/office/2019/extlst" xmlns:r="http://schemas.openxmlformats.org/officeDocument/2006/relationships" xmlns:m="http://schemas.openxmlformats.org/officeDocument/2006/math" xmlns:v="urn:schemas-microsoft-com:vml" xmlns:wp14="http://schemas.microsoft.com/office/word/2010/wordprocessingDrawing" xmlns:wp="http://schemas.openxmlformats.org/drawingml/2006/wordprocessingDrawing" xmlns:w10="urn:schemas-microsoft-com:office:word" xmlns:w="http://schemas.openxmlformats.org/wordprocessingml/2006/main" xmlns:w14="http://schemas.microsoft.com/office/word/2010/wordml" xmlns:w15="http://schemas.microsoft.com/office/word/2012/wordml" xmlns:w16cex="http://schemas.microsoft.com/office/word/2018/wordml/cex" xmlns:w16cid="http://schemas.microsoft.com/office/word/2016/wordml/cid" xmlns:w16="http://schemas.microsoft.com/office/word/2018/wordml" xmlns:w16du="http://schemas.microsoft.com/office/word/2023/wordml/word16du" xmlns:w16sdtdh="http://schemas.microsoft.com/office/word/2020/wordml/sdtdatahash" xmlns:w16sdtfl="http://schemas.microsoft.com/office/word/2024/wordml/sdtformatlock" xmlns:w16se="http://schemas.microsoft.com/office/word/2015/wordml/symex" xmlns:wpg="http://schemas.microsoft.com/office/word/2010/wordprocessingGroup" xmlns:wpi="http://schemas.microsoft.com/office/word/2010/wordprocessingInk" xmlns:wne="http://schemas.microsoft.com/office/word/2006/wordml" xmlns:wps="http://schemas.microsoft.com/office/word/2010/wordprocessingShape" mc:Ignorable="w14 w15 w16se w16cid w16 w16cex w16sdtdh w16sdtfl w16du wp14">
   <w:p>
     <w:pPr>
       <w:jc w:val="right"/>
@@ -9524,7 +11185,7 @@
 </file>
 
 <file path=word/numbering.xml><?xml version="1.0" encoding="utf-8"?>
-<w:numbering xmlns:wpc="http://schemas.microsoft.com/office/word/2010/wordprocessingCanvas" xmlns:cx="http://schemas.microsoft.com/office/drawing/2014/chartex" xmlns:cx1="http://schemas.microsoft.com/office/drawing/2015/9/8/chartex" xmlns:cx2="http://schemas.microsoft.com/office/drawing/2015/10/21/chartex" xmlns:cx3="http://schemas.microsoft.com/office/drawing/2016/5/9/chartex" xmlns:cx4="http://schemas.microsoft.com/office/drawing/2016/5/10/chartex" xmlns:cx5="http://schemas.microsoft.com/office/drawing/2016/5/11/chartex" xmlns:cx6="http://schemas.microsoft.com/office/drawing/2016/5/12/chartex" xmlns:cx7="http://schemas.microsoft.com/office/drawing/2016/5/13/chartex" xmlns:cx8="http://schemas.microsoft.com/office/drawing/2016/5/14/chartex" xmlns:mc="http://schemas.openxmlformats.org/markup-compatibility/2006" xmlns:aink="http://schemas.microsoft.com/office/drawing/2016/ink" xmlns:am3d="http://schemas.microsoft.com/office/drawing/2017/model3d" xmlns:o="urn:schemas-microsoft-com:office:office" xmlns:oel="http://schemas.microsoft.com/office/2019/extlst" xmlns:r="http://schemas.openxmlformats.org/officeDocument/2006/relationships" xmlns:m="http://schemas.openxmlformats.org/officeDocument/2006/math" xmlns:v="urn:schemas-microsoft-com:vml" xmlns:wp14="http://schemas.microsoft.com/office/word/2010/wordprocessingDrawing" xmlns:wp="http://schemas.openxmlformats.org/drawingml/2006/wordprocessingDrawing" xmlns:w10="urn:schemas-microsoft-com:office:word" xmlns:w="http://schemas.openxmlformats.org/wordprocessingml/2006/main" xmlns:w14="http://schemas.microsoft.com/office/word/2010/wordml" xmlns:w15="http://schemas.microsoft.com/office/word/2012/wordml" xmlns:w16cex="http://schemas.microsoft.com/office/word/2018/wordml/cex" xmlns:w16cid="http://schemas.microsoft.com/office/word/2016/wordml/cid" xmlns:w16="http://schemas.microsoft.com/office/word/2018/wordml" xmlns:w16sdtdh="http://schemas.microsoft.com/office/word/2020/wordml/sdtdatahash" xmlns:w16se="http://schemas.microsoft.com/office/word/2015/wordml/symex" xmlns:wpg="http://schemas.microsoft.com/office/word/2010/wordprocessingGroup" xmlns:wpi="http://schemas.microsoft.com/office/word/2010/wordprocessingInk" xmlns:wne="http://schemas.microsoft.com/office/word/2006/wordml" xmlns:wps="http://schemas.microsoft.com/office/word/2010/wordprocessingShape" mc:Ignorable="w14 w15 w16se w16cid w16 w16cex w16sdtdh wp14">
+<w:numbering xmlns:wpc="http://schemas.microsoft.com/office/word/2010/wordprocessingCanvas" xmlns:cx="http://schemas.microsoft.com/office/drawing/2014/chartex" xmlns:cx1="http://schemas.microsoft.com/office/drawing/2015/9/8/chartex" xmlns:cx2="http://schemas.microsoft.com/office/drawing/2015/10/21/chartex" xmlns:cx3="http://schemas.microsoft.com/office/drawing/2016/5/9/chartex" xmlns:cx4="http://schemas.microsoft.com/office/drawing/2016/5/10/chartex" xmlns:cx5="http://schemas.microsoft.com/office/drawing/2016/5/11/chartex" xmlns:cx6="http://schemas.microsoft.com/office/drawing/2016/5/12/chartex" xmlns:cx7="http://schemas.microsoft.com/office/drawing/2016/5/13/chartex" xmlns:cx8="http://schemas.microsoft.com/office/drawing/2016/5/14/chartex" xmlns:mc="http://schemas.openxmlformats.org/markup-compatibility/2006" xmlns:aink="http://schemas.microsoft.com/office/drawing/2016/ink" xmlns:am3d="http://schemas.microsoft.com/office/drawing/2017/model3d" xmlns:o="urn:schemas-microsoft-com:office:office" xmlns:oel="http://schemas.microsoft.com/office/2019/extlst" xmlns:r="http://schemas.openxmlformats.org/officeDocument/2006/relationships" xmlns:m="http://schemas.openxmlformats.org/officeDocument/2006/math" xmlns:v="urn:schemas-microsoft-com:vml" xmlns:wp14="http://schemas.microsoft.com/office/word/2010/wordprocessingDrawing" xmlns:wp="http://schemas.openxmlformats.org/drawingml/2006/wordprocessingDrawing" xmlns:w10="urn:schemas-microsoft-com:office:word" xmlns:w="http://schemas.openxmlformats.org/wordprocessingml/2006/main" xmlns:w14="http://schemas.microsoft.com/office/word/2010/wordml" xmlns:w15="http://schemas.microsoft.com/office/word/2012/wordml" xmlns:w16cex="http://schemas.microsoft.com/office/word/2018/wordml/cex" xmlns:w16cid="http://schemas.microsoft.com/office/word/2016/wordml/cid" xmlns:w16="http://schemas.microsoft.com/office/word/2018/wordml" xmlns:w16du="http://schemas.microsoft.com/office/word/2023/wordml/word16du" xmlns:w16sdtdh="http://schemas.microsoft.com/office/word/2020/wordml/sdtdatahash" xmlns:w16sdtfl="http://schemas.microsoft.com/office/word/2024/wordml/sdtformatlock" xmlns:w16se="http://schemas.microsoft.com/office/word/2015/wordml/symex" xmlns:wpg="http://schemas.microsoft.com/office/word/2010/wordprocessingGroup" xmlns:wpi="http://schemas.microsoft.com/office/word/2010/wordprocessingInk" xmlns:wne="http://schemas.microsoft.com/office/word/2006/wordml" xmlns:wps="http://schemas.microsoft.com/office/word/2010/wordprocessingShape" mc:Ignorable="w14 w15 w16se w16cid w16 w16cex w16sdtdh w16sdtfl w16du wp14">
   <w:abstractNum w:abstractNumId="0" w15:restartNumberingAfterBreak="0">
     <w:nsid w:val="03476E1E"/>
     <w:multiLevelType w:val="hybridMultilevel"/>
@@ -9985,15 +11646,6 @@
   </w:num>
   <w:num w:numId="3" w16cid:durableId="2023243291">
     <w:abstractNumId w:val="2"/>
-    <w:lvlOverride w:ilvl="0"/>
-    <w:lvlOverride w:ilvl="1"/>
-    <w:lvlOverride w:ilvl="2"/>
-    <w:lvlOverride w:ilvl="3"/>
-    <w:lvlOverride w:ilvl="4"/>
-    <w:lvlOverride w:ilvl="5"/>
-    <w:lvlOverride w:ilvl="6"/>
-    <w:lvlOverride w:ilvl="7"/>
-    <w:lvlOverride w:ilvl="8"/>
   </w:num>
   <w:num w:numId="4" w16cid:durableId="398409368">
     <w:abstractNumId w:val="4"/>
@@ -10002,7 +11654,7 @@
 </file>
 
 <file path=word/styles.xml><?xml version="1.0" encoding="utf-8"?>
-<w:styles xmlns:mc="http://schemas.openxmlformats.org/markup-compatibility/2006" xmlns:r="http://schemas.openxmlformats.org/officeDocument/2006/relationships" xmlns:w="http://schemas.openxmlformats.org/wordprocessingml/2006/main" xmlns:w14="http://schemas.microsoft.com/office/word/2010/wordml" xmlns:w15="http://schemas.microsoft.com/office/word/2012/wordml" xmlns:w16cex="http://schemas.microsoft.com/office/word/2018/wordml/cex" xmlns:w16cid="http://schemas.microsoft.com/office/word/2016/wordml/cid" xmlns:w16="http://schemas.microsoft.com/office/word/2018/wordml" xmlns:w16sdtdh="http://schemas.microsoft.com/office/word/2020/wordml/sdtdatahash" xmlns:w16se="http://schemas.microsoft.com/office/word/2015/wordml/symex" mc:Ignorable="w14 w15 w16se w16cid w16 w16cex w16sdtdh">
+<w:styles xmlns:mc="http://schemas.openxmlformats.org/markup-compatibility/2006" xmlns:r="http://schemas.openxmlformats.org/officeDocument/2006/relationships" xmlns:w="http://schemas.openxmlformats.org/wordprocessingml/2006/main" xmlns:w14="http://schemas.microsoft.com/office/word/2010/wordml" xmlns:w15="http://schemas.microsoft.com/office/word/2012/wordml" xmlns:w16cex="http://schemas.microsoft.com/office/word/2018/wordml/cex" xmlns:w16cid="http://schemas.microsoft.com/office/word/2016/wordml/cid" xmlns:w16="http://schemas.microsoft.com/office/word/2018/wordml" xmlns:w16du="http://schemas.microsoft.com/office/word/2023/wordml/word16du" xmlns:w16sdtdh="http://schemas.microsoft.com/office/word/2020/wordml/sdtdatahash" xmlns:w16sdtfl="http://schemas.microsoft.com/office/word/2024/wordml/sdtformatlock" xmlns:w16se="http://schemas.microsoft.com/office/word/2015/wordml/symex" mc:Ignorable="w14 w15 w16se w16cid w16 w16cex w16sdtdh w16sdtfl w16du">
   <w:docDefaults>
     <w:rPrDefault>
       <w:rPr>
@@ -10491,6 +12143,7 @@
   <w:style w:type="character" w:default="1" w:styleId="DefaultParagraphFont">
     <w:name w:val="Default Paragraph Font"/>
     <w:uiPriority w:val="1"/>
+    <w:semiHidden/>
     <w:unhideWhenUsed/>
   </w:style>
   <w:style w:type="table" w:default="1" w:styleId="TableNormal">

</xml_diff>